<commit_message>
Actualización CU04 y RN
</commit_message>
<xml_diff>
--- a/Casos de Uso/CU_Reglas_de_Negocio_Sistema_Quejas_v1.5.docx
+++ b/Casos de Uso/CU_Reglas_de_Negocio_Sistema_Quejas_v1.5.docx
@@ -1,10 +1,10 @@
 
 <file path=word/document.xml><?xml version="1.0" encoding="utf-8"?>
-<w:document xmlns:wpc="http://schemas.microsoft.com/office/word/2010/wordprocessingCanvas" xmlns:cx="http://schemas.microsoft.com/office/drawing/2014/chartex" xmlns:cx1="http://schemas.microsoft.com/office/drawing/2015/9/8/chartex" xmlns:cx2="http://schemas.microsoft.com/office/drawing/2015/10/21/chartex" xmlns:cx3="http://schemas.microsoft.com/office/drawing/2016/5/9/chartex" xmlns:cx4="http://schemas.microsoft.com/office/drawing/2016/5/10/chartex" xmlns:cx5="http://schemas.microsoft.com/office/drawing/2016/5/11/chartex" xmlns:cx6="http://schemas.microsoft.com/office/drawing/2016/5/12/chartex" xmlns:cx7="http://schemas.microsoft.com/office/drawing/2016/5/13/chartex" xmlns:cx8="http://schemas.microsoft.com/office/drawing/2016/5/14/chartex" xmlns:mc="http://schemas.openxmlformats.org/markup-compatibility/2006" xmlns:aink="http://schemas.microsoft.com/office/drawing/2016/ink" xmlns:am3d="http://schemas.microsoft.com/office/drawing/2017/model3d" xmlns:o="urn:schemas-microsoft-com:office:office" xmlns:r="http://schemas.openxmlformats.org/officeDocument/2006/relationships" xmlns:m="http://schemas.openxmlformats.org/officeDocument/2006/math" xmlns:v="urn:schemas-microsoft-com:vml" xmlns:wp14="http://schemas.microsoft.com/office/word/2010/wordprocessingDrawing" xmlns:wp="http://schemas.openxmlformats.org/drawingml/2006/wordprocessingDrawing" xmlns:w10="urn:schemas-microsoft-com:office:word" xmlns:w="http://schemas.openxmlformats.org/wordprocessingml/2006/main" xmlns:w14="http://schemas.microsoft.com/office/word/2010/wordml" xmlns:w15="http://schemas.microsoft.com/office/word/2012/wordml" xmlns:w16cex="http://schemas.microsoft.com/office/word/2018/wordml/cex" xmlns:w16cid="http://schemas.microsoft.com/office/word/2016/wordml/cid" xmlns:w16="http://schemas.microsoft.com/office/word/2018/wordml" xmlns:w16sdtdh="http://schemas.microsoft.com/office/word/2020/wordml/sdtdatahash" xmlns:w16se="http://schemas.microsoft.com/office/word/2015/wordml/symex" xmlns:wpg="http://schemas.microsoft.com/office/word/2010/wordprocessingGroup" xmlns:wpi="http://schemas.microsoft.com/office/word/2010/wordprocessingInk" xmlns:wne="http://schemas.microsoft.com/office/word/2006/wordml" xmlns:wps="http://schemas.microsoft.com/office/word/2010/wordprocessingShape" mc:Ignorable="w14 w15 w16se w16cid w16 w16cex w16sdtdh wp14">
+<w:document xmlns:wpc="http://schemas.microsoft.com/office/word/2010/wordprocessingCanvas" xmlns:cx="http://schemas.microsoft.com/office/drawing/2014/chartex" xmlns:cx1="http://schemas.microsoft.com/office/drawing/2015/9/8/chartex" xmlns:cx2="http://schemas.microsoft.com/office/drawing/2015/10/21/chartex" xmlns:cx3="http://schemas.microsoft.com/office/drawing/2016/5/9/chartex" xmlns:cx4="http://schemas.microsoft.com/office/drawing/2016/5/10/chartex" xmlns:cx5="http://schemas.microsoft.com/office/drawing/2016/5/11/chartex" xmlns:cx6="http://schemas.microsoft.com/office/drawing/2016/5/12/chartex" xmlns:cx7="http://schemas.microsoft.com/office/drawing/2016/5/13/chartex" xmlns:cx8="http://schemas.microsoft.com/office/drawing/2016/5/14/chartex" xmlns:mc="http://schemas.openxmlformats.org/markup-compatibility/2006" xmlns:aink="http://schemas.microsoft.com/office/drawing/2016/ink" xmlns:am3d="http://schemas.microsoft.com/office/drawing/2017/model3d" xmlns:o="urn:schemas-microsoft-com:office:office" xmlns:oel="http://schemas.microsoft.com/office/2019/extlst" xmlns:r="http://schemas.openxmlformats.org/officeDocument/2006/relationships" xmlns:m="http://schemas.openxmlformats.org/officeDocument/2006/math" xmlns:v="urn:schemas-microsoft-com:vml" xmlns:wp14="http://schemas.microsoft.com/office/word/2010/wordprocessingDrawing" xmlns:wp="http://schemas.openxmlformats.org/drawingml/2006/wordprocessingDrawing" xmlns:w10="urn:schemas-microsoft-com:office:word" xmlns:w="http://schemas.openxmlformats.org/wordprocessingml/2006/main" xmlns:w14="http://schemas.microsoft.com/office/word/2010/wordml" xmlns:w15="http://schemas.microsoft.com/office/word/2012/wordml" xmlns:w16cex="http://schemas.microsoft.com/office/word/2018/wordml/cex" xmlns:w16cid="http://schemas.microsoft.com/office/word/2016/wordml/cid" xmlns:w16="http://schemas.microsoft.com/office/word/2018/wordml" xmlns:w16du="http://schemas.microsoft.com/office/word/2023/wordml/word16du" xmlns:w16sdtdh="http://schemas.microsoft.com/office/word/2020/wordml/sdtdatahash" xmlns:w16sdtfl="http://schemas.microsoft.com/office/word/2024/wordml/sdtformatlock" xmlns:w16se="http://schemas.microsoft.com/office/word/2015/wordml/symex" xmlns:wpg="http://schemas.microsoft.com/office/word/2010/wordprocessingGroup" xmlns:wpi="http://schemas.microsoft.com/office/word/2010/wordprocessingInk" xmlns:wne="http://schemas.microsoft.com/office/word/2006/wordml" xmlns:wps="http://schemas.microsoft.com/office/word/2010/wordprocessingShape" mc:Ignorable="w14 w15 w16se w16cid w16 w16cex w16sdtdh w16sdtfl w16du wp14">
   <w:body>
     <w:p>
       <w:pPr>
-        <w:pStyle w:val="Title"/>
+        <w:pStyle w:val="Ttulo"/>
         <w:spacing w:before="0" w:after="0"/>
         <w:rPr>
           <w:lang w:val="es-ES"/>
@@ -19,7 +19,7 @@
     </w:p>
     <w:p>
       <w:pPr>
-        <w:pStyle w:val="Title"/>
+        <w:pStyle w:val="Ttulo"/>
         <w:spacing w:before="0" w:after="0"/>
         <w:rPr>
           <w:lang w:val="es-ES"/>
@@ -1988,7 +1988,6 @@
                 <w:szCs w:val="20"/>
               </w:rPr>
             </w:pPr>
-            <w:proofErr w:type="spellStart"/>
             <w:r>
               <w:rPr>
                 <w:sz w:val="20"/>
@@ -1996,7 +1995,6 @@
               </w:rPr>
               <w:t>Tecnico</w:t>
             </w:r>
-            <w:proofErr w:type="spellEnd"/>
           </w:p>
         </w:tc>
         <w:tc>
@@ -2241,7 +2239,6 @@
                 <w:szCs w:val="20"/>
               </w:rPr>
             </w:pPr>
-            <w:proofErr w:type="spellStart"/>
             <w:r>
               <w:rPr>
                 <w:sz w:val="20"/>
@@ -2249,7 +2246,6 @@
               </w:rPr>
               <w:t>Admin</w:t>
             </w:r>
-            <w:proofErr w:type="spellEnd"/>
           </w:p>
         </w:tc>
         <w:tc>
@@ -3253,6 +3249,36 @@
               <w:t>Pasa a En Revisión</w:t>
             </w:r>
           </w:p>
+          <w:p>
+            <w:pPr>
+              <w:rPr>
+                <w:sz w:val="20"/>
+                <w:szCs w:val="20"/>
+              </w:rPr>
+            </w:pPr>
+            <w:r>
+              <w:rPr>
+                <w:sz w:val="20"/>
+                <w:szCs w:val="20"/>
+              </w:rPr>
+              <w:t>Pasa a Pendiente de Aprobación de Rechazo</w:t>
+            </w:r>
+          </w:p>
+          <w:p>
+            <w:pPr>
+              <w:rPr>
+                <w:sz w:val="20"/>
+                <w:szCs w:val="20"/>
+              </w:rPr>
+            </w:pPr>
+            <w:r>
+              <w:rPr>
+                <w:sz w:val="20"/>
+                <w:szCs w:val="20"/>
+              </w:rPr>
+              <w:t>Ampliación</w:t>
+            </w:r>
+          </w:p>
         </w:tc>
       </w:tr>
       <w:tr>
@@ -3321,6 +3347,27 @@
                 <w:szCs w:val="20"/>
               </w:rPr>
             </w:pPr>
+            <w:r>
+              <w:rPr>
+                <w:sz w:val="20"/>
+                <w:szCs w:val="20"/>
+              </w:rPr>
+              <w:t>Pasa</w:t>
+            </w:r>
+            <w:r>
+              <w:rPr>
+                <w:sz w:val="20"/>
+                <w:szCs w:val="20"/>
+              </w:rPr>
+              <w:t xml:space="preserve"> </w:t>
+            </w:r>
+            <w:r>
+              <w:rPr>
+                <w:sz w:val="20"/>
+                <w:szCs w:val="20"/>
+              </w:rPr>
+              <w:t>a En Atención</w:t>
+            </w:r>
           </w:p>
         </w:tc>
       </w:tr>
@@ -3555,7 +3602,15 @@
                 <w:sz w:val="20"/>
                 <w:szCs w:val="20"/>
               </w:rPr>
-              <w:t>Pendiente de Firma</w:t>
+              <w:t xml:space="preserve">Pendiente de </w:t>
+            </w:r>
+            <w:r>
+              <w:rPr>
+                <w:sz w:val="20"/>
+                <w:szCs w:val="20"/>
+              </w:rPr>
+              <w:lastRenderedPageBreak/>
+              <w:t>Firma</w:t>
             </w:r>
           </w:p>
         </w:tc>
@@ -3582,31 +3637,16 @@
                 <w:sz w:val="20"/>
                 <w:szCs w:val="20"/>
               </w:rPr>
-              <w:t xml:space="preserve">Se coloca cuando el Supervisor aprueba el reporte de atención y el caso queda a la espera de la firma </w:t>
-            </w:r>
-            <w:r>
-              <w:rPr>
-                <w:sz w:val="20"/>
-                <w:szCs w:val="20"/>
-              </w:rPr>
               <w:lastRenderedPageBreak/>
-              <w:t xml:space="preserve">del </w:t>
-            </w:r>
-            <w:proofErr w:type="gramStart"/>
-            <w:r>
-              <w:rPr>
-                <w:sz w:val="20"/>
-                <w:szCs w:val="20"/>
-              </w:rPr>
-              <w:t>Jefe</w:t>
-            </w:r>
-            <w:proofErr w:type="gramEnd"/>
-            <w:r>
-              <w:rPr>
-                <w:sz w:val="20"/>
-                <w:szCs w:val="20"/>
-              </w:rPr>
-              <w:t xml:space="preserve"> de Departamento.</w:t>
+              <w:t xml:space="preserve">Se coloca cuando el Supervisor aprueba el reporte </w:t>
+            </w:r>
+            <w:r>
+              <w:rPr>
+                <w:sz w:val="20"/>
+                <w:szCs w:val="20"/>
+              </w:rPr>
+              <w:lastRenderedPageBreak/>
+              <w:t>de atención y el caso queda a la espera de la firma del Jefe de Departamento.</w:t>
             </w:r>
           </w:p>
         </w:tc>
@@ -3675,23 +3715,7 @@
                 <w:sz w:val="20"/>
                 <w:szCs w:val="20"/>
               </w:rPr>
-              <w:t xml:space="preserve">Se coloca cuando el </w:t>
-            </w:r>
-            <w:proofErr w:type="gramStart"/>
-            <w:r>
-              <w:rPr>
-                <w:sz w:val="20"/>
-                <w:szCs w:val="20"/>
-              </w:rPr>
-              <w:t>Jefe</w:t>
-            </w:r>
-            <w:proofErr w:type="gramEnd"/>
-            <w:r>
-              <w:rPr>
-                <w:sz w:val="20"/>
-                <w:szCs w:val="20"/>
-              </w:rPr>
-              <w:t xml:space="preserve"> de Departamento firma el oficio de resolución; el sistema notifica al ciudadano.</w:t>
+              <w:t>Se coloca cuando el Jefe de Departamento firma el oficio de resolución; el sistema notifica al ciudadano.</w:t>
             </w:r>
           </w:p>
         </w:tc>
@@ -3844,6 +3868,13 @@
                 <w:szCs w:val="20"/>
               </w:rPr>
             </w:pPr>
+            <w:r>
+              <w:rPr>
+                <w:sz w:val="20"/>
+                <w:szCs w:val="20"/>
+              </w:rPr>
+              <w:t>En Revisión</w:t>
+            </w:r>
           </w:p>
         </w:tc>
       </w:tr>
@@ -5199,7 +5230,15 @@
                 <w:sz w:val="20"/>
                 <w:szCs w:val="20"/>
               </w:rPr>
-              <w:t>Número de teléfono del ciudadano avecindado en el municipio de Granados B.V.</w:t>
+              <w:t xml:space="preserve">Número de teléfono del ciudadano avecindado en el municipio de Granados </w:t>
+            </w:r>
+            <w:r>
+              <w:rPr>
+                <w:sz w:val="20"/>
+                <w:szCs w:val="20"/>
+              </w:rPr>
+              <w:lastRenderedPageBreak/>
+              <w:t>B.V.</w:t>
             </w:r>
           </w:p>
         </w:tc>
@@ -7093,6 +7132,7 @@
                 <w:sz w:val="20"/>
                 <w:szCs w:val="20"/>
               </w:rPr>
+              <w:lastRenderedPageBreak/>
               <w:t>L (lectura)</w:t>
             </w:r>
           </w:p>
@@ -7113,7 +7153,6 @@
                 <w:sz w:val="20"/>
                 <w:szCs w:val="20"/>
               </w:rPr>
-              <w:lastRenderedPageBreak/>
               <w:t>E (escritura)</w:t>
             </w:r>
           </w:p>
@@ -9214,6 +9253,7 @@
                 <w:sz w:val="20"/>
                 <w:szCs w:val="20"/>
               </w:rPr>
+              <w:lastRenderedPageBreak/>
               <w:t xml:space="preserve">Código </w:t>
             </w:r>
             <w:r>
@@ -9228,7 +9268,6 @@
                 <w:sz w:val="20"/>
                 <w:szCs w:val="20"/>
               </w:rPr>
-              <w:lastRenderedPageBreak/>
               <w:t>seguimiento</w:t>
             </w:r>
           </w:p>
@@ -9253,7 +9292,6 @@
                 <w:sz w:val="20"/>
                 <w:szCs w:val="20"/>
               </w:rPr>
-              <w:lastRenderedPageBreak/>
               <w:t>Alfanumérico</w:t>
             </w:r>
           </w:p>
@@ -9338,15 +9376,7 @@
                 <w:sz w:val="20"/>
                 <w:szCs w:val="20"/>
               </w:rPr>
-              <w:t xml:space="preserve"> </w:t>
-            </w:r>
-            <w:r>
-              <w:rPr>
-                <w:sz w:val="20"/>
-                <w:szCs w:val="20"/>
-              </w:rPr>
-              <w:lastRenderedPageBreak/>
-              <w:t>caracteres)</w:t>
+              <w:t xml:space="preserve"> caracteres)</w:t>
             </w:r>
           </w:p>
         </w:tc>
@@ -9379,7 +9409,6 @@
                 <w:sz w:val="20"/>
                 <w:szCs w:val="20"/>
               </w:rPr>
-              <w:lastRenderedPageBreak/>
               <w:t>Fecha de registro</w:t>
             </w:r>
           </w:p>
@@ -9790,7 +9819,6 @@
           <w:bCs/>
           <w:sz w:val="20"/>
           <w:szCs w:val="20"/>
-          <w:highlight w:val="yellow"/>
         </w:rPr>
         <w:t>Bandeja Auxiliar</w:t>
       </w:r>
@@ -9809,10 +9837,10 @@
         <w:tblLook w:val="04A0" w:firstRow="1" w:lastRow="0" w:firstColumn="1" w:lastColumn="0" w:noHBand="0" w:noVBand="1"/>
       </w:tblPr>
       <w:tblGrid>
-        <w:gridCol w:w="1312"/>
+        <w:gridCol w:w="1313"/>
         <w:gridCol w:w="1851"/>
         <w:gridCol w:w="2230"/>
-        <w:gridCol w:w="3299"/>
+        <w:gridCol w:w="3298"/>
       </w:tblGrid>
       <w:tr>
         <w:trPr>
@@ -9820,7 +9848,7 @@
         </w:trPr>
         <w:tc>
           <w:tcPr>
-            <w:tcW w:w="754" w:type="pct"/>
+            <w:tcW w:w="755" w:type="pct"/>
             <w:shd w:val="clear" w:color="auto" w:fill="D9D9D9"/>
             <w:tcMar>
               <w:top w:w="40" w:type="dxa"/>
@@ -9957,7 +9985,7 @@
         </w:tc>
         <w:tc>
           <w:tcPr>
-            <w:tcW w:w="1898" w:type="pct"/>
+            <w:tcW w:w="1897" w:type="pct"/>
             <w:shd w:val="clear" w:color="auto" w:fill="D9D9D9"/>
           </w:tcPr>
           <w:p>
@@ -9988,7 +10016,7 @@
         </w:trPr>
         <w:tc>
           <w:tcPr>
-            <w:tcW w:w="754" w:type="pct"/>
+            <w:tcW w:w="755" w:type="pct"/>
             <w:tcMar>
               <w:top w:w="40" w:type="dxa"/>
               <w:left w:w="80" w:type="dxa"/>
@@ -10006,7 +10034,14 @@
                 <w:sz w:val="20"/>
                 <w:szCs w:val="20"/>
               </w:rPr>
-              <w:t>Código de caso</w:t>
+              <w:t xml:space="preserve">Código de </w:t>
+            </w:r>
+            <w:r>
+              <w:rPr>
+                <w:sz w:val="20"/>
+                <w:szCs w:val="20"/>
+              </w:rPr>
+              <w:t>seguimiento</w:t>
             </w:r>
           </w:p>
         </w:tc>
@@ -10057,7 +10092,7 @@
         </w:tc>
         <w:tc>
           <w:tcPr>
-            <w:tcW w:w="1898" w:type="pct"/>
+            <w:tcW w:w="1897" w:type="pct"/>
           </w:tcPr>
           <w:p>
             <w:pPr>
@@ -10115,6 +10150,1961 @@
                 <w:szCs w:val="20"/>
               </w:rPr>
               <w:t xml:space="preserve"> caracteres)</w:t>
+            </w:r>
+          </w:p>
+        </w:tc>
+      </w:tr>
+      <w:tr>
+        <w:trPr>
+          <w:trHeight w:val="300"/>
+        </w:trPr>
+        <w:tc>
+          <w:tcPr>
+            <w:tcW w:w="755" w:type="pct"/>
+            <w:tcMar>
+              <w:top w:w="40" w:type="dxa"/>
+              <w:left w:w="80" w:type="dxa"/>
+              <w:bottom w:w="40" w:type="dxa"/>
+              <w:right w:w="80" w:type="dxa"/>
+            </w:tcMar>
+            <w:vAlign w:val="center"/>
+          </w:tcPr>
+          <w:p>
+            <w:pPr>
+              <w:spacing w:line="259" w:lineRule="auto"/>
+              <w:rPr>
+                <w:sz w:val="20"/>
+                <w:szCs w:val="20"/>
+              </w:rPr>
+            </w:pPr>
+            <w:r>
+              <w:rPr>
+                <w:sz w:val="20"/>
+                <w:szCs w:val="20"/>
+              </w:rPr>
+              <w:t>Fecha de ingreso</w:t>
+            </w:r>
+          </w:p>
+        </w:tc>
+        <w:tc>
+          <w:tcPr>
+            <w:tcW w:w="1065" w:type="pct"/>
+            <w:tcMar>
+              <w:top w:w="40" w:type="dxa"/>
+              <w:left w:w="80" w:type="dxa"/>
+              <w:bottom w:w="40" w:type="dxa"/>
+              <w:right w:w="80" w:type="dxa"/>
+            </w:tcMar>
+            <w:vAlign w:val="center"/>
+          </w:tcPr>
+          <w:p>
+            <w:pPr>
+              <w:spacing w:line="259" w:lineRule="auto"/>
+              <w:rPr>
+                <w:sz w:val="20"/>
+                <w:szCs w:val="20"/>
+              </w:rPr>
+            </w:pPr>
+            <w:r>
+              <w:rPr>
+                <w:sz w:val="20"/>
+                <w:szCs w:val="20"/>
+              </w:rPr>
+              <w:t>Fecha</w:t>
+            </w:r>
+          </w:p>
+        </w:tc>
+        <w:tc>
+          <w:tcPr>
+            <w:tcW w:w="1283" w:type="pct"/>
+          </w:tcPr>
+          <w:p>
+            <w:pPr>
+              <w:spacing w:line="259" w:lineRule="auto"/>
+              <w:rPr>
+                <w:sz w:val="20"/>
+                <w:szCs w:val="20"/>
+              </w:rPr>
+            </w:pPr>
+            <w:r>
+              <w:rPr>
+                <w:sz w:val="20"/>
+                <w:szCs w:val="20"/>
+              </w:rPr>
+              <w:t>M, L</w:t>
+            </w:r>
+          </w:p>
+        </w:tc>
+        <w:tc>
+          <w:tcPr>
+            <w:tcW w:w="1897" w:type="pct"/>
+          </w:tcPr>
+          <w:p>
+            <w:pPr>
+              <w:spacing w:line="259" w:lineRule="auto"/>
+              <w:rPr>
+                <w:sz w:val="20"/>
+                <w:szCs w:val="20"/>
+              </w:rPr>
+            </w:pPr>
+          </w:p>
+        </w:tc>
+      </w:tr>
+      <w:tr>
+        <w:trPr>
+          <w:trHeight w:val="300"/>
+        </w:trPr>
+        <w:tc>
+          <w:tcPr>
+            <w:tcW w:w="755" w:type="pct"/>
+            <w:tcMar>
+              <w:top w:w="40" w:type="dxa"/>
+              <w:left w:w="80" w:type="dxa"/>
+              <w:bottom w:w="40" w:type="dxa"/>
+              <w:right w:w="80" w:type="dxa"/>
+            </w:tcMar>
+            <w:vAlign w:val="center"/>
+          </w:tcPr>
+          <w:p>
+            <w:pPr>
+              <w:spacing w:line="259" w:lineRule="auto"/>
+              <w:rPr>
+                <w:sz w:val="20"/>
+                <w:szCs w:val="20"/>
+              </w:rPr>
+            </w:pPr>
+            <w:r>
+              <w:rPr>
+                <w:sz w:val="20"/>
+                <w:szCs w:val="20"/>
+              </w:rPr>
+              <w:t>Tipo de caso</w:t>
+            </w:r>
+          </w:p>
+        </w:tc>
+        <w:tc>
+          <w:tcPr>
+            <w:tcW w:w="1065" w:type="pct"/>
+            <w:tcMar>
+              <w:top w:w="40" w:type="dxa"/>
+              <w:left w:w="80" w:type="dxa"/>
+              <w:bottom w:w="40" w:type="dxa"/>
+              <w:right w:w="80" w:type="dxa"/>
+            </w:tcMar>
+            <w:vAlign w:val="center"/>
+          </w:tcPr>
+          <w:p>
+            <w:pPr>
+              <w:spacing w:line="259" w:lineRule="auto"/>
+              <w:rPr>
+                <w:sz w:val="20"/>
+                <w:szCs w:val="20"/>
+              </w:rPr>
+            </w:pPr>
+            <w:r>
+              <w:rPr>
+                <w:sz w:val="20"/>
+                <w:szCs w:val="20"/>
+              </w:rPr>
+              <w:t>Texto</w:t>
+            </w:r>
+          </w:p>
+        </w:tc>
+        <w:tc>
+          <w:tcPr>
+            <w:tcW w:w="1283" w:type="pct"/>
+          </w:tcPr>
+          <w:p>
+            <w:pPr>
+              <w:spacing w:line="259" w:lineRule="auto"/>
+              <w:rPr>
+                <w:sz w:val="20"/>
+                <w:szCs w:val="20"/>
+              </w:rPr>
+            </w:pPr>
+            <w:r>
+              <w:rPr>
+                <w:sz w:val="20"/>
+                <w:szCs w:val="20"/>
+              </w:rPr>
+              <w:t>M, L</w:t>
+            </w:r>
+          </w:p>
+        </w:tc>
+        <w:tc>
+          <w:tcPr>
+            <w:tcW w:w="1897" w:type="pct"/>
+          </w:tcPr>
+          <w:p>
+            <w:pPr>
+              <w:spacing w:line="259" w:lineRule="auto"/>
+              <w:rPr>
+                <w:sz w:val="20"/>
+                <w:szCs w:val="20"/>
+              </w:rPr>
+            </w:pPr>
+          </w:p>
+        </w:tc>
+      </w:tr>
+      <w:tr>
+        <w:trPr>
+          <w:trHeight w:val="300"/>
+        </w:trPr>
+        <w:tc>
+          <w:tcPr>
+            <w:tcW w:w="755" w:type="pct"/>
+            <w:tcMar>
+              <w:top w:w="40" w:type="dxa"/>
+              <w:left w:w="80" w:type="dxa"/>
+              <w:bottom w:w="40" w:type="dxa"/>
+              <w:right w:w="80" w:type="dxa"/>
+            </w:tcMar>
+            <w:vAlign w:val="center"/>
+          </w:tcPr>
+          <w:p>
+            <w:pPr>
+              <w:spacing w:line="259" w:lineRule="auto"/>
+              <w:rPr>
+                <w:sz w:val="20"/>
+                <w:szCs w:val="20"/>
+              </w:rPr>
+            </w:pPr>
+            <w:r>
+              <w:rPr>
+                <w:sz w:val="20"/>
+                <w:szCs w:val="20"/>
+              </w:rPr>
+              <w:t>Estado</w:t>
+            </w:r>
+          </w:p>
+        </w:tc>
+        <w:tc>
+          <w:tcPr>
+            <w:tcW w:w="1065" w:type="pct"/>
+            <w:tcMar>
+              <w:top w:w="40" w:type="dxa"/>
+              <w:left w:w="80" w:type="dxa"/>
+              <w:bottom w:w="40" w:type="dxa"/>
+              <w:right w:w="80" w:type="dxa"/>
+            </w:tcMar>
+            <w:vAlign w:val="center"/>
+          </w:tcPr>
+          <w:p>
+            <w:pPr>
+              <w:spacing w:line="259" w:lineRule="auto"/>
+              <w:rPr>
+                <w:sz w:val="20"/>
+                <w:szCs w:val="20"/>
+              </w:rPr>
+            </w:pPr>
+            <w:r>
+              <w:rPr>
+                <w:sz w:val="20"/>
+                <w:szCs w:val="20"/>
+              </w:rPr>
+              <w:t>Texto</w:t>
+            </w:r>
+          </w:p>
+        </w:tc>
+        <w:tc>
+          <w:tcPr>
+            <w:tcW w:w="1283" w:type="pct"/>
+          </w:tcPr>
+          <w:p>
+            <w:pPr>
+              <w:spacing w:line="259" w:lineRule="auto"/>
+              <w:rPr>
+                <w:sz w:val="20"/>
+                <w:szCs w:val="20"/>
+              </w:rPr>
+            </w:pPr>
+            <w:r>
+              <w:rPr>
+                <w:sz w:val="20"/>
+                <w:szCs w:val="20"/>
+              </w:rPr>
+              <w:t>M, L</w:t>
+            </w:r>
+          </w:p>
+        </w:tc>
+        <w:tc>
+          <w:tcPr>
+            <w:tcW w:w="1897" w:type="pct"/>
+          </w:tcPr>
+          <w:p>
+            <w:pPr>
+              <w:spacing w:line="259" w:lineRule="auto"/>
+              <w:rPr>
+                <w:sz w:val="20"/>
+                <w:szCs w:val="20"/>
+              </w:rPr>
+            </w:pPr>
+          </w:p>
+        </w:tc>
+      </w:tr>
+      <w:tr>
+        <w:trPr>
+          <w:trHeight w:val="300"/>
+        </w:trPr>
+        <w:tc>
+          <w:tcPr>
+            <w:tcW w:w="755" w:type="pct"/>
+            <w:tcMar>
+              <w:top w:w="40" w:type="dxa"/>
+              <w:left w:w="80" w:type="dxa"/>
+              <w:bottom w:w="40" w:type="dxa"/>
+              <w:right w:w="80" w:type="dxa"/>
+            </w:tcMar>
+            <w:vAlign w:val="center"/>
+          </w:tcPr>
+          <w:p>
+            <w:pPr>
+              <w:spacing w:line="259" w:lineRule="auto"/>
+              <w:rPr>
+                <w:sz w:val="20"/>
+                <w:szCs w:val="20"/>
+              </w:rPr>
+            </w:pPr>
+            <w:r>
+              <w:rPr>
+                <w:sz w:val="20"/>
+                <w:szCs w:val="20"/>
+              </w:rPr>
+              <w:t>Acción</w:t>
+            </w:r>
+          </w:p>
+        </w:tc>
+        <w:tc>
+          <w:tcPr>
+            <w:tcW w:w="1065" w:type="pct"/>
+            <w:tcMar>
+              <w:top w:w="40" w:type="dxa"/>
+              <w:left w:w="80" w:type="dxa"/>
+              <w:bottom w:w="40" w:type="dxa"/>
+              <w:right w:w="80" w:type="dxa"/>
+            </w:tcMar>
+            <w:vAlign w:val="center"/>
+          </w:tcPr>
+          <w:p>
+            <w:pPr>
+              <w:spacing w:line="259" w:lineRule="auto"/>
+              <w:rPr>
+                <w:sz w:val="20"/>
+                <w:szCs w:val="20"/>
+              </w:rPr>
+            </w:pPr>
+            <w:r>
+              <w:rPr>
+                <w:sz w:val="20"/>
+                <w:szCs w:val="20"/>
+              </w:rPr>
+              <w:t>Botón</w:t>
+            </w:r>
+          </w:p>
+        </w:tc>
+        <w:tc>
+          <w:tcPr>
+            <w:tcW w:w="1283" w:type="pct"/>
+          </w:tcPr>
+          <w:p>
+            <w:pPr>
+              <w:spacing w:line="259" w:lineRule="auto"/>
+              <w:rPr>
+                <w:sz w:val="20"/>
+                <w:szCs w:val="20"/>
+              </w:rPr>
+            </w:pPr>
+            <w:r>
+              <w:rPr>
+                <w:sz w:val="20"/>
+                <w:szCs w:val="20"/>
+              </w:rPr>
+              <w:t>M</w:t>
+            </w:r>
+          </w:p>
+        </w:tc>
+        <w:tc>
+          <w:tcPr>
+            <w:tcW w:w="1897" w:type="pct"/>
+          </w:tcPr>
+          <w:p>
+            <w:pPr>
+              <w:spacing w:line="259" w:lineRule="auto"/>
+              <w:rPr>
+                <w:sz w:val="20"/>
+                <w:szCs w:val="20"/>
+              </w:rPr>
+            </w:pPr>
+            <w:r>
+              <w:rPr>
+                <w:sz w:val="20"/>
+                <w:szCs w:val="20"/>
+              </w:rPr>
+              <w:t>Botón</w:t>
+            </w:r>
+            <w:r>
+              <w:rPr>
+                <w:sz w:val="20"/>
+                <w:szCs w:val="20"/>
+              </w:rPr>
+              <w:t xml:space="preserve"> “Ver detalle” que muestra el detalle del caso.</w:t>
+            </w:r>
+          </w:p>
+        </w:tc>
+      </w:tr>
+    </w:tbl>
+    <w:p>
+      <w:pPr>
+        <w:pStyle w:val="NormalWeb"/>
+        <w:spacing w:line="360" w:lineRule="auto"/>
+        <w:ind w:right="300"/>
+        <w:jc w:val="both"/>
+        <w:rPr>
+          <w:b/>
+          <w:bCs/>
+          <w:sz w:val="20"/>
+          <w:szCs w:val="20"/>
+        </w:rPr>
+      </w:pPr>
+      <w:r>
+        <w:rPr>
+          <w:b/>
+          <w:bCs/>
+          <w:sz w:val="20"/>
+          <w:szCs w:val="20"/>
+        </w:rPr>
+        <w:t>RN1</w:t>
+      </w:r>
+      <w:r>
+        <w:rPr>
+          <w:b/>
+          <w:bCs/>
+          <w:sz w:val="20"/>
+          <w:szCs w:val="20"/>
+        </w:rPr>
+        <w:t>7</w:t>
+      </w:r>
+      <w:r>
+        <w:rPr>
+          <w:b/>
+          <w:bCs/>
+          <w:sz w:val="20"/>
+          <w:szCs w:val="20"/>
+        </w:rPr>
+        <w:t xml:space="preserve"> Campos de Formulario </w:t>
+      </w:r>
+      <w:r>
+        <w:rPr>
+          <w:b/>
+          <w:bCs/>
+          <w:sz w:val="20"/>
+          <w:szCs w:val="20"/>
+        </w:rPr>
+        <w:t>Detalle Auxiliar</w:t>
+      </w:r>
+    </w:p>
+    <w:tbl>
+      <w:tblPr>
+        <w:tblW w:w="5000" w:type="pct"/>
+        <w:tblBorders>
+          <w:top w:val="single" w:sz="4" w:space="0" w:color="auto"/>
+          <w:left w:val="single" w:sz="4" w:space="0" w:color="auto"/>
+          <w:bottom w:val="single" w:sz="4" w:space="0" w:color="auto"/>
+          <w:right w:val="single" w:sz="4" w:space="0" w:color="auto"/>
+          <w:insideH w:val="single" w:sz="4" w:space="0" w:color="auto"/>
+          <w:insideV w:val="single" w:sz="4" w:space="0" w:color="auto"/>
+        </w:tblBorders>
+        <w:tblLook w:val="04A0" w:firstRow="1" w:lastRow="0" w:firstColumn="1" w:lastColumn="0" w:noHBand="0" w:noVBand="1"/>
+      </w:tblPr>
+      <w:tblGrid>
+        <w:gridCol w:w="1313"/>
+        <w:gridCol w:w="1851"/>
+        <w:gridCol w:w="2230"/>
+        <w:gridCol w:w="3298"/>
+      </w:tblGrid>
+      <w:tr>
+        <w:trPr>
+          <w:trHeight w:val="300"/>
+        </w:trPr>
+        <w:tc>
+          <w:tcPr>
+            <w:tcW w:w="755" w:type="pct"/>
+            <w:shd w:val="clear" w:color="auto" w:fill="D9D9D9"/>
+            <w:tcMar>
+              <w:top w:w="40" w:type="dxa"/>
+              <w:left w:w="80" w:type="dxa"/>
+              <w:bottom w:w="40" w:type="dxa"/>
+              <w:right w:w="80" w:type="dxa"/>
+            </w:tcMar>
+            <w:vAlign w:val="center"/>
+          </w:tcPr>
+          <w:p>
+            <w:r>
+              <w:rPr>
+                <w:b/>
+                <w:bCs/>
+                <w:sz w:val="20"/>
+                <w:szCs w:val="20"/>
+              </w:rPr>
+              <w:t>Campo</w:t>
+            </w:r>
+          </w:p>
+        </w:tc>
+        <w:tc>
+          <w:tcPr>
+            <w:tcW w:w="1065" w:type="pct"/>
+            <w:shd w:val="clear" w:color="auto" w:fill="D9D9D9"/>
+            <w:tcMar>
+              <w:top w:w="40" w:type="dxa"/>
+              <w:left w:w="80" w:type="dxa"/>
+              <w:bottom w:w="40" w:type="dxa"/>
+              <w:right w:w="80" w:type="dxa"/>
+            </w:tcMar>
+            <w:vAlign w:val="center"/>
+          </w:tcPr>
+          <w:p>
+            <w:pPr>
+              <w:spacing w:line="259" w:lineRule="auto"/>
+            </w:pPr>
+            <w:r>
+              <w:rPr>
+                <w:b/>
+                <w:bCs/>
+                <w:sz w:val="20"/>
+                <w:szCs w:val="20"/>
+              </w:rPr>
+              <w:t>Tipo</w:t>
+            </w:r>
+          </w:p>
+        </w:tc>
+        <w:tc>
+          <w:tcPr>
+            <w:tcW w:w="1283" w:type="pct"/>
+            <w:shd w:val="clear" w:color="auto" w:fill="D9D9D9"/>
+          </w:tcPr>
+          <w:p>
+            <w:pPr>
+              <w:spacing w:line="259" w:lineRule="auto"/>
+              <w:rPr>
+                <w:b/>
+                <w:bCs/>
+                <w:sz w:val="20"/>
+                <w:szCs w:val="20"/>
+              </w:rPr>
+            </w:pPr>
+            <w:r>
+              <w:rPr>
+                <w:b/>
+                <w:bCs/>
+                <w:sz w:val="20"/>
+                <w:szCs w:val="20"/>
+              </w:rPr>
+              <w:t>M (obligatorio)</w:t>
+            </w:r>
+          </w:p>
+          <w:p>
+            <w:pPr>
+              <w:spacing w:line="259" w:lineRule="auto"/>
+              <w:rPr>
+                <w:b/>
+                <w:bCs/>
+                <w:sz w:val="20"/>
+                <w:szCs w:val="20"/>
+              </w:rPr>
+            </w:pPr>
+            <w:r>
+              <w:rPr>
+                <w:b/>
+                <w:bCs/>
+                <w:sz w:val="20"/>
+                <w:szCs w:val="20"/>
+              </w:rPr>
+              <w:t>O (opcional)</w:t>
+            </w:r>
+          </w:p>
+          <w:p>
+            <w:pPr>
+              <w:spacing w:line="259" w:lineRule="auto"/>
+              <w:rPr>
+                <w:b/>
+                <w:bCs/>
+                <w:sz w:val="20"/>
+                <w:szCs w:val="20"/>
+              </w:rPr>
+            </w:pPr>
+            <w:r>
+              <w:rPr>
+                <w:b/>
+                <w:bCs/>
+                <w:sz w:val="20"/>
+                <w:szCs w:val="20"/>
+              </w:rPr>
+              <w:t>L (lectura)</w:t>
+            </w:r>
+          </w:p>
+          <w:p>
+            <w:pPr>
+              <w:spacing w:line="259" w:lineRule="auto"/>
+              <w:rPr>
+                <w:b/>
+                <w:bCs/>
+                <w:sz w:val="20"/>
+                <w:szCs w:val="20"/>
+              </w:rPr>
+            </w:pPr>
+            <w:r>
+              <w:rPr>
+                <w:b/>
+                <w:bCs/>
+                <w:sz w:val="20"/>
+                <w:szCs w:val="20"/>
+              </w:rPr>
+              <w:t>E (escritura)</w:t>
+            </w:r>
+          </w:p>
+        </w:tc>
+        <w:tc>
+          <w:tcPr>
+            <w:tcW w:w="1897" w:type="pct"/>
+            <w:shd w:val="clear" w:color="auto" w:fill="D9D9D9"/>
+          </w:tcPr>
+          <w:p>
+            <w:pPr>
+              <w:spacing w:line="259" w:lineRule="auto"/>
+              <w:rPr>
+                <w:b/>
+                <w:bCs/>
+                <w:sz w:val="20"/>
+                <w:szCs w:val="20"/>
+              </w:rPr>
+            </w:pPr>
+            <w:r>
+              <w:rPr>
+                <w:b/>
+                <w:bCs/>
+                <w:sz w:val="20"/>
+                <w:szCs w:val="20"/>
+              </w:rPr>
+              <w:t>Validaciones</w:t>
+            </w:r>
+          </w:p>
+        </w:tc>
+      </w:tr>
+      <w:tr>
+        <w:trPr>
+          <w:trHeight w:val="300"/>
+        </w:trPr>
+        <w:tc>
+          <w:tcPr>
+            <w:tcW w:w="755" w:type="pct"/>
+            <w:tcMar>
+              <w:top w:w="40" w:type="dxa"/>
+              <w:left w:w="80" w:type="dxa"/>
+              <w:bottom w:w="40" w:type="dxa"/>
+              <w:right w:w="80" w:type="dxa"/>
+            </w:tcMar>
+            <w:vAlign w:val="center"/>
+          </w:tcPr>
+          <w:p>
+            <w:pPr>
+              <w:spacing w:line="259" w:lineRule="auto"/>
+            </w:pPr>
+            <w:r>
+              <w:rPr>
+                <w:sz w:val="20"/>
+                <w:szCs w:val="20"/>
+              </w:rPr>
+              <w:t xml:space="preserve">Código de </w:t>
+            </w:r>
+            <w:r>
+              <w:rPr>
+                <w:sz w:val="20"/>
+                <w:szCs w:val="20"/>
+              </w:rPr>
+              <w:t>seguimiento</w:t>
+            </w:r>
+          </w:p>
+        </w:tc>
+        <w:tc>
+          <w:tcPr>
+            <w:tcW w:w="1065" w:type="pct"/>
+            <w:tcMar>
+              <w:top w:w="40" w:type="dxa"/>
+              <w:left w:w="80" w:type="dxa"/>
+              <w:bottom w:w="40" w:type="dxa"/>
+              <w:right w:w="80" w:type="dxa"/>
+            </w:tcMar>
+            <w:vAlign w:val="center"/>
+          </w:tcPr>
+          <w:p>
+            <w:pPr>
+              <w:spacing w:line="259" w:lineRule="auto"/>
+            </w:pPr>
+            <w:r>
+              <w:rPr>
+                <w:sz w:val="20"/>
+                <w:szCs w:val="20"/>
+              </w:rPr>
+              <w:t>Alfanumérico</w:t>
+            </w:r>
+          </w:p>
+        </w:tc>
+        <w:tc>
+          <w:tcPr>
+            <w:tcW w:w="1283" w:type="pct"/>
+          </w:tcPr>
+          <w:p>
+            <w:pPr>
+              <w:spacing w:line="259" w:lineRule="auto"/>
+              <w:rPr>
+                <w:sz w:val="20"/>
+                <w:szCs w:val="20"/>
+              </w:rPr>
+            </w:pPr>
+            <w:r>
+              <w:rPr>
+                <w:sz w:val="20"/>
+                <w:szCs w:val="20"/>
+              </w:rPr>
+              <w:t>M, L</w:t>
+            </w:r>
+          </w:p>
+        </w:tc>
+        <w:tc>
+          <w:tcPr>
+            <w:tcW w:w="1897" w:type="pct"/>
+          </w:tcPr>
+          <w:p>
+            <w:pPr>
+              <w:spacing w:line="259" w:lineRule="auto"/>
+              <w:rPr>
+                <w:sz w:val="20"/>
+                <w:szCs w:val="20"/>
+              </w:rPr>
+            </w:pPr>
+            <w:r>
+              <w:rPr>
+                <w:sz w:val="20"/>
+                <w:szCs w:val="20"/>
+              </w:rPr>
+              <w:t>Formato SQ-XXXXXXXX (11 caracteres)</w:t>
+            </w:r>
+          </w:p>
+        </w:tc>
+      </w:tr>
+      <w:tr>
+        <w:trPr>
+          <w:trHeight w:val="300"/>
+        </w:trPr>
+        <w:tc>
+          <w:tcPr>
+            <w:tcW w:w="755" w:type="pct"/>
+            <w:tcMar>
+              <w:top w:w="40" w:type="dxa"/>
+              <w:left w:w="80" w:type="dxa"/>
+              <w:bottom w:w="40" w:type="dxa"/>
+              <w:right w:w="80" w:type="dxa"/>
+            </w:tcMar>
+            <w:vAlign w:val="center"/>
+          </w:tcPr>
+          <w:p>
+            <w:pPr>
+              <w:spacing w:line="259" w:lineRule="auto"/>
+              <w:rPr>
+                <w:sz w:val="20"/>
+                <w:szCs w:val="20"/>
+              </w:rPr>
+            </w:pPr>
+            <w:r>
+              <w:rPr>
+                <w:sz w:val="20"/>
+                <w:szCs w:val="20"/>
+              </w:rPr>
+              <w:t>Fecha de ingreso</w:t>
+            </w:r>
+          </w:p>
+        </w:tc>
+        <w:tc>
+          <w:tcPr>
+            <w:tcW w:w="1065" w:type="pct"/>
+            <w:tcMar>
+              <w:top w:w="40" w:type="dxa"/>
+              <w:left w:w="80" w:type="dxa"/>
+              <w:bottom w:w="40" w:type="dxa"/>
+              <w:right w:w="80" w:type="dxa"/>
+            </w:tcMar>
+            <w:vAlign w:val="center"/>
+          </w:tcPr>
+          <w:p>
+            <w:pPr>
+              <w:spacing w:line="259" w:lineRule="auto"/>
+              <w:rPr>
+                <w:sz w:val="20"/>
+                <w:szCs w:val="20"/>
+              </w:rPr>
+            </w:pPr>
+            <w:r>
+              <w:rPr>
+                <w:sz w:val="20"/>
+                <w:szCs w:val="20"/>
+              </w:rPr>
+              <w:t>Fecha</w:t>
+            </w:r>
+          </w:p>
+        </w:tc>
+        <w:tc>
+          <w:tcPr>
+            <w:tcW w:w="1283" w:type="pct"/>
+          </w:tcPr>
+          <w:p>
+            <w:pPr>
+              <w:spacing w:line="259" w:lineRule="auto"/>
+              <w:rPr>
+                <w:sz w:val="20"/>
+                <w:szCs w:val="20"/>
+              </w:rPr>
+            </w:pPr>
+            <w:r>
+              <w:rPr>
+                <w:sz w:val="20"/>
+                <w:szCs w:val="20"/>
+              </w:rPr>
+              <w:t>M, L</w:t>
+            </w:r>
+          </w:p>
+        </w:tc>
+        <w:tc>
+          <w:tcPr>
+            <w:tcW w:w="1897" w:type="pct"/>
+          </w:tcPr>
+          <w:p>
+            <w:pPr>
+              <w:spacing w:line="259" w:lineRule="auto"/>
+              <w:rPr>
+                <w:sz w:val="20"/>
+                <w:szCs w:val="20"/>
+              </w:rPr>
+            </w:pPr>
+          </w:p>
+        </w:tc>
+      </w:tr>
+      <w:tr>
+        <w:trPr>
+          <w:trHeight w:val="300"/>
+        </w:trPr>
+        <w:tc>
+          <w:tcPr>
+            <w:tcW w:w="755" w:type="pct"/>
+            <w:tcMar>
+              <w:top w:w="40" w:type="dxa"/>
+              <w:left w:w="80" w:type="dxa"/>
+              <w:bottom w:w="40" w:type="dxa"/>
+              <w:right w:w="80" w:type="dxa"/>
+            </w:tcMar>
+            <w:vAlign w:val="center"/>
+          </w:tcPr>
+          <w:p>
+            <w:pPr>
+              <w:spacing w:line="259" w:lineRule="auto"/>
+              <w:rPr>
+                <w:sz w:val="20"/>
+                <w:szCs w:val="20"/>
+              </w:rPr>
+            </w:pPr>
+            <w:r>
+              <w:rPr>
+                <w:sz w:val="20"/>
+                <w:szCs w:val="20"/>
+              </w:rPr>
+              <w:t>Tipo de caso</w:t>
+            </w:r>
+          </w:p>
+        </w:tc>
+        <w:tc>
+          <w:tcPr>
+            <w:tcW w:w="1065" w:type="pct"/>
+            <w:tcMar>
+              <w:top w:w="40" w:type="dxa"/>
+              <w:left w:w="80" w:type="dxa"/>
+              <w:bottom w:w="40" w:type="dxa"/>
+              <w:right w:w="80" w:type="dxa"/>
+            </w:tcMar>
+            <w:vAlign w:val="center"/>
+          </w:tcPr>
+          <w:p>
+            <w:pPr>
+              <w:spacing w:line="259" w:lineRule="auto"/>
+              <w:rPr>
+                <w:sz w:val="20"/>
+                <w:szCs w:val="20"/>
+              </w:rPr>
+            </w:pPr>
+            <w:r>
+              <w:rPr>
+                <w:sz w:val="20"/>
+                <w:szCs w:val="20"/>
+              </w:rPr>
+              <w:t>Texto</w:t>
+            </w:r>
+          </w:p>
+        </w:tc>
+        <w:tc>
+          <w:tcPr>
+            <w:tcW w:w="1283" w:type="pct"/>
+          </w:tcPr>
+          <w:p>
+            <w:pPr>
+              <w:spacing w:line="259" w:lineRule="auto"/>
+              <w:rPr>
+                <w:sz w:val="20"/>
+                <w:szCs w:val="20"/>
+              </w:rPr>
+            </w:pPr>
+            <w:r>
+              <w:rPr>
+                <w:sz w:val="20"/>
+                <w:szCs w:val="20"/>
+              </w:rPr>
+              <w:t>M, L</w:t>
+            </w:r>
+          </w:p>
+        </w:tc>
+        <w:tc>
+          <w:tcPr>
+            <w:tcW w:w="1897" w:type="pct"/>
+          </w:tcPr>
+          <w:p>
+            <w:pPr>
+              <w:spacing w:line="259" w:lineRule="auto"/>
+              <w:rPr>
+                <w:sz w:val="20"/>
+                <w:szCs w:val="20"/>
+              </w:rPr>
+            </w:pPr>
+          </w:p>
+        </w:tc>
+      </w:tr>
+      <w:tr>
+        <w:trPr>
+          <w:trHeight w:val="300"/>
+        </w:trPr>
+        <w:tc>
+          <w:tcPr>
+            <w:tcW w:w="755" w:type="pct"/>
+            <w:tcMar>
+              <w:top w:w="40" w:type="dxa"/>
+              <w:left w:w="80" w:type="dxa"/>
+              <w:bottom w:w="40" w:type="dxa"/>
+              <w:right w:w="80" w:type="dxa"/>
+            </w:tcMar>
+            <w:vAlign w:val="center"/>
+          </w:tcPr>
+          <w:p>
+            <w:pPr>
+              <w:spacing w:line="259" w:lineRule="auto"/>
+              <w:rPr>
+                <w:sz w:val="20"/>
+                <w:szCs w:val="20"/>
+              </w:rPr>
+            </w:pPr>
+            <w:r>
+              <w:rPr>
+                <w:sz w:val="20"/>
+                <w:szCs w:val="20"/>
+              </w:rPr>
+              <w:t>Categoría</w:t>
+            </w:r>
+          </w:p>
+        </w:tc>
+        <w:tc>
+          <w:tcPr>
+            <w:tcW w:w="1065" w:type="pct"/>
+            <w:tcMar>
+              <w:top w:w="40" w:type="dxa"/>
+              <w:left w:w="80" w:type="dxa"/>
+              <w:bottom w:w="40" w:type="dxa"/>
+              <w:right w:w="80" w:type="dxa"/>
+            </w:tcMar>
+            <w:vAlign w:val="center"/>
+          </w:tcPr>
+          <w:p>
+            <w:pPr>
+              <w:spacing w:line="259" w:lineRule="auto"/>
+              <w:rPr>
+                <w:sz w:val="20"/>
+                <w:szCs w:val="20"/>
+              </w:rPr>
+            </w:pPr>
+            <w:r>
+              <w:rPr>
+                <w:sz w:val="20"/>
+                <w:szCs w:val="20"/>
+              </w:rPr>
+              <w:t>Texto</w:t>
+            </w:r>
+          </w:p>
+        </w:tc>
+        <w:tc>
+          <w:tcPr>
+            <w:tcW w:w="1283" w:type="pct"/>
+          </w:tcPr>
+          <w:p>
+            <w:pPr>
+              <w:spacing w:line="259" w:lineRule="auto"/>
+              <w:rPr>
+                <w:sz w:val="20"/>
+                <w:szCs w:val="20"/>
+              </w:rPr>
+            </w:pPr>
+            <w:r>
+              <w:rPr>
+                <w:sz w:val="20"/>
+                <w:szCs w:val="20"/>
+              </w:rPr>
+              <w:t>M, L</w:t>
+            </w:r>
+          </w:p>
+        </w:tc>
+        <w:tc>
+          <w:tcPr>
+            <w:tcW w:w="1897" w:type="pct"/>
+          </w:tcPr>
+          <w:p>
+            <w:pPr>
+              <w:spacing w:line="259" w:lineRule="auto"/>
+              <w:rPr>
+                <w:sz w:val="20"/>
+                <w:szCs w:val="20"/>
+              </w:rPr>
+            </w:pPr>
+          </w:p>
+        </w:tc>
+      </w:tr>
+      <w:tr>
+        <w:trPr>
+          <w:trHeight w:val="300"/>
+        </w:trPr>
+        <w:tc>
+          <w:tcPr>
+            <w:tcW w:w="755" w:type="pct"/>
+            <w:tcMar>
+              <w:top w:w="40" w:type="dxa"/>
+              <w:left w:w="80" w:type="dxa"/>
+              <w:bottom w:w="40" w:type="dxa"/>
+              <w:right w:w="80" w:type="dxa"/>
+            </w:tcMar>
+            <w:vAlign w:val="center"/>
+          </w:tcPr>
+          <w:p>
+            <w:pPr>
+              <w:spacing w:line="259" w:lineRule="auto"/>
+              <w:rPr>
+                <w:sz w:val="20"/>
+                <w:szCs w:val="20"/>
+              </w:rPr>
+            </w:pPr>
+            <w:r>
+              <w:rPr>
+                <w:sz w:val="20"/>
+                <w:szCs w:val="20"/>
+              </w:rPr>
+              <w:t>Descripción del caso</w:t>
+            </w:r>
+          </w:p>
+        </w:tc>
+        <w:tc>
+          <w:tcPr>
+            <w:tcW w:w="1065" w:type="pct"/>
+            <w:tcMar>
+              <w:top w:w="40" w:type="dxa"/>
+              <w:left w:w="80" w:type="dxa"/>
+              <w:bottom w:w="40" w:type="dxa"/>
+              <w:right w:w="80" w:type="dxa"/>
+            </w:tcMar>
+            <w:vAlign w:val="center"/>
+          </w:tcPr>
+          <w:p>
+            <w:pPr>
+              <w:spacing w:line="259" w:lineRule="auto"/>
+              <w:rPr>
+                <w:sz w:val="20"/>
+                <w:szCs w:val="20"/>
+              </w:rPr>
+            </w:pPr>
+            <w:r>
+              <w:rPr>
+                <w:sz w:val="20"/>
+                <w:szCs w:val="20"/>
+              </w:rPr>
+              <w:t>Texto</w:t>
+            </w:r>
+          </w:p>
+        </w:tc>
+        <w:tc>
+          <w:tcPr>
+            <w:tcW w:w="1283" w:type="pct"/>
+          </w:tcPr>
+          <w:p>
+            <w:pPr>
+              <w:spacing w:line="259" w:lineRule="auto"/>
+              <w:rPr>
+                <w:sz w:val="20"/>
+                <w:szCs w:val="20"/>
+              </w:rPr>
+            </w:pPr>
+            <w:r>
+              <w:rPr>
+                <w:sz w:val="20"/>
+                <w:szCs w:val="20"/>
+              </w:rPr>
+              <w:t>M, L</w:t>
+            </w:r>
+          </w:p>
+        </w:tc>
+        <w:tc>
+          <w:tcPr>
+            <w:tcW w:w="1897" w:type="pct"/>
+          </w:tcPr>
+          <w:p>
+            <w:pPr>
+              <w:spacing w:line="259" w:lineRule="auto"/>
+              <w:rPr>
+                <w:sz w:val="20"/>
+                <w:szCs w:val="20"/>
+              </w:rPr>
+            </w:pPr>
+          </w:p>
+        </w:tc>
+      </w:tr>
+      <w:tr>
+        <w:trPr>
+          <w:trHeight w:val="300"/>
+        </w:trPr>
+        <w:tc>
+          <w:tcPr>
+            <w:tcW w:w="755" w:type="pct"/>
+            <w:tcMar>
+              <w:top w:w="40" w:type="dxa"/>
+              <w:left w:w="80" w:type="dxa"/>
+              <w:bottom w:w="40" w:type="dxa"/>
+              <w:right w:w="80" w:type="dxa"/>
+            </w:tcMar>
+            <w:vAlign w:val="center"/>
+          </w:tcPr>
+          <w:p>
+            <w:pPr>
+              <w:spacing w:line="259" w:lineRule="auto"/>
+              <w:rPr>
+                <w:sz w:val="20"/>
+                <w:szCs w:val="20"/>
+              </w:rPr>
+            </w:pPr>
+            <w:r>
+              <w:rPr>
+                <w:sz w:val="20"/>
+                <w:szCs w:val="20"/>
+              </w:rPr>
+              <w:t>Dirección</w:t>
+            </w:r>
+          </w:p>
+        </w:tc>
+        <w:tc>
+          <w:tcPr>
+            <w:tcW w:w="1065" w:type="pct"/>
+            <w:tcMar>
+              <w:top w:w="40" w:type="dxa"/>
+              <w:left w:w="80" w:type="dxa"/>
+              <w:bottom w:w="40" w:type="dxa"/>
+              <w:right w:w="80" w:type="dxa"/>
+            </w:tcMar>
+            <w:vAlign w:val="center"/>
+          </w:tcPr>
+          <w:p>
+            <w:pPr>
+              <w:spacing w:line="259" w:lineRule="auto"/>
+              <w:rPr>
+                <w:sz w:val="20"/>
+                <w:szCs w:val="20"/>
+              </w:rPr>
+            </w:pPr>
+            <w:r>
+              <w:rPr>
+                <w:sz w:val="20"/>
+                <w:szCs w:val="20"/>
+              </w:rPr>
+              <w:t>Texto</w:t>
+            </w:r>
+          </w:p>
+        </w:tc>
+        <w:tc>
+          <w:tcPr>
+            <w:tcW w:w="1283" w:type="pct"/>
+          </w:tcPr>
+          <w:p>
+            <w:pPr>
+              <w:spacing w:line="259" w:lineRule="auto"/>
+              <w:rPr>
+                <w:sz w:val="20"/>
+                <w:szCs w:val="20"/>
+              </w:rPr>
+            </w:pPr>
+            <w:r>
+              <w:rPr>
+                <w:sz w:val="20"/>
+                <w:szCs w:val="20"/>
+              </w:rPr>
+              <w:t>M, L</w:t>
+            </w:r>
+          </w:p>
+        </w:tc>
+        <w:tc>
+          <w:tcPr>
+            <w:tcW w:w="1897" w:type="pct"/>
+          </w:tcPr>
+          <w:p>
+            <w:pPr>
+              <w:spacing w:line="259" w:lineRule="auto"/>
+              <w:rPr>
+                <w:sz w:val="20"/>
+                <w:szCs w:val="20"/>
+              </w:rPr>
+            </w:pPr>
+          </w:p>
+        </w:tc>
+      </w:tr>
+      <w:tr>
+        <w:trPr>
+          <w:trHeight w:val="300"/>
+        </w:trPr>
+        <w:tc>
+          <w:tcPr>
+            <w:tcW w:w="755" w:type="pct"/>
+            <w:tcMar>
+              <w:top w:w="40" w:type="dxa"/>
+              <w:left w:w="80" w:type="dxa"/>
+              <w:bottom w:w="40" w:type="dxa"/>
+              <w:right w:w="80" w:type="dxa"/>
+            </w:tcMar>
+            <w:vAlign w:val="center"/>
+          </w:tcPr>
+          <w:p>
+            <w:pPr>
+              <w:spacing w:line="259" w:lineRule="auto"/>
+              <w:rPr>
+                <w:sz w:val="20"/>
+                <w:szCs w:val="20"/>
+              </w:rPr>
+            </w:pPr>
+            <w:r>
+              <w:rPr>
+                <w:sz w:val="20"/>
+                <w:szCs w:val="20"/>
+              </w:rPr>
+              <w:t>Evidencia</w:t>
+            </w:r>
+          </w:p>
+        </w:tc>
+        <w:tc>
+          <w:tcPr>
+            <w:tcW w:w="1065" w:type="pct"/>
+            <w:tcMar>
+              <w:top w:w="40" w:type="dxa"/>
+              <w:left w:w="80" w:type="dxa"/>
+              <w:bottom w:w="40" w:type="dxa"/>
+              <w:right w:w="80" w:type="dxa"/>
+            </w:tcMar>
+            <w:vAlign w:val="center"/>
+          </w:tcPr>
+          <w:p>
+            <w:pPr>
+              <w:spacing w:line="259" w:lineRule="auto"/>
+              <w:rPr>
+                <w:sz w:val="20"/>
+                <w:szCs w:val="20"/>
+              </w:rPr>
+            </w:pPr>
+            <w:r>
+              <w:rPr>
+                <w:sz w:val="20"/>
+                <w:szCs w:val="20"/>
+              </w:rPr>
+              <w:t>Botón</w:t>
+            </w:r>
+          </w:p>
+        </w:tc>
+        <w:tc>
+          <w:tcPr>
+            <w:tcW w:w="1283" w:type="pct"/>
+          </w:tcPr>
+          <w:p>
+            <w:pPr>
+              <w:spacing w:line="259" w:lineRule="auto"/>
+              <w:rPr>
+                <w:sz w:val="20"/>
+                <w:szCs w:val="20"/>
+              </w:rPr>
+            </w:pPr>
+            <w:r>
+              <w:rPr>
+                <w:sz w:val="20"/>
+                <w:szCs w:val="20"/>
+              </w:rPr>
+              <w:t>M</w:t>
+            </w:r>
+          </w:p>
+        </w:tc>
+        <w:tc>
+          <w:tcPr>
+            <w:tcW w:w="1897" w:type="pct"/>
+          </w:tcPr>
+          <w:p>
+            <w:pPr>
+              <w:spacing w:line="259" w:lineRule="auto"/>
+              <w:rPr>
+                <w:sz w:val="20"/>
+                <w:szCs w:val="20"/>
+              </w:rPr>
+            </w:pPr>
+            <w:r>
+              <w:rPr>
+                <w:sz w:val="20"/>
+                <w:szCs w:val="20"/>
+              </w:rPr>
+              <w:t xml:space="preserve">Botón para </w:t>
+            </w:r>
+            <w:r>
+              <w:rPr>
+                <w:sz w:val="20"/>
+                <w:szCs w:val="20"/>
+              </w:rPr>
+              <w:t>ver</w:t>
+            </w:r>
+            <w:r>
+              <w:rPr>
+                <w:sz w:val="20"/>
+                <w:szCs w:val="20"/>
+              </w:rPr>
+              <w:t xml:space="preserve"> archivo</w:t>
+            </w:r>
+          </w:p>
+          <w:p>
+            <w:pPr>
+              <w:spacing w:line="259" w:lineRule="auto"/>
+              <w:rPr>
+                <w:sz w:val="20"/>
+                <w:szCs w:val="20"/>
+              </w:rPr>
+            </w:pPr>
+            <w:r>
+              <w:rPr>
+                <w:sz w:val="20"/>
+                <w:szCs w:val="20"/>
+              </w:rPr>
+              <w:t>Se activa solo si el caso tiene documento adjunto.</w:t>
+            </w:r>
+          </w:p>
+        </w:tc>
+      </w:tr>
+    </w:tbl>
+    <w:p>
+      <w:pPr>
+        <w:pStyle w:val="NormalWeb"/>
+        <w:spacing w:line="360" w:lineRule="auto"/>
+        <w:ind w:right="300"/>
+        <w:jc w:val="both"/>
+        <w:rPr>
+          <w:b/>
+          <w:bCs/>
+          <w:sz w:val="20"/>
+          <w:szCs w:val="20"/>
+        </w:rPr>
+      </w:pPr>
+      <w:r>
+        <w:rPr>
+          <w:b/>
+          <w:bCs/>
+          <w:sz w:val="20"/>
+          <w:szCs w:val="20"/>
+        </w:rPr>
+        <w:t>RN1</w:t>
+      </w:r>
+      <w:r>
+        <w:rPr>
+          <w:b/>
+          <w:bCs/>
+          <w:sz w:val="20"/>
+          <w:szCs w:val="20"/>
+        </w:rPr>
+        <w:t>8</w:t>
+      </w:r>
+      <w:r>
+        <w:rPr>
+          <w:b/>
+          <w:bCs/>
+          <w:sz w:val="20"/>
+          <w:szCs w:val="20"/>
+        </w:rPr>
+        <w:t xml:space="preserve"> Campos de Formulario </w:t>
+      </w:r>
+      <w:r>
+        <w:rPr>
+          <w:b/>
+          <w:bCs/>
+          <w:sz w:val="20"/>
+          <w:szCs w:val="20"/>
+        </w:rPr>
+        <w:t xml:space="preserve">Rechazo </w:t>
+      </w:r>
+      <w:r>
+        <w:rPr>
+          <w:b/>
+          <w:bCs/>
+          <w:sz w:val="20"/>
+          <w:szCs w:val="20"/>
+        </w:rPr>
+        <w:t>Auxiliar</w:t>
+      </w:r>
+    </w:p>
+    <w:tbl>
+      <w:tblPr>
+        <w:tblW w:w="5000" w:type="pct"/>
+        <w:tblBorders>
+          <w:top w:val="single" w:sz="4" w:space="0" w:color="auto"/>
+          <w:left w:val="single" w:sz="4" w:space="0" w:color="auto"/>
+          <w:bottom w:val="single" w:sz="4" w:space="0" w:color="auto"/>
+          <w:right w:val="single" w:sz="4" w:space="0" w:color="auto"/>
+          <w:insideH w:val="single" w:sz="4" w:space="0" w:color="auto"/>
+          <w:insideV w:val="single" w:sz="4" w:space="0" w:color="auto"/>
+        </w:tblBorders>
+        <w:tblLook w:val="04A0" w:firstRow="1" w:lastRow="0" w:firstColumn="1" w:lastColumn="0" w:noHBand="0" w:noVBand="1"/>
+      </w:tblPr>
+      <w:tblGrid>
+        <w:gridCol w:w="1313"/>
+        <w:gridCol w:w="1851"/>
+        <w:gridCol w:w="2230"/>
+        <w:gridCol w:w="3298"/>
+      </w:tblGrid>
+      <w:tr>
+        <w:trPr>
+          <w:trHeight w:val="300"/>
+        </w:trPr>
+        <w:tc>
+          <w:tcPr>
+            <w:tcW w:w="755" w:type="pct"/>
+            <w:shd w:val="clear" w:color="auto" w:fill="D9D9D9"/>
+            <w:tcMar>
+              <w:top w:w="40" w:type="dxa"/>
+              <w:left w:w="80" w:type="dxa"/>
+              <w:bottom w:w="40" w:type="dxa"/>
+              <w:right w:w="80" w:type="dxa"/>
+            </w:tcMar>
+            <w:vAlign w:val="center"/>
+          </w:tcPr>
+          <w:p>
+            <w:r>
+              <w:rPr>
+                <w:b/>
+                <w:bCs/>
+                <w:sz w:val="20"/>
+                <w:szCs w:val="20"/>
+              </w:rPr>
+              <w:lastRenderedPageBreak/>
+              <w:t>Campo</w:t>
+            </w:r>
+          </w:p>
+        </w:tc>
+        <w:tc>
+          <w:tcPr>
+            <w:tcW w:w="1065" w:type="pct"/>
+            <w:shd w:val="clear" w:color="auto" w:fill="D9D9D9"/>
+            <w:tcMar>
+              <w:top w:w="40" w:type="dxa"/>
+              <w:left w:w="80" w:type="dxa"/>
+              <w:bottom w:w="40" w:type="dxa"/>
+              <w:right w:w="80" w:type="dxa"/>
+            </w:tcMar>
+            <w:vAlign w:val="center"/>
+          </w:tcPr>
+          <w:p>
+            <w:pPr>
+              <w:spacing w:line="259" w:lineRule="auto"/>
+            </w:pPr>
+            <w:r>
+              <w:rPr>
+                <w:b/>
+                <w:bCs/>
+                <w:sz w:val="20"/>
+                <w:szCs w:val="20"/>
+              </w:rPr>
+              <w:t>Tipo</w:t>
+            </w:r>
+          </w:p>
+        </w:tc>
+        <w:tc>
+          <w:tcPr>
+            <w:tcW w:w="1283" w:type="pct"/>
+            <w:shd w:val="clear" w:color="auto" w:fill="D9D9D9"/>
+          </w:tcPr>
+          <w:p>
+            <w:pPr>
+              <w:spacing w:line="259" w:lineRule="auto"/>
+              <w:rPr>
+                <w:b/>
+                <w:bCs/>
+                <w:sz w:val="20"/>
+                <w:szCs w:val="20"/>
+              </w:rPr>
+            </w:pPr>
+            <w:r>
+              <w:rPr>
+                <w:b/>
+                <w:bCs/>
+                <w:sz w:val="20"/>
+                <w:szCs w:val="20"/>
+              </w:rPr>
+              <w:t>M (obligatorio)</w:t>
+            </w:r>
+          </w:p>
+          <w:p>
+            <w:pPr>
+              <w:spacing w:line="259" w:lineRule="auto"/>
+              <w:rPr>
+                <w:b/>
+                <w:bCs/>
+                <w:sz w:val="20"/>
+                <w:szCs w:val="20"/>
+              </w:rPr>
+            </w:pPr>
+            <w:r>
+              <w:rPr>
+                <w:b/>
+                <w:bCs/>
+                <w:sz w:val="20"/>
+                <w:szCs w:val="20"/>
+              </w:rPr>
+              <w:t>O (opcional)</w:t>
+            </w:r>
+          </w:p>
+          <w:p>
+            <w:pPr>
+              <w:spacing w:line="259" w:lineRule="auto"/>
+              <w:rPr>
+                <w:b/>
+                <w:bCs/>
+                <w:sz w:val="20"/>
+                <w:szCs w:val="20"/>
+              </w:rPr>
+            </w:pPr>
+            <w:r>
+              <w:rPr>
+                <w:b/>
+                <w:bCs/>
+                <w:sz w:val="20"/>
+                <w:szCs w:val="20"/>
+              </w:rPr>
+              <w:t>L (lectura)</w:t>
+            </w:r>
+          </w:p>
+          <w:p>
+            <w:pPr>
+              <w:spacing w:line="259" w:lineRule="auto"/>
+              <w:rPr>
+                <w:b/>
+                <w:bCs/>
+                <w:sz w:val="20"/>
+                <w:szCs w:val="20"/>
+              </w:rPr>
+            </w:pPr>
+            <w:r>
+              <w:rPr>
+                <w:b/>
+                <w:bCs/>
+                <w:sz w:val="20"/>
+                <w:szCs w:val="20"/>
+              </w:rPr>
+              <w:t>E (escritura)</w:t>
+            </w:r>
+          </w:p>
+          <w:p>
+            <w:pPr>
+              <w:spacing w:line="259" w:lineRule="auto"/>
+              <w:rPr>
+                <w:b/>
+                <w:bCs/>
+                <w:sz w:val="20"/>
+                <w:szCs w:val="20"/>
+              </w:rPr>
+            </w:pPr>
+            <w:r>
+              <w:rPr>
+                <w:b/>
+                <w:bCs/>
+                <w:sz w:val="20"/>
+                <w:szCs w:val="20"/>
+              </w:rPr>
+              <w:t>S (Selección)</w:t>
+            </w:r>
+          </w:p>
+        </w:tc>
+        <w:tc>
+          <w:tcPr>
+            <w:tcW w:w="1897" w:type="pct"/>
+            <w:shd w:val="clear" w:color="auto" w:fill="D9D9D9"/>
+          </w:tcPr>
+          <w:p>
+            <w:pPr>
+              <w:spacing w:line="259" w:lineRule="auto"/>
+              <w:rPr>
+                <w:b/>
+                <w:bCs/>
+                <w:sz w:val="20"/>
+                <w:szCs w:val="20"/>
+              </w:rPr>
+            </w:pPr>
+            <w:r>
+              <w:rPr>
+                <w:b/>
+                <w:bCs/>
+                <w:sz w:val="20"/>
+                <w:szCs w:val="20"/>
+              </w:rPr>
+              <w:t>Validaciones</w:t>
+            </w:r>
+          </w:p>
+        </w:tc>
+      </w:tr>
+      <w:tr>
+        <w:trPr>
+          <w:trHeight w:val="300"/>
+        </w:trPr>
+        <w:tc>
+          <w:tcPr>
+            <w:tcW w:w="755" w:type="pct"/>
+            <w:tcMar>
+              <w:top w:w="40" w:type="dxa"/>
+              <w:left w:w="80" w:type="dxa"/>
+              <w:bottom w:w="40" w:type="dxa"/>
+              <w:right w:w="80" w:type="dxa"/>
+            </w:tcMar>
+            <w:vAlign w:val="center"/>
+          </w:tcPr>
+          <w:p>
+            <w:pPr>
+              <w:spacing w:line="259" w:lineRule="auto"/>
+            </w:pPr>
+            <w:r>
+              <w:rPr>
+                <w:sz w:val="20"/>
+                <w:szCs w:val="20"/>
+              </w:rPr>
+              <w:t>Motivo de rechazo</w:t>
+            </w:r>
+          </w:p>
+        </w:tc>
+        <w:tc>
+          <w:tcPr>
+            <w:tcW w:w="1065" w:type="pct"/>
+            <w:tcMar>
+              <w:top w:w="40" w:type="dxa"/>
+              <w:left w:w="80" w:type="dxa"/>
+              <w:bottom w:w="40" w:type="dxa"/>
+              <w:right w:w="80" w:type="dxa"/>
+            </w:tcMar>
+            <w:vAlign w:val="center"/>
+          </w:tcPr>
+          <w:p>
+            <w:pPr>
+              <w:spacing w:line="259" w:lineRule="auto"/>
+            </w:pPr>
+            <w:r>
+              <w:rPr>
+                <w:sz w:val="20"/>
+                <w:szCs w:val="20"/>
+              </w:rPr>
+              <w:t>Lista</w:t>
+            </w:r>
+          </w:p>
+        </w:tc>
+        <w:tc>
+          <w:tcPr>
+            <w:tcW w:w="1283" w:type="pct"/>
+          </w:tcPr>
+          <w:p>
+            <w:pPr>
+              <w:spacing w:line="259" w:lineRule="auto"/>
+              <w:rPr>
+                <w:sz w:val="20"/>
+                <w:szCs w:val="20"/>
+              </w:rPr>
+            </w:pPr>
+            <w:r>
+              <w:rPr>
+                <w:sz w:val="20"/>
+                <w:szCs w:val="20"/>
+              </w:rPr>
+              <w:t xml:space="preserve">M, </w:t>
+            </w:r>
+            <w:r>
+              <w:rPr>
+                <w:sz w:val="20"/>
+                <w:szCs w:val="20"/>
+              </w:rPr>
+              <w:t>S</w:t>
+            </w:r>
+          </w:p>
+        </w:tc>
+        <w:tc>
+          <w:tcPr>
+            <w:tcW w:w="1897" w:type="pct"/>
+          </w:tcPr>
+          <w:p>
+            <w:pPr>
+              <w:spacing w:line="259" w:lineRule="auto"/>
+              <w:rPr>
+                <w:sz w:val="20"/>
+                <w:szCs w:val="20"/>
+              </w:rPr>
+            </w:pPr>
+            <w:r>
+              <w:rPr>
+                <w:sz w:val="20"/>
+                <w:szCs w:val="20"/>
+              </w:rPr>
+              <w:t>RN05</w:t>
+            </w:r>
+          </w:p>
+        </w:tc>
+      </w:tr>
+      <w:tr>
+        <w:trPr>
+          <w:trHeight w:val="300"/>
+        </w:trPr>
+        <w:tc>
+          <w:tcPr>
+            <w:tcW w:w="755" w:type="pct"/>
+            <w:tcMar>
+              <w:top w:w="40" w:type="dxa"/>
+              <w:left w:w="80" w:type="dxa"/>
+              <w:bottom w:w="40" w:type="dxa"/>
+              <w:right w:w="80" w:type="dxa"/>
+            </w:tcMar>
+            <w:vAlign w:val="center"/>
+          </w:tcPr>
+          <w:p>
+            <w:pPr>
+              <w:spacing w:line="259" w:lineRule="auto"/>
+              <w:rPr>
+                <w:sz w:val="20"/>
+                <w:szCs w:val="20"/>
+              </w:rPr>
+            </w:pPr>
+            <w:r>
+              <w:rPr>
+                <w:sz w:val="20"/>
+                <w:szCs w:val="20"/>
+              </w:rPr>
+              <w:t>Comentario</w:t>
+            </w:r>
+          </w:p>
+        </w:tc>
+        <w:tc>
+          <w:tcPr>
+            <w:tcW w:w="1065" w:type="pct"/>
+            <w:tcMar>
+              <w:top w:w="40" w:type="dxa"/>
+              <w:left w:w="80" w:type="dxa"/>
+              <w:bottom w:w="40" w:type="dxa"/>
+              <w:right w:w="80" w:type="dxa"/>
+            </w:tcMar>
+            <w:vAlign w:val="center"/>
+          </w:tcPr>
+          <w:p>
+            <w:pPr>
+              <w:spacing w:line="259" w:lineRule="auto"/>
+              <w:rPr>
+                <w:sz w:val="20"/>
+                <w:szCs w:val="20"/>
+              </w:rPr>
+            </w:pPr>
+            <w:r>
+              <w:rPr>
+                <w:sz w:val="20"/>
+                <w:szCs w:val="20"/>
+              </w:rPr>
+              <w:t>Alfanumérico</w:t>
+            </w:r>
+          </w:p>
+        </w:tc>
+        <w:tc>
+          <w:tcPr>
+            <w:tcW w:w="1283" w:type="pct"/>
+          </w:tcPr>
+          <w:p>
+            <w:pPr>
+              <w:spacing w:line="259" w:lineRule="auto"/>
+              <w:rPr>
+                <w:sz w:val="20"/>
+                <w:szCs w:val="20"/>
+              </w:rPr>
+            </w:pPr>
+            <w:r>
+              <w:rPr>
+                <w:sz w:val="20"/>
+                <w:szCs w:val="20"/>
+              </w:rPr>
+              <w:t>M, E</w:t>
+            </w:r>
+          </w:p>
+        </w:tc>
+        <w:tc>
+          <w:tcPr>
+            <w:tcW w:w="1897" w:type="pct"/>
+          </w:tcPr>
+          <w:p>
+            <w:pPr>
+              <w:spacing w:line="259" w:lineRule="auto"/>
+              <w:rPr>
+                <w:sz w:val="20"/>
+                <w:szCs w:val="20"/>
+              </w:rPr>
+            </w:pPr>
+            <w:r>
+              <w:rPr>
+                <w:sz w:val="20"/>
+                <w:szCs w:val="20"/>
+              </w:rPr>
+              <w:t>500 caracteres</w:t>
+            </w:r>
+          </w:p>
+        </w:tc>
+      </w:tr>
+      <w:tr>
+        <w:trPr>
+          <w:trHeight w:val="300"/>
+        </w:trPr>
+        <w:tc>
+          <w:tcPr>
+            <w:tcW w:w="755" w:type="pct"/>
+            <w:tcMar>
+              <w:top w:w="40" w:type="dxa"/>
+              <w:left w:w="80" w:type="dxa"/>
+              <w:bottom w:w="40" w:type="dxa"/>
+              <w:right w:w="80" w:type="dxa"/>
+            </w:tcMar>
+            <w:vAlign w:val="center"/>
+          </w:tcPr>
+          <w:p>
+            <w:pPr>
+              <w:spacing w:line="259" w:lineRule="auto"/>
+              <w:rPr>
+                <w:sz w:val="20"/>
+                <w:szCs w:val="20"/>
+              </w:rPr>
+            </w:pPr>
+            <w:r>
+              <w:rPr>
+                <w:sz w:val="20"/>
+                <w:szCs w:val="20"/>
+              </w:rPr>
+              <w:t xml:space="preserve">¿Aplica </w:t>
+            </w:r>
+            <w:r>
+              <w:rPr>
+                <w:sz w:val="20"/>
+                <w:szCs w:val="20"/>
+              </w:rPr>
+              <w:t>ampliación</w:t>
+            </w:r>
+            <w:r>
+              <w:rPr>
+                <w:sz w:val="20"/>
+                <w:szCs w:val="20"/>
+              </w:rPr>
+              <w:t>?</w:t>
+            </w:r>
+          </w:p>
+        </w:tc>
+        <w:tc>
+          <w:tcPr>
+            <w:tcW w:w="1065" w:type="pct"/>
+            <w:tcMar>
+              <w:top w:w="40" w:type="dxa"/>
+              <w:left w:w="80" w:type="dxa"/>
+              <w:bottom w:w="40" w:type="dxa"/>
+              <w:right w:w="80" w:type="dxa"/>
+            </w:tcMar>
+            <w:vAlign w:val="center"/>
+          </w:tcPr>
+          <w:p>
+            <w:pPr>
+              <w:spacing w:line="259" w:lineRule="auto"/>
+              <w:rPr>
+                <w:sz w:val="20"/>
+                <w:szCs w:val="20"/>
+              </w:rPr>
+            </w:pPr>
+            <w:r>
+              <w:rPr>
+                <w:sz w:val="20"/>
+                <w:szCs w:val="20"/>
+              </w:rPr>
+              <w:t>Si/No</w:t>
+            </w:r>
+          </w:p>
+        </w:tc>
+        <w:tc>
+          <w:tcPr>
+            <w:tcW w:w="1283" w:type="pct"/>
+          </w:tcPr>
+          <w:p>
+            <w:pPr>
+              <w:spacing w:line="259" w:lineRule="auto"/>
+              <w:rPr>
+                <w:sz w:val="20"/>
+                <w:szCs w:val="20"/>
+              </w:rPr>
+            </w:pPr>
+            <w:r>
+              <w:rPr>
+                <w:sz w:val="20"/>
+                <w:szCs w:val="20"/>
+              </w:rPr>
+              <w:t>O</w:t>
+            </w:r>
+          </w:p>
+        </w:tc>
+        <w:tc>
+          <w:tcPr>
+            <w:tcW w:w="1897" w:type="pct"/>
+          </w:tcPr>
+          <w:p>
+            <w:pPr>
+              <w:spacing w:line="259" w:lineRule="auto"/>
+              <w:rPr>
+                <w:sz w:val="20"/>
+                <w:szCs w:val="20"/>
+              </w:rPr>
+            </w:pPr>
+            <w:r>
+              <w:rPr>
+                <w:sz w:val="20"/>
+                <w:szCs w:val="20"/>
+              </w:rPr>
+              <w:t>Botón</w:t>
+            </w:r>
+            <w:r>
+              <w:rPr>
+                <w:sz w:val="20"/>
+                <w:szCs w:val="20"/>
+              </w:rPr>
+              <w:t xml:space="preserve"> Si</w:t>
+            </w:r>
+            <w:r>
+              <w:rPr>
+                <w:sz w:val="20"/>
+                <w:szCs w:val="20"/>
+              </w:rPr>
+              <w:t>/No</w:t>
             </w:r>
           </w:p>
         </w:tc>
@@ -10598,7 +12588,21 @@
                 <w:sz w:val="20"/>
                 <w:szCs w:val="20"/>
               </w:rPr>
-              <w:t>El caso fue procesado exitosamente.</w:t>
+              <w:t xml:space="preserve">El caso fue </w:t>
+            </w:r>
+            <w:r>
+              <w:rPr>
+                <w:sz w:val="20"/>
+                <w:szCs w:val="20"/>
+              </w:rPr>
+              <w:t>asignado</w:t>
+            </w:r>
+            <w:r>
+              <w:rPr>
+                <w:sz w:val="20"/>
+                <w:szCs w:val="20"/>
+              </w:rPr>
+              <w:t xml:space="preserve"> exitosamente.</w:t>
             </w:r>
           </w:p>
         </w:tc>
@@ -11107,27 +13111,7 @@
                 <w:szCs w:val="20"/>
                 <w:shd w:val="clear" w:color="auto" w:fill="FFFFFF"/>
               </w:rPr>
-              <w:t xml:space="preserve">Consulta realizada correctamente. A </w:t>
-            </w:r>
-            <w:proofErr w:type="gramStart"/>
-            <w:r>
-              <w:rPr>
-                <w:color w:val="000000"/>
-                <w:sz w:val="20"/>
-                <w:szCs w:val="20"/>
-                <w:shd w:val="clear" w:color="auto" w:fill="FFFFFF"/>
-              </w:rPr>
-              <w:t>continuación</w:t>
-            </w:r>
-            <w:proofErr w:type="gramEnd"/>
-            <w:r>
-              <w:rPr>
-                <w:color w:val="000000"/>
-                <w:sz w:val="20"/>
-                <w:szCs w:val="20"/>
-                <w:shd w:val="clear" w:color="auto" w:fill="FFFFFF"/>
-              </w:rPr>
-              <w:t xml:space="preserve"> se muestra el estado actual de su caso.</w:t>
+              <w:t>Consulta realizada correctamente. A continuación se muestra el estado actual de su caso.</w:t>
             </w:r>
           </w:p>
         </w:tc>
@@ -11337,7 +13321,6 @@
                 <w:sz w:val="20"/>
                 <w:szCs w:val="20"/>
               </w:rPr>
-              <w:lastRenderedPageBreak/>
               <w:t>2</w:t>
             </w:r>
           </w:p>
@@ -11681,6 +13664,7 @@
                 <w:sz w:val="20"/>
                 <w:szCs w:val="20"/>
               </w:rPr>
+              <w:lastRenderedPageBreak/>
               <w:t>8</w:t>
             </w:r>
           </w:p>
@@ -13677,7 +15661,6 @@
                 <w:sz w:val="20"/>
                 <w:szCs w:val="20"/>
               </w:rPr>
-              <w:lastRenderedPageBreak/>
               <w:t>No.</w:t>
             </w:r>
           </w:p>
@@ -13913,6 +15896,7 @@
           <w:sz w:val="20"/>
           <w:szCs w:val="20"/>
         </w:rPr>
+        <w:lastRenderedPageBreak/>
         <w:t># 1</w:t>
       </w:r>
       <w:r>
@@ -14045,33 +16029,8 @@
                 <w:sz w:val="20"/>
                 <w:szCs w:val="20"/>
               </w:rPr>
-              <w:t xml:space="preserve">Caso No. </w:t>
-            </w:r>
-            <w:proofErr w:type="spellStart"/>
-            <w:r>
-              <w:rPr>
-                <w:sz w:val="20"/>
-                <w:szCs w:val="20"/>
-              </w:rPr>
-              <w:t>numeroCaso</w:t>
-            </w:r>
-            <w:proofErr w:type="spellEnd"/>
-            <w:r>
-              <w:rPr>
-                <w:sz w:val="20"/>
-                <w:szCs w:val="20"/>
-              </w:rPr>
-              <w:t xml:space="preserve"> — Código de seguimiento: </w:t>
-            </w:r>
-            <w:proofErr w:type="spellStart"/>
-            <w:r>
-              <w:rPr>
-                <w:sz w:val="20"/>
-                <w:szCs w:val="20"/>
-              </w:rPr>
-              <w:t>codigoSeguimiento</w:t>
-            </w:r>
-            <w:proofErr w:type="spellEnd"/>
+              <w:t>Caso No. numeroCaso — Código de seguimiento: codigoSeguimiento</w:t>
+            </w:r>
           </w:p>
           <w:p>
             <w:pPr>
@@ -14086,17 +16045,8 @@
                 <w:sz w:val="20"/>
                 <w:szCs w:val="20"/>
               </w:rPr>
-              <w:t xml:space="preserve">Fecha de registro: </w:t>
-            </w:r>
-            <w:proofErr w:type="spellStart"/>
-            <w:r>
-              <w:rPr>
-                <w:sz w:val="20"/>
-                <w:szCs w:val="20"/>
-              </w:rPr>
-              <w:t>fechaRegistro</w:t>
-            </w:r>
-            <w:proofErr w:type="spellEnd"/>
+              <w:t>Fecha de registro: fechaRegistro</w:t>
+            </w:r>
           </w:p>
           <w:p>
             <w:pPr>
@@ -14111,33 +16061,8 @@
                 <w:sz w:val="20"/>
                 <w:szCs w:val="20"/>
               </w:rPr>
-              <w:t xml:space="preserve">Tipo de caso: </w:t>
-            </w:r>
-            <w:proofErr w:type="spellStart"/>
-            <w:r>
-              <w:rPr>
-                <w:sz w:val="20"/>
-                <w:szCs w:val="20"/>
-              </w:rPr>
-              <w:t>tipoCaso</w:t>
-            </w:r>
-            <w:proofErr w:type="spellEnd"/>
-            <w:r>
-              <w:rPr>
-                <w:sz w:val="20"/>
-                <w:szCs w:val="20"/>
-              </w:rPr>
-              <w:t xml:space="preserve">     Categoría: </w:t>
-            </w:r>
-            <w:proofErr w:type="spellStart"/>
-            <w:r>
-              <w:rPr>
-                <w:sz w:val="20"/>
-                <w:szCs w:val="20"/>
-              </w:rPr>
-              <w:t>categoriaProblema</w:t>
-            </w:r>
-            <w:proofErr w:type="spellEnd"/>
+              <w:t>Tipo de caso: tipoCaso     Categoría: categoriaProblema</w:t>
+            </w:r>
           </w:p>
           <w:p>
             <w:pPr>
@@ -14152,17 +16077,8 @@
                 <w:sz w:val="20"/>
                 <w:szCs w:val="20"/>
               </w:rPr>
-              <w:t xml:space="preserve">Ciudadano: </w:t>
-            </w:r>
-            <w:proofErr w:type="spellStart"/>
-            <w:r>
-              <w:rPr>
-                <w:sz w:val="20"/>
-                <w:szCs w:val="20"/>
-              </w:rPr>
-              <w:t>nombreCiudadano</w:t>
-            </w:r>
-            <w:proofErr w:type="spellEnd"/>
+              <w:t>Ciudadano: nombreCiudadano</w:t>
+            </w:r>
           </w:p>
           <w:p>
             <w:pPr>
@@ -14177,17 +16093,8 @@
                 <w:sz w:val="20"/>
                 <w:szCs w:val="20"/>
               </w:rPr>
-              <w:t xml:space="preserve">Departamento responsable: </w:t>
-            </w:r>
-            <w:proofErr w:type="spellStart"/>
-            <w:r>
-              <w:rPr>
-                <w:sz w:val="20"/>
-                <w:szCs w:val="20"/>
-              </w:rPr>
-              <w:t>departamentoResponsable</w:t>
-            </w:r>
-            <w:proofErr w:type="spellEnd"/>
+              <w:t>Departamento responsable: departamentoResponsable</w:t>
+            </w:r>
           </w:p>
           <w:p>
             <w:pPr>
@@ -14211,55 +16118,7 @@
                 <w:sz w:val="20"/>
                 <w:szCs w:val="20"/>
               </w:rPr>
-              <w:t xml:space="preserve">El caso fue revisado por el Auxiliar </w:t>
-            </w:r>
-            <w:proofErr w:type="spellStart"/>
-            <w:r>
-              <w:rPr>
-                <w:sz w:val="20"/>
-                <w:szCs w:val="20"/>
-              </w:rPr>
-              <w:t>nombreAuxiliar</w:t>
-            </w:r>
-            <w:proofErr w:type="spellEnd"/>
-            <w:r>
-              <w:rPr>
-                <w:sz w:val="20"/>
-                <w:szCs w:val="20"/>
-              </w:rPr>
-              <w:t xml:space="preserve"> el </w:t>
-            </w:r>
-            <w:proofErr w:type="spellStart"/>
-            <w:r>
-              <w:rPr>
-                <w:sz w:val="20"/>
-                <w:szCs w:val="20"/>
-              </w:rPr>
-              <w:t>fechaRevision</w:t>
-            </w:r>
-            <w:proofErr w:type="spellEnd"/>
-            <w:r>
-              <w:rPr>
-                <w:sz w:val="20"/>
-                <w:szCs w:val="20"/>
-              </w:rPr>
-              <w:t xml:space="preserve">, con el siguiente resultado: </w:t>
-            </w:r>
-            <w:proofErr w:type="spellStart"/>
-            <w:r>
-              <w:rPr>
-                <w:sz w:val="20"/>
-                <w:szCs w:val="20"/>
-              </w:rPr>
-              <w:t>decisionAuxiliar</w:t>
-            </w:r>
-            <w:proofErr w:type="spellEnd"/>
-            <w:r>
-              <w:rPr>
-                <w:sz w:val="20"/>
-                <w:szCs w:val="20"/>
-              </w:rPr>
-              <w:t>.</w:t>
+              <w:t>El caso fue revisado por el Auxiliar nombreAuxiliar el fechaRevision, con el siguiente resultado: decisionAuxiliar.</w:t>
             </w:r>
           </w:p>
           <w:p>
@@ -14284,17 +16143,8 @@
                 <w:sz w:val="20"/>
                 <w:szCs w:val="20"/>
               </w:rPr>
-              <w:t xml:space="preserve">Motivo de rechazo: </w:t>
-            </w:r>
-            <w:proofErr w:type="spellStart"/>
-            <w:r>
-              <w:rPr>
-                <w:sz w:val="20"/>
-                <w:szCs w:val="20"/>
-              </w:rPr>
-              <w:t>motivoRechazo</w:t>
-            </w:r>
-            <w:proofErr w:type="spellEnd"/>
+              <w:t>Motivo de rechazo: motivoRechazo</w:t>
+            </w:r>
           </w:p>
           <w:p>
             <w:pPr>
@@ -14309,17 +16159,8 @@
                 <w:sz w:val="20"/>
                 <w:szCs w:val="20"/>
               </w:rPr>
-              <w:t xml:space="preserve">Instrucciones de ampliación: </w:t>
-            </w:r>
-            <w:proofErr w:type="spellStart"/>
-            <w:r>
-              <w:rPr>
-                <w:sz w:val="20"/>
-                <w:szCs w:val="20"/>
-              </w:rPr>
-              <w:t>instruccionesAmpliacion</w:t>
-            </w:r>
-            <w:proofErr w:type="spellEnd"/>
+              <w:t>Instrucciones de ampliación: instruccionesAmpliacion</w:t>
+            </w:r>
           </w:p>
           <w:p>
             <w:pPr>
@@ -14334,17 +16175,8 @@
                 <w:sz w:val="20"/>
                 <w:szCs w:val="20"/>
               </w:rPr>
-              <w:t xml:space="preserve">Observaciones: </w:t>
-            </w:r>
-            <w:proofErr w:type="spellStart"/>
-            <w:r>
-              <w:rPr>
-                <w:sz w:val="20"/>
-                <w:szCs w:val="20"/>
-              </w:rPr>
-              <w:t>observacionesAuxiliar</w:t>
-            </w:r>
-            <w:proofErr w:type="spellEnd"/>
+              <w:t>Observaciones: observacionesAuxiliar</w:t>
+            </w:r>
           </w:p>
         </w:tc>
       </w:tr>
@@ -14414,7 +16246,6 @@
                 <w:szCs w:val="20"/>
               </w:rPr>
             </w:pPr>
-            <w:proofErr w:type="spellStart"/>
             <w:r>
               <w:rPr>
                 <w:sz w:val="20"/>
@@ -14422,7 +16253,6 @@
               </w:rPr>
               <w:t>numeroCaso</w:t>
             </w:r>
-            <w:proofErr w:type="spellEnd"/>
           </w:p>
         </w:tc>
         <w:tc>
@@ -14458,7 +16288,6 @@
                 <w:szCs w:val="20"/>
               </w:rPr>
             </w:pPr>
-            <w:proofErr w:type="spellStart"/>
             <w:r>
               <w:rPr>
                 <w:sz w:val="20"/>
@@ -14466,7 +16295,6 @@
               </w:rPr>
               <w:t>codigoSeguimiento</w:t>
             </w:r>
-            <w:proofErr w:type="spellEnd"/>
           </w:p>
         </w:tc>
         <w:tc>
@@ -14502,7 +16330,6 @@
                 <w:szCs w:val="20"/>
               </w:rPr>
             </w:pPr>
-            <w:proofErr w:type="spellStart"/>
             <w:r>
               <w:rPr>
                 <w:sz w:val="20"/>
@@ -14510,7 +16337,6 @@
               </w:rPr>
               <w:t>fechaRegistro</w:t>
             </w:r>
-            <w:proofErr w:type="spellEnd"/>
           </w:p>
         </w:tc>
         <w:tc>
@@ -14546,7 +16372,6 @@
                 <w:szCs w:val="20"/>
               </w:rPr>
             </w:pPr>
-            <w:proofErr w:type="spellStart"/>
             <w:r>
               <w:rPr>
                 <w:sz w:val="20"/>
@@ -14554,7 +16379,6 @@
               </w:rPr>
               <w:t>tipoCaso</w:t>
             </w:r>
-            <w:proofErr w:type="spellEnd"/>
           </w:p>
         </w:tc>
         <w:tc>
@@ -14590,7 +16414,6 @@
                 <w:szCs w:val="20"/>
               </w:rPr>
             </w:pPr>
-            <w:proofErr w:type="spellStart"/>
             <w:r>
               <w:rPr>
                 <w:sz w:val="20"/>
@@ -14598,7 +16421,6 @@
               </w:rPr>
               <w:t>categoriaProblema</w:t>
             </w:r>
-            <w:proofErr w:type="spellEnd"/>
           </w:p>
         </w:tc>
         <w:tc>
@@ -14634,7 +16456,6 @@
                 <w:szCs w:val="20"/>
               </w:rPr>
             </w:pPr>
-            <w:proofErr w:type="spellStart"/>
             <w:r>
               <w:rPr>
                 <w:sz w:val="20"/>
@@ -14642,7 +16463,6 @@
               </w:rPr>
               <w:t>nombreCiudadano</w:t>
             </w:r>
-            <w:proofErr w:type="spellEnd"/>
           </w:p>
         </w:tc>
         <w:tc>
@@ -14678,7 +16498,6 @@
                 <w:szCs w:val="20"/>
               </w:rPr>
             </w:pPr>
-            <w:proofErr w:type="spellStart"/>
             <w:r>
               <w:rPr>
                 <w:sz w:val="20"/>
@@ -14686,7 +16505,6 @@
               </w:rPr>
               <w:t>departamentoResponsable</w:t>
             </w:r>
-            <w:proofErr w:type="spellEnd"/>
           </w:p>
         </w:tc>
         <w:tc>
@@ -14722,7 +16540,6 @@
                 <w:szCs w:val="20"/>
               </w:rPr>
             </w:pPr>
-            <w:proofErr w:type="spellStart"/>
             <w:r>
               <w:rPr>
                 <w:sz w:val="20"/>
@@ -14730,7 +16547,6 @@
               </w:rPr>
               <w:t>nombreAuxiliar</w:t>
             </w:r>
-            <w:proofErr w:type="spellEnd"/>
           </w:p>
         </w:tc>
         <w:tc>
@@ -14766,7 +16582,6 @@
                 <w:szCs w:val="20"/>
               </w:rPr>
             </w:pPr>
-            <w:proofErr w:type="spellStart"/>
             <w:r>
               <w:rPr>
                 <w:sz w:val="20"/>
@@ -14774,7 +16589,6 @@
               </w:rPr>
               <w:t>fechaRevision</w:t>
             </w:r>
-            <w:proofErr w:type="spellEnd"/>
           </w:p>
         </w:tc>
         <w:tc>
@@ -14810,7 +16624,6 @@
                 <w:szCs w:val="20"/>
               </w:rPr>
             </w:pPr>
-            <w:proofErr w:type="spellStart"/>
             <w:r>
               <w:rPr>
                 <w:sz w:val="20"/>
@@ -14818,7 +16631,6 @@
               </w:rPr>
               <w:t>decisionAuxiliar</w:t>
             </w:r>
-            <w:proofErr w:type="spellEnd"/>
           </w:p>
         </w:tc>
         <w:tc>
@@ -14854,7 +16666,6 @@
                 <w:szCs w:val="20"/>
               </w:rPr>
             </w:pPr>
-            <w:proofErr w:type="spellStart"/>
             <w:r>
               <w:rPr>
                 <w:sz w:val="20"/>
@@ -14862,7 +16673,6 @@
               </w:rPr>
               <w:t>motivoRechazo</w:t>
             </w:r>
-            <w:proofErr w:type="spellEnd"/>
           </w:p>
         </w:tc>
         <w:tc>
@@ -14881,23 +16691,7 @@
                 <w:sz w:val="20"/>
                 <w:szCs w:val="20"/>
               </w:rPr>
-              <w:t xml:space="preserve">Catálogo de Motivos de Rechazo (RN-GLOBAL-07); solo si </w:t>
-            </w:r>
-            <w:proofErr w:type="spellStart"/>
-            <w:r>
-              <w:rPr>
-                <w:sz w:val="20"/>
-                <w:szCs w:val="20"/>
-              </w:rPr>
-              <w:t>decisionAuxiliar</w:t>
-            </w:r>
-            <w:proofErr w:type="spellEnd"/>
-            <w:r>
-              <w:rPr>
-                <w:sz w:val="20"/>
-                <w:szCs w:val="20"/>
-              </w:rPr>
-              <w:t xml:space="preserve"> = Rechazado</w:t>
+              <w:t>Catálogo de Motivos de Rechazo (RN-GLOBAL-07); solo si decisionAuxiliar = Rechazado</w:t>
             </w:r>
           </w:p>
         </w:tc>
@@ -14914,7 +16708,6 @@
                 <w:szCs w:val="20"/>
               </w:rPr>
             </w:pPr>
-            <w:proofErr w:type="spellStart"/>
             <w:r>
               <w:rPr>
                 <w:sz w:val="20"/>
@@ -14922,7 +16715,6 @@
               </w:rPr>
               <w:t>instruccionesAmpliacion</w:t>
             </w:r>
-            <w:proofErr w:type="spellEnd"/>
           </w:p>
         </w:tc>
         <w:tc>
@@ -14941,23 +16733,7 @@
                 <w:sz w:val="20"/>
                 <w:szCs w:val="20"/>
               </w:rPr>
-              <w:t xml:space="preserve">Solo si </w:t>
-            </w:r>
-            <w:proofErr w:type="spellStart"/>
-            <w:r>
-              <w:rPr>
-                <w:sz w:val="20"/>
-                <w:szCs w:val="20"/>
-              </w:rPr>
-              <w:t>motivoRechazo</w:t>
-            </w:r>
-            <w:proofErr w:type="spellEnd"/>
-            <w:r>
-              <w:rPr>
-                <w:sz w:val="20"/>
-                <w:szCs w:val="20"/>
-              </w:rPr>
-              <w:t xml:space="preserve"> = Información incompleta (RN-CU04-05)</w:t>
+              <w:t>Solo si motivoRechazo = Información incompleta (RN-CU04-05)</w:t>
             </w:r>
           </w:p>
         </w:tc>
@@ -14974,7 +16750,6 @@
                 <w:szCs w:val="20"/>
               </w:rPr>
             </w:pPr>
-            <w:proofErr w:type="spellStart"/>
             <w:r>
               <w:rPr>
                 <w:sz w:val="20"/>
@@ -14982,7 +16757,6 @@
               </w:rPr>
               <w:t>observacionesAuxiliar</w:t>
             </w:r>
-            <w:proofErr w:type="spellEnd"/>
           </w:p>
         </w:tc>
         <w:tc>
@@ -15090,7 +16864,7 @@
 </file>
 
 <file path=word/endnotes.xml><?xml version="1.0" encoding="utf-8"?>
-<w:endnotes xmlns:wpc="http://schemas.microsoft.com/office/word/2010/wordprocessingCanvas" xmlns:cx="http://schemas.microsoft.com/office/drawing/2014/chartex" xmlns:cx1="http://schemas.microsoft.com/office/drawing/2015/9/8/chartex" xmlns:cx2="http://schemas.microsoft.com/office/drawing/2015/10/21/chartex" xmlns:cx3="http://schemas.microsoft.com/office/drawing/2016/5/9/chartex" xmlns:cx4="http://schemas.microsoft.com/office/drawing/2016/5/10/chartex" xmlns:cx5="http://schemas.microsoft.com/office/drawing/2016/5/11/chartex" xmlns:cx6="http://schemas.microsoft.com/office/drawing/2016/5/12/chartex" xmlns:cx7="http://schemas.microsoft.com/office/drawing/2016/5/13/chartex" xmlns:cx8="http://schemas.microsoft.com/office/drawing/2016/5/14/chartex" xmlns:mc="http://schemas.openxmlformats.org/markup-compatibility/2006" xmlns:aink="http://schemas.microsoft.com/office/drawing/2016/ink" xmlns:am3d="http://schemas.microsoft.com/office/drawing/2017/model3d" xmlns:o="urn:schemas-microsoft-com:office:office" xmlns:r="http://schemas.openxmlformats.org/officeDocument/2006/relationships" xmlns:m="http://schemas.openxmlformats.org/officeDocument/2006/math" xmlns:v="urn:schemas-microsoft-com:vml" xmlns:wp14="http://schemas.microsoft.com/office/word/2010/wordprocessingDrawing" xmlns:wp="http://schemas.openxmlformats.org/drawingml/2006/wordprocessingDrawing" xmlns:w10="urn:schemas-microsoft-com:office:word" xmlns:w="http://schemas.openxmlformats.org/wordprocessingml/2006/main" xmlns:w14="http://schemas.microsoft.com/office/word/2010/wordml" xmlns:w15="http://schemas.microsoft.com/office/word/2012/wordml" xmlns:w16cex="http://schemas.microsoft.com/office/word/2018/wordml/cex" xmlns:w16cid="http://schemas.microsoft.com/office/word/2016/wordml/cid" xmlns:w16="http://schemas.microsoft.com/office/word/2018/wordml" xmlns:w16sdtdh="http://schemas.microsoft.com/office/word/2020/wordml/sdtdatahash" xmlns:w16se="http://schemas.microsoft.com/office/word/2015/wordml/symex" xmlns:wpg="http://schemas.microsoft.com/office/word/2010/wordprocessingGroup" xmlns:wpi="http://schemas.microsoft.com/office/word/2010/wordprocessingInk" xmlns:wne="http://schemas.microsoft.com/office/word/2006/wordml" xmlns:wps="http://schemas.microsoft.com/office/word/2010/wordprocessingShape" mc:Ignorable="w14 w15 w16se w16cid w16 w16cex w16sdtdh wp14">
+<w:endnotes xmlns:wpc="http://schemas.microsoft.com/office/word/2010/wordprocessingCanvas" xmlns:cx="http://schemas.microsoft.com/office/drawing/2014/chartex" xmlns:cx1="http://schemas.microsoft.com/office/drawing/2015/9/8/chartex" xmlns:cx2="http://schemas.microsoft.com/office/drawing/2015/10/21/chartex" xmlns:cx3="http://schemas.microsoft.com/office/drawing/2016/5/9/chartex" xmlns:cx4="http://schemas.microsoft.com/office/drawing/2016/5/10/chartex" xmlns:cx5="http://schemas.microsoft.com/office/drawing/2016/5/11/chartex" xmlns:cx6="http://schemas.microsoft.com/office/drawing/2016/5/12/chartex" xmlns:cx7="http://schemas.microsoft.com/office/drawing/2016/5/13/chartex" xmlns:cx8="http://schemas.microsoft.com/office/drawing/2016/5/14/chartex" xmlns:mc="http://schemas.openxmlformats.org/markup-compatibility/2006" xmlns:aink="http://schemas.microsoft.com/office/drawing/2016/ink" xmlns:am3d="http://schemas.microsoft.com/office/drawing/2017/model3d" xmlns:o="urn:schemas-microsoft-com:office:office" xmlns:oel="http://schemas.microsoft.com/office/2019/extlst" xmlns:r="http://schemas.openxmlformats.org/officeDocument/2006/relationships" xmlns:m="http://schemas.openxmlformats.org/officeDocument/2006/math" xmlns:v="urn:schemas-microsoft-com:vml" xmlns:wp14="http://schemas.microsoft.com/office/word/2010/wordprocessingDrawing" xmlns:wp="http://schemas.openxmlformats.org/drawingml/2006/wordprocessingDrawing" xmlns:w10="urn:schemas-microsoft-com:office:word" xmlns:w="http://schemas.openxmlformats.org/wordprocessingml/2006/main" xmlns:w14="http://schemas.microsoft.com/office/word/2010/wordml" xmlns:w15="http://schemas.microsoft.com/office/word/2012/wordml" xmlns:w16cex="http://schemas.microsoft.com/office/word/2018/wordml/cex" xmlns:w16cid="http://schemas.microsoft.com/office/word/2016/wordml/cid" xmlns:w16="http://schemas.microsoft.com/office/word/2018/wordml" xmlns:w16du="http://schemas.microsoft.com/office/word/2023/wordml/word16du" xmlns:w16sdtdh="http://schemas.microsoft.com/office/word/2020/wordml/sdtdatahash" xmlns:w16sdtfl="http://schemas.microsoft.com/office/word/2024/wordml/sdtformatlock" xmlns:w16se="http://schemas.microsoft.com/office/word/2015/wordml/symex" xmlns:wpg="http://schemas.microsoft.com/office/word/2010/wordprocessingGroup" xmlns:wpi="http://schemas.microsoft.com/office/word/2010/wordprocessingInk" xmlns:wne="http://schemas.microsoft.com/office/word/2006/wordml" xmlns:wps="http://schemas.microsoft.com/office/word/2010/wordprocessingShape" mc:Ignorable="w14 w15 w16se w16cid w16 w16cex w16sdtdh w16sdtfl w16du wp14">
   <w:endnote w:type="separator" w:id="-1">
     <w:p>
       <w:r>
@@ -15109,7 +16883,7 @@
 </file>
 
 <file path=word/footnotes.xml><?xml version="1.0" encoding="utf-8"?>
-<w:footnotes xmlns:wpc="http://schemas.microsoft.com/office/word/2010/wordprocessingCanvas" xmlns:cx="http://schemas.microsoft.com/office/drawing/2014/chartex" xmlns:cx1="http://schemas.microsoft.com/office/drawing/2015/9/8/chartex" xmlns:cx2="http://schemas.microsoft.com/office/drawing/2015/10/21/chartex" xmlns:cx3="http://schemas.microsoft.com/office/drawing/2016/5/9/chartex" xmlns:cx4="http://schemas.microsoft.com/office/drawing/2016/5/10/chartex" xmlns:cx5="http://schemas.microsoft.com/office/drawing/2016/5/11/chartex" xmlns:cx6="http://schemas.microsoft.com/office/drawing/2016/5/12/chartex" xmlns:cx7="http://schemas.microsoft.com/office/drawing/2016/5/13/chartex" xmlns:cx8="http://schemas.microsoft.com/office/drawing/2016/5/14/chartex" xmlns:mc="http://schemas.openxmlformats.org/markup-compatibility/2006" xmlns:aink="http://schemas.microsoft.com/office/drawing/2016/ink" xmlns:am3d="http://schemas.microsoft.com/office/drawing/2017/model3d" xmlns:o="urn:schemas-microsoft-com:office:office" xmlns:r="http://schemas.openxmlformats.org/officeDocument/2006/relationships" xmlns:m="http://schemas.openxmlformats.org/officeDocument/2006/math" xmlns:v="urn:schemas-microsoft-com:vml" xmlns:wp14="http://schemas.microsoft.com/office/word/2010/wordprocessingDrawing" xmlns:wp="http://schemas.openxmlformats.org/drawingml/2006/wordprocessingDrawing" xmlns:w10="urn:schemas-microsoft-com:office:word" xmlns:w="http://schemas.openxmlformats.org/wordprocessingml/2006/main" xmlns:w14="http://schemas.microsoft.com/office/word/2010/wordml" xmlns:w15="http://schemas.microsoft.com/office/word/2012/wordml" xmlns:w16cex="http://schemas.microsoft.com/office/word/2018/wordml/cex" xmlns:w16cid="http://schemas.microsoft.com/office/word/2016/wordml/cid" xmlns:w16="http://schemas.microsoft.com/office/word/2018/wordml" xmlns:w16sdtdh="http://schemas.microsoft.com/office/word/2020/wordml/sdtdatahash" xmlns:w16se="http://schemas.microsoft.com/office/word/2015/wordml/symex" xmlns:wpg="http://schemas.microsoft.com/office/word/2010/wordprocessingGroup" xmlns:wpi="http://schemas.microsoft.com/office/word/2010/wordprocessingInk" xmlns:wne="http://schemas.microsoft.com/office/word/2006/wordml" xmlns:wps="http://schemas.microsoft.com/office/word/2010/wordprocessingShape" mc:Ignorable="w14 w15 w16se w16cid w16 w16cex w16sdtdh wp14">
+<w:footnotes xmlns:wpc="http://schemas.microsoft.com/office/word/2010/wordprocessingCanvas" xmlns:cx="http://schemas.microsoft.com/office/drawing/2014/chartex" xmlns:cx1="http://schemas.microsoft.com/office/drawing/2015/9/8/chartex" xmlns:cx2="http://schemas.microsoft.com/office/drawing/2015/10/21/chartex" xmlns:cx3="http://schemas.microsoft.com/office/drawing/2016/5/9/chartex" xmlns:cx4="http://schemas.microsoft.com/office/drawing/2016/5/10/chartex" xmlns:cx5="http://schemas.microsoft.com/office/drawing/2016/5/11/chartex" xmlns:cx6="http://schemas.microsoft.com/office/drawing/2016/5/12/chartex" xmlns:cx7="http://schemas.microsoft.com/office/drawing/2016/5/13/chartex" xmlns:cx8="http://schemas.microsoft.com/office/drawing/2016/5/14/chartex" xmlns:mc="http://schemas.openxmlformats.org/markup-compatibility/2006" xmlns:aink="http://schemas.microsoft.com/office/drawing/2016/ink" xmlns:am3d="http://schemas.microsoft.com/office/drawing/2017/model3d" xmlns:o="urn:schemas-microsoft-com:office:office" xmlns:oel="http://schemas.microsoft.com/office/2019/extlst" xmlns:r="http://schemas.openxmlformats.org/officeDocument/2006/relationships" xmlns:m="http://schemas.openxmlformats.org/officeDocument/2006/math" xmlns:v="urn:schemas-microsoft-com:vml" xmlns:wp14="http://schemas.microsoft.com/office/word/2010/wordprocessingDrawing" xmlns:wp="http://schemas.openxmlformats.org/drawingml/2006/wordprocessingDrawing" xmlns:w10="urn:schemas-microsoft-com:office:word" xmlns:w="http://schemas.openxmlformats.org/wordprocessingml/2006/main" xmlns:w14="http://schemas.microsoft.com/office/word/2010/wordml" xmlns:w15="http://schemas.microsoft.com/office/word/2012/wordml" xmlns:w16cex="http://schemas.microsoft.com/office/word/2018/wordml/cex" xmlns:w16cid="http://schemas.microsoft.com/office/word/2016/wordml/cid" xmlns:w16="http://schemas.microsoft.com/office/word/2018/wordml" xmlns:w16du="http://schemas.microsoft.com/office/word/2023/wordml/word16du" xmlns:w16sdtdh="http://schemas.microsoft.com/office/word/2020/wordml/sdtdatahash" xmlns:w16sdtfl="http://schemas.microsoft.com/office/word/2024/wordml/sdtformatlock" xmlns:w16se="http://schemas.microsoft.com/office/word/2015/wordml/symex" xmlns:wpg="http://schemas.microsoft.com/office/word/2010/wordprocessingGroup" xmlns:wpi="http://schemas.microsoft.com/office/word/2010/wordprocessingInk" xmlns:wne="http://schemas.microsoft.com/office/word/2006/wordml" xmlns:wps="http://schemas.microsoft.com/office/word/2010/wordprocessingShape" mc:Ignorable="w14 w15 w16se w16cid w16 w16cex w16sdtdh w16sdtfl w16du wp14">
   <w:footnote w:type="separator" w:id="-1">
     <w:p>
       <w:r>
@@ -15128,7 +16902,7 @@
 </file>
 
 <file path=word/numbering.xml><?xml version="1.0" encoding="utf-8"?>
-<w:numbering xmlns:wpc="http://schemas.microsoft.com/office/word/2010/wordprocessingCanvas" xmlns:cx="http://schemas.microsoft.com/office/drawing/2014/chartex" xmlns:cx1="http://schemas.microsoft.com/office/drawing/2015/9/8/chartex" xmlns:cx2="http://schemas.microsoft.com/office/drawing/2015/10/21/chartex" xmlns:cx3="http://schemas.microsoft.com/office/drawing/2016/5/9/chartex" xmlns:cx4="http://schemas.microsoft.com/office/drawing/2016/5/10/chartex" xmlns:cx5="http://schemas.microsoft.com/office/drawing/2016/5/11/chartex" xmlns:cx6="http://schemas.microsoft.com/office/drawing/2016/5/12/chartex" xmlns:cx7="http://schemas.microsoft.com/office/drawing/2016/5/13/chartex" xmlns:cx8="http://schemas.microsoft.com/office/drawing/2016/5/14/chartex" xmlns:mc="http://schemas.openxmlformats.org/markup-compatibility/2006" xmlns:aink="http://schemas.microsoft.com/office/drawing/2016/ink" xmlns:am3d="http://schemas.microsoft.com/office/drawing/2017/model3d" xmlns:o="urn:schemas-microsoft-com:office:office" xmlns:r="http://schemas.openxmlformats.org/officeDocument/2006/relationships" xmlns:m="http://schemas.openxmlformats.org/officeDocument/2006/math" xmlns:v="urn:schemas-microsoft-com:vml" xmlns:wp14="http://schemas.microsoft.com/office/word/2010/wordprocessingDrawing" xmlns:wp="http://schemas.openxmlformats.org/drawingml/2006/wordprocessingDrawing" xmlns:w10="urn:schemas-microsoft-com:office:word" xmlns:w="http://schemas.openxmlformats.org/wordprocessingml/2006/main" xmlns:w14="http://schemas.microsoft.com/office/word/2010/wordml" xmlns:w15="http://schemas.microsoft.com/office/word/2012/wordml" xmlns:w16cex="http://schemas.microsoft.com/office/word/2018/wordml/cex" xmlns:w16cid="http://schemas.microsoft.com/office/word/2016/wordml/cid" xmlns:w16="http://schemas.microsoft.com/office/word/2018/wordml" xmlns:w16sdtdh="http://schemas.microsoft.com/office/word/2020/wordml/sdtdatahash" xmlns:w16se="http://schemas.microsoft.com/office/word/2015/wordml/symex" xmlns:wpg="http://schemas.microsoft.com/office/word/2010/wordprocessingGroup" xmlns:wpi="http://schemas.microsoft.com/office/word/2010/wordprocessingInk" xmlns:wne="http://schemas.microsoft.com/office/word/2006/wordml" xmlns:wps="http://schemas.microsoft.com/office/word/2010/wordprocessingShape" mc:Ignorable="w14 w15 w16se w16cid w16 w16cex w16sdtdh wp14">
+<w:numbering xmlns:wpc="http://schemas.microsoft.com/office/word/2010/wordprocessingCanvas" xmlns:cx="http://schemas.microsoft.com/office/drawing/2014/chartex" xmlns:cx1="http://schemas.microsoft.com/office/drawing/2015/9/8/chartex" xmlns:cx2="http://schemas.microsoft.com/office/drawing/2015/10/21/chartex" xmlns:cx3="http://schemas.microsoft.com/office/drawing/2016/5/9/chartex" xmlns:cx4="http://schemas.microsoft.com/office/drawing/2016/5/10/chartex" xmlns:cx5="http://schemas.microsoft.com/office/drawing/2016/5/11/chartex" xmlns:cx6="http://schemas.microsoft.com/office/drawing/2016/5/12/chartex" xmlns:cx7="http://schemas.microsoft.com/office/drawing/2016/5/13/chartex" xmlns:cx8="http://schemas.microsoft.com/office/drawing/2016/5/14/chartex" xmlns:mc="http://schemas.openxmlformats.org/markup-compatibility/2006" xmlns:aink="http://schemas.microsoft.com/office/drawing/2016/ink" xmlns:am3d="http://schemas.microsoft.com/office/drawing/2017/model3d" xmlns:o="urn:schemas-microsoft-com:office:office" xmlns:oel="http://schemas.microsoft.com/office/2019/extlst" xmlns:r="http://schemas.openxmlformats.org/officeDocument/2006/relationships" xmlns:m="http://schemas.openxmlformats.org/officeDocument/2006/math" xmlns:v="urn:schemas-microsoft-com:vml" xmlns:wp14="http://schemas.microsoft.com/office/word/2010/wordprocessingDrawing" xmlns:wp="http://schemas.openxmlformats.org/drawingml/2006/wordprocessingDrawing" xmlns:w10="urn:schemas-microsoft-com:office:word" xmlns:w="http://schemas.openxmlformats.org/wordprocessingml/2006/main" xmlns:w14="http://schemas.microsoft.com/office/word/2010/wordml" xmlns:w15="http://schemas.microsoft.com/office/word/2012/wordml" xmlns:w16cex="http://schemas.microsoft.com/office/word/2018/wordml/cex" xmlns:w16cid="http://schemas.microsoft.com/office/word/2016/wordml/cid" xmlns:w16="http://schemas.microsoft.com/office/word/2018/wordml" xmlns:w16du="http://schemas.microsoft.com/office/word/2023/wordml/word16du" xmlns:w16sdtdh="http://schemas.microsoft.com/office/word/2020/wordml/sdtdatahash" xmlns:w16sdtfl="http://schemas.microsoft.com/office/word/2024/wordml/sdtformatlock" xmlns:w16se="http://schemas.microsoft.com/office/word/2015/wordml/symex" xmlns:wpg="http://schemas.microsoft.com/office/word/2010/wordprocessingGroup" xmlns:wpi="http://schemas.microsoft.com/office/word/2010/wordprocessingInk" xmlns:wne="http://schemas.microsoft.com/office/word/2006/wordml" xmlns:wps="http://schemas.microsoft.com/office/word/2010/wordprocessingShape" mc:Ignorable="w14 w15 w16se w16cid w16 w16cex w16sdtdh w16sdtfl w16du wp14">
   <w:abstractNum w:abstractNumId="0" w15:restartNumberingAfterBreak="0">
     <w:nsid w:val="02F81A67"/>
     <w:multiLevelType w:val="multilevel"/>
@@ -15745,37 +17519,37 @@
       </w:rPr>
     </w:lvl>
   </w:abstractNum>
-  <w:num w:numId="1">
+  <w:num w:numId="1" w16cid:durableId="384918460">
     <w:abstractNumId w:val="6"/>
   </w:num>
-  <w:num w:numId="2">
+  <w:num w:numId="2" w16cid:durableId="1333800662">
     <w:abstractNumId w:val="1"/>
   </w:num>
-  <w:num w:numId="3">
+  <w:num w:numId="3" w16cid:durableId="1665624761">
     <w:abstractNumId w:val="0"/>
   </w:num>
-  <w:num w:numId="4">
+  <w:num w:numId="4" w16cid:durableId="1179809786">
     <w:abstractNumId w:val="5"/>
   </w:num>
-  <w:num w:numId="5">
+  <w:num w:numId="5" w16cid:durableId="2046248907">
     <w:abstractNumId w:val="4"/>
   </w:num>
-  <w:num w:numId="6">
+  <w:num w:numId="6" w16cid:durableId="1851681700">
     <w:abstractNumId w:val="3"/>
   </w:num>
-  <w:num w:numId="7">
+  <w:num w:numId="7" w16cid:durableId="1327127833">
     <w:abstractNumId w:val="2"/>
   </w:num>
 </w:numbering>
 </file>
 
 <file path=word/styles.xml><?xml version="1.0" encoding="utf-8"?>
-<w:styles xmlns:mc="http://schemas.openxmlformats.org/markup-compatibility/2006" xmlns:r="http://schemas.openxmlformats.org/officeDocument/2006/relationships" xmlns:w="http://schemas.openxmlformats.org/wordprocessingml/2006/main" xmlns:w14="http://schemas.microsoft.com/office/word/2010/wordml" xmlns:w15="http://schemas.microsoft.com/office/word/2012/wordml" xmlns:w16cex="http://schemas.microsoft.com/office/word/2018/wordml/cex" xmlns:w16cid="http://schemas.microsoft.com/office/word/2016/wordml/cid" xmlns:w16="http://schemas.microsoft.com/office/word/2018/wordml" xmlns:w16sdtdh="http://schemas.microsoft.com/office/word/2020/wordml/sdtdatahash" xmlns:w16se="http://schemas.microsoft.com/office/word/2015/wordml/symex" mc:Ignorable="w14 w15 w16se w16cid w16 w16cex w16sdtdh">
+<w:styles xmlns:mc="http://schemas.openxmlformats.org/markup-compatibility/2006" xmlns:r="http://schemas.openxmlformats.org/officeDocument/2006/relationships" xmlns:w="http://schemas.openxmlformats.org/wordprocessingml/2006/main" xmlns:w14="http://schemas.microsoft.com/office/word/2010/wordml" xmlns:w15="http://schemas.microsoft.com/office/word/2012/wordml" xmlns:w16cex="http://schemas.microsoft.com/office/word/2018/wordml/cex" xmlns:w16cid="http://schemas.microsoft.com/office/word/2016/wordml/cid" xmlns:w16="http://schemas.microsoft.com/office/word/2018/wordml" xmlns:w16du="http://schemas.microsoft.com/office/word/2023/wordml/word16du" xmlns:w16sdtdh="http://schemas.microsoft.com/office/word/2020/wordml/sdtdatahash" xmlns:w16sdtfl="http://schemas.microsoft.com/office/word/2024/wordml/sdtformatlock" xmlns:w16se="http://schemas.microsoft.com/office/word/2015/wordml/symex" mc:Ignorable="w14 w15 w16se w16cid w16 w16cex w16sdtdh w16sdtfl w16du">
   <w:docDefaults>
     <w:rPrDefault>
       <w:rPr>
         <w:rFonts w:ascii="Times New Roman" w:eastAsia="Times New Roman" w:hAnsi="Times New Roman" w:cs="Times New Roman"/>
-        <w:lang w:val="es-419" w:eastAsia="es-419" w:bidi="ar-SA"/>
+        <w:lang w:val="es-MX" w:eastAsia="es-MX" w:bidi="ar-SA"/>
       </w:rPr>
     </w:rPrDefault>
     <w:pPrDefault/>
@@ -16067,14 +17841,14 @@
   <w:style w:type="paragraph" w:default="1" w:styleId="Normal">
     <w:name w:val="Normal"/>
     <w:qFormat/>
-    <w:rsid w:val="00F9264B"/>
+    <w:rsid w:val="005A03D0"/>
     <w:rPr>
       <w:sz w:val="24"/>
       <w:szCs w:val="24"/>
       <w:lang w:val="es-ES" w:eastAsia="es-ES"/>
     </w:rPr>
   </w:style>
-  <w:style w:type="paragraph" w:styleId="Heading1">
+  <w:style w:type="paragraph" w:styleId="Ttulo1">
     <w:name w:val="heading 1"/>
     <w:basedOn w:val="Normal"/>
     <w:qFormat/>
@@ -16091,7 +17865,7 @@
       <w:szCs w:val="48"/>
     </w:rPr>
   </w:style>
-  <w:style w:type="paragraph" w:styleId="Heading2">
+  <w:style w:type="paragraph" w:styleId="Ttulo2">
     <w:name w:val="heading 2"/>
     <w:basedOn w:val="Normal"/>
     <w:qFormat/>
@@ -16107,13 +17881,13 @@
       <w:szCs w:val="36"/>
     </w:rPr>
   </w:style>
-  <w:style w:type="character" w:default="1" w:styleId="DefaultParagraphFont">
+  <w:style w:type="character" w:default="1" w:styleId="Fuentedeprrafopredeter">
     <w:name w:val="Default Paragraph Font"/>
     <w:uiPriority w:val="1"/>
     <w:semiHidden/>
     <w:unhideWhenUsed/>
   </w:style>
-  <w:style w:type="table" w:default="1" w:styleId="TableNormal">
+  <w:style w:type="table" w:default="1" w:styleId="Tablanormal">
     <w:name w:val="Normal Table"/>
     <w:uiPriority w:val="99"/>
     <w:semiHidden/>
@@ -16128,7 +17902,7 @@
       </w:tblCellMar>
     </w:tblPr>
   </w:style>
-  <w:style w:type="numbering" w:default="1" w:styleId="NoList">
+  <w:style w:type="numbering" w:default="1" w:styleId="Sinlista">
     <w:name w:val="No List"/>
     <w:uiPriority w:val="99"/>
     <w:semiHidden/>
@@ -16142,7 +17916,7 @@
       <w:spacing w:before="100" w:beforeAutospacing="1" w:after="100" w:afterAutospacing="1"/>
     </w:pPr>
   </w:style>
-  <w:style w:type="paragraph" w:styleId="TOC1">
+  <w:style w:type="paragraph" w:styleId="TDC1">
     <w:name w:val="toc 1"/>
     <w:basedOn w:val="Normal"/>
     <w:rsid w:val="000D097C"/>
@@ -16150,7 +17924,7 @@
       <w:spacing w:before="100" w:beforeAutospacing="1" w:after="100" w:afterAutospacing="1"/>
     </w:pPr>
   </w:style>
-  <w:style w:type="character" w:styleId="Hyperlink">
+  <w:style w:type="character" w:styleId="Hipervnculo">
     <w:name w:val="Hyperlink"/>
     <w:rsid w:val="000D097C"/>
     <w:rPr>
@@ -16158,7 +17932,7 @@
       <w:u w:val="single"/>
     </w:rPr>
   </w:style>
-  <w:style w:type="paragraph" w:styleId="TOC2">
+  <w:style w:type="paragraph" w:styleId="TDC2">
     <w:name w:val="toc 2"/>
     <w:basedOn w:val="Normal"/>
     <w:rsid w:val="000D097C"/>
@@ -16166,7 +17940,7 @@
       <w:spacing w:before="100" w:beforeAutospacing="1" w:after="100" w:afterAutospacing="1"/>
     </w:pPr>
   </w:style>
-  <w:style w:type="paragraph" w:styleId="BodyTextIndent3">
+  <w:style w:type="paragraph" w:styleId="Sangra3detindependiente">
     <w:name w:val="Body Text Indent 3"/>
     <w:basedOn w:val="Normal"/>
     <w:rsid w:val="000D097C"/>
@@ -16174,10 +17948,10 @@
       <w:spacing w:before="100" w:beforeAutospacing="1" w:after="100" w:afterAutospacing="1"/>
     </w:pPr>
   </w:style>
-  <w:style w:type="paragraph" w:styleId="Header">
+  <w:style w:type="paragraph" w:styleId="Encabezado">
     <w:name w:val="header"/>
     <w:basedOn w:val="Normal"/>
-    <w:link w:val="HeaderChar"/>
+    <w:link w:val="EncabezadoCar"/>
     <w:uiPriority w:val="99"/>
     <w:rsid w:val="000D097C"/>
     <w:pPr>
@@ -16194,16 +17968,16 @@
   </w:style>
   <w:style w:type="paragraph" w:customStyle="1" w:styleId="ByLine">
     <w:name w:val="ByLine"/>
-    <w:basedOn w:val="Title"/>
+    <w:basedOn w:val="Ttulo"/>
     <w:rsid w:val="00F6349F"/>
     <w:rPr>
       <w:sz w:val="28"/>
     </w:rPr>
   </w:style>
-  <w:style w:type="paragraph" w:styleId="Title">
+  <w:style w:type="paragraph" w:styleId="Ttulo">
     <w:name w:val="Title"/>
     <w:basedOn w:val="Normal"/>
-    <w:link w:val="TitleChar"/>
+    <w:link w:val="TtuloCar"/>
     <w:qFormat/>
     <w:rsid w:val="00F6349F"/>
     <w:pPr>
@@ -16219,9 +17993,9 @@
       <w:lang w:val="en-US" w:eastAsia="en-US"/>
     </w:rPr>
   </w:style>
-  <w:style w:type="character" w:customStyle="1" w:styleId="TitleChar">
-    <w:name w:val="Title Char"/>
-    <w:link w:val="Title"/>
+  <w:style w:type="character" w:customStyle="1" w:styleId="TtuloCar">
+    <w:name w:val="Título Car"/>
+    <w:link w:val="Ttulo"/>
     <w:rsid w:val="00F6349F"/>
     <w:rPr>
       <w:rFonts w:ascii="Arial" w:hAnsi="Arial"/>
@@ -16248,12 +18022,12 @@
       <w:lang w:val="en-US" w:eastAsia="en-US"/>
     </w:rPr>
   </w:style>
-  <w:style w:type="character" w:styleId="LineNumber">
+  <w:style w:type="character" w:styleId="Nmerodelnea">
     <w:name w:val="line number"/>
-    <w:basedOn w:val="DefaultParagraphFont"/>
+    <w:basedOn w:val="Fuentedeprrafopredeter"/>
     <w:rsid w:val="008F2F81"/>
   </w:style>
-  <w:style w:type="paragraph" w:styleId="ListParagraph">
+  <w:style w:type="paragraph" w:styleId="Prrafodelista">
     <w:name w:val="List Paragraph"/>
     <w:basedOn w:val="Normal"/>
     <w:uiPriority w:val="34"/>
@@ -16263,10 +18037,10 @@
       <w:ind w:left="708"/>
     </w:pPr>
   </w:style>
-  <w:style w:type="paragraph" w:styleId="Footer">
+  <w:style w:type="paragraph" w:styleId="Piedepgina">
     <w:name w:val="footer"/>
     <w:basedOn w:val="Normal"/>
-    <w:link w:val="FooterChar"/>
+    <w:link w:val="PiedepginaCar"/>
     <w:uiPriority w:val="99"/>
     <w:rsid w:val="00344F2B"/>
     <w:pPr>
@@ -16276,9 +18050,9 @@
       </w:tabs>
     </w:pPr>
   </w:style>
-  <w:style w:type="character" w:customStyle="1" w:styleId="FooterChar">
-    <w:name w:val="Footer Char"/>
-    <w:link w:val="Footer"/>
+  <w:style w:type="character" w:customStyle="1" w:styleId="PiedepginaCar">
+    <w:name w:val="Pie de página Car"/>
+    <w:link w:val="Piedepgina"/>
     <w:uiPriority w:val="99"/>
     <w:rsid w:val="00344F2B"/>
     <w:rPr>
@@ -16287,9 +18061,9 @@
       <w:lang w:val="es-ES" w:eastAsia="es-ES"/>
     </w:rPr>
   </w:style>
-  <w:style w:type="character" w:customStyle="1" w:styleId="HeaderChar">
-    <w:name w:val="Header Char"/>
-    <w:link w:val="Header"/>
+  <w:style w:type="character" w:customStyle="1" w:styleId="EncabezadoCar">
+    <w:name w:val="Encabezado Car"/>
+    <w:link w:val="Encabezado"/>
     <w:uiPriority w:val="99"/>
     <w:rsid w:val="00344F2B"/>
     <w:rPr>
@@ -16298,10 +18072,10 @@
       <w:lang w:val="es-ES" w:eastAsia="es-ES"/>
     </w:rPr>
   </w:style>
-  <w:style w:type="paragraph" w:styleId="BalloonText">
+  <w:style w:type="paragraph" w:styleId="Textodeglobo">
     <w:name w:val="Balloon Text"/>
     <w:basedOn w:val="Normal"/>
-    <w:link w:val="BalloonTextChar"/>
+    <w:link w:val="TextodegloboCar"/>
     <w:rsid w:val="00344F2B"/>
     <w:rPr>
       <w:rFonts w:ascii="Tahoma" w:hAnsi="Tahoma" w:cs="Tahoma"/>
@@ -16309,9 +18083,9 @@
       <w:szCs w:val="16"/>
     </w:rPr>
   </w:style>
-  <w:style w:type="character" w:customStyle="1" w:styleId="BalloonTextChar">
-    <w:name w:val="Balloon Text Char"/>
-    <w:link w:val="BalloonText"/>
+  <w:style w:type="character" w:customStyle="1" w:styleId="TextodegloboCar">
+    <w:name w:val="Texto de globo Car"/>
+    <w:link w:val="Textodeglobo"/>
     <w:rsid w:val="00344F2B"/>
     <w:rPr>
       <w:rFonts w:ascii="Tahoma" w:hAnsi="Tahoma" w:cs="Tahoma"/>
@@ -16320,18 +18094,18 @@
       <w:lang w:val="es-ES" w:eastAsia="es-ES"/>
     </w:rPr>
   </w:style>
-  <w:style w:type="paragraph" w:styleId="BodyText">
+  <w:style w:type="paragraph" w:styleId="Textoindependiente">
     <w:name w:val="Body Text"/>
     <w:basedOn w:val="Normal"/>
-    <w:link w:val="BodyTextChar"/>
+    <w:link w:val="TextoindependienteCar"/>
     <w:rsid w:val="00FF438A"/>
     <w:pPr>
       <w:spacing w:after="120"/>
     </w:pPr>
   </w:style>
-  <w:style w:type="character" w:customStyle="1" w:styleId="BodyTextChar">
-    <w:name w:val="Body Text Char"/>
-    <w:link w:val="BodyText"/>
+  <w:style w:type="character" w:customStyle="1" w:styleId="TextoindependienteCar">
+    <w:name w:val="Texto independiente Car"/>
+    <w:link w:val="Textoindependiente"/>
     <w:rsid w:val="00FF438A"/>
     <w:rPr>
       <w:sz w:val="24"/>
@@ -16339,32 +18113,32 @@
       <w:lang w:val="es-ES" w:eastAsia="es-ES"/>
     </w:rPr>
   </w:style>
-  <w:style w:type="paragraph" w:styleId="EndnoteText">
+  <w:style w:type="paragraph" w:styleId="Textonotaalfinal">
     <w:name w:val="endnote text"/>
     <w:basedOn w:val="Normal"/>
-    <w:link w:val="EndnoteTextChar"/>
+    <w:link w:val="TextonotaalfinalCar"/>
     <w:rsid w:val="00A83ADC"/>
     <w:rPr>
       <w:sz w:val="20"/>
       <w:szCs w:val="20"/>
     </w:rPr>
   </w:style>
-  <w:style w:type="character" w:customStyle="1" w:styleId="EndnoteTextChar">
-    <w:name w:val="Endnote Text Char"/>
-    <w:link w:val="EndnoteText"/>
+  <w:style w:type="character" w:customStyle="1" w:styleId="TextonotaalfinalCar">
+    <w:name w:val="Texto nota al final Car"/>
+    <w:link w:val="Textonotaalfinal"/>
     <w:rsid w:val="00A83ADC"/>
     <w:rPr>
       <w:lang w:val="es-ES" w:eastAsia="es-ES"/>
     </w:rPr>
   </w:style>
-  <w:style w:type="character" w:styleId="EndnoteReference">
+  <w:style w:type="character" w:styleId="Refdenotaalfinal">
     <w:name w:val="endnote reference"/>
     <w:rsid w:val="00A83ADC"/>
     <w:rPr>
       <w:vertAlign w:val="superscript"/>
     </w:rPr>
   </w:style>
-  <w:style w:type="paragraph" w:styleId="Revision">
+  <w:style w:type="paragraph" w:styleId="Revisin">
     <w:name w:val="Revision"/>
     <w:hidden/>
     <w:uiPriority w:val="99"/>
@@ -16376,9 +18150,9 @@
       <w:lang w:val="es-ES" w:eastAsia="es-ES"/>
     </w:rPr>
   </w:style>
-  <w:style w:type="table" w:styleId="TableGrid">
+  <w:style w:type="table" w:styleId="Tablaconcuadrcula">
     <w:name w:val="Table Grid"/>
-    <w:basedOn w:val="TableNormal"/>
+    <w:basedOn w:val="Tablanormal"/>
     <w:uiPriority w:val="1"/>
     <w:rsid w:val="00557FB4"/>
     <w:rPr>

</xml_diff>

<commit_message>
Se añade la funcionalidad correspondiente a la bandeja del auxiliar
</commit_message>
<xml_diff>
--- a/Casos de Uso/CU_Reglas_de_Negocio_Sistema_Quejas_v1.5.docx
+++ b/Casos de Uso/CU_Reglas_de_Negocio_Sistema_Quejas_v1.5.docx
@@ -1,10 +1,10 @@
 
 <file path=word/document.xml><?xml version="1.0" encoding="utf-8"?>
-<w:document xmlns:wpc="http://schemas.microsoft.com/office/word/2010/wordprocessingCanvas" xmlns:cx="http://schemas.microsoft.com/office/drawing/2014/chartex" xmlns:cx1="http://schemas.microsoft.com/office/drawing/2015/9/8/chartex" xmlns:cx2="http://schemas.microsoft.com/office/drawing/2015/10/21/chartex" xmlns:cx3="http://schemas.microsoft.com/office/drawing/2016/5/9/chartex" xmlns:cx4="http://schemas.microsoft.com/office/drawing/2016/5/10/chartex" xmlns:cx5="http://schemas.microsoft.com/office/drawing/2016/5/11/chartex" xmlns:cx6="http://schemas.microsoft.com/office/drawing/2016/5/12/chartex" xmlns:cx7="http://schemas.microsoft.com/office/drawing/2016/5/13/chartex" xmlns:cx8="http://schemas.microsoft.com/office/drawing/2016/5/14/chartex" xmlns:mc="http://schemas.openxmlformats.org/markup-compatibility/2006" xmlns:aink="http://schemas.microsoft.com/office/drawing/2016/ink" xmlns:am3d="http://schemas.microsoft.com/office/drawing/2017/model3d" xmlns:o="urn:schemas-microsoft-com:office:office" xmlns:oel="http://schemas.microsoft.com/office/2019/extlst" xmlns:r="http://schemas.openxmlformats.org/officeDocument/2006/relationships" xmlns:m="http://schemas.openxmlformats.org/officeDocument/2006/math" xmlns:v="urn:schemas-microsoft-com:vml" xmlns:wp14="http://schemas.microsoft.com/office/word/2010/wordprocessingDrawing" xmlns:wp="http://schemas.openxmlformats.org/drawingml/2006/wordprocessingDrawing" xmlns:w10="urn:schemas-microsoft-com:office:word" xmlns:w="http://schemas.openxmlformats.org/wordprocessingml/2006/main" xmlns:w14="http://schemas.microsoft.com/office/word/2010/wordml" xmlns:w15="http://schemas.microsoft.com/office/word/2012/wordml" xmlns:w16cex="http://schemas.microsoft.com/office/word/2018/wordml/cex" xmlns:w16cid="http://schemas.microsoft.com/office/word/2016/wordml/cid" xmlns:w16="http://schemas.microsoft.com/office/word/2018/wordml" xmlns:w16du="http://schemas.microsoft.com/office/word/2023/wordml/word16du" xmlns:w16sdtdh="http://schemas.microsoft.com/office/word/2020/wordml/sdtdatahash" xmlns:w16sdtfl="http://schemas.microsoft.com/office/word/2024/wordml/sdtformatlock" xmlns:w16se="http://schemas.microsoft.com/office/word/2015/wordml/symex" xmlns:wpg="http://schemas.microsoft.com/office/word/2010/wordprocessingGroup" xmlns:wpi="http://schemas.microsoft.com/office/word/2010/wordprocessingInk" xmlns:wne="http://schemas.microsoft.com/office/word/2006/wordml" xmlns:wps="http://schemas.microsoft.com/office/word/2010/wordprocessingShape" mc:Ignorable="w14 w15 w16se w16cid w16 w16cex w16sdtdh w16sdtfl w16du wp14">
+<w:document xmlns:wpc="http://schemas.microsoft.com/office/word/2010/wordprocessingCanvas" xmlns:cx="http://schemas.microsoft.com/office/drawing/2014/chartex" xmlns:cx1="http://schemas.microsoft.com/office/drawing/2015/9/8/chartex" xmlns:cx2="http://schemas.microsoft.com/office/drawing/2015/10/21/chartex" xmlns:cx3="http://schemas.microsoft.com/office/drawing/2016/5/9/chartex" xmlns:cx4="http://schemas.microsoft.com/office/drawing/2016/5/10/chartex" xmlns:cx5="http://schemas.microsoft.com/office/drawing/2016/5/11/chartex" xmlns:cx6="http://schemas.microsoft.com/office/drawing/2016/5/12/chartex" xmlns:cx7="http://schemas.microsoft.com/office/drawing/2016/5/13/chartex" xmlns:cx8="http://schemas.microsoft.com/office/drawing/2016/5/14/chartex" xmlns:mc="http://schemas.openxmlformats.org/markup-compatibility/2006" xmlns:aink="http://schemas.microsoft.com/office/drawing/2016/ink" xmlns:am3d="http://schemas.microsoft.com/office/drawing/2017/model3d" xmlns:o="urn:schemas-microsoft-com:office:office" xmlns:r="http://schemas.openxmlformats.org/officeDocument/2006/relationships" xmlns:m="http://schemas.openxmlformats.org/officeDocument/2006/math" xmlns:v="urn:schemas-microsoft-com:vml" xmlns:wp14="http://schemas.microsoft.com/office/word/2010/wordprocessingDrawing" xmlns:wp="http://schemas.openxmlformats.org/drawingml/2006/wordprocessingDrawing" xmlns:w10="urn:schemas-microsoft-com:office:word" xmlns:w="http://schemas.openxmlformats.org/wordprocessingml/2006/main" xmlns:w14="http://schemas.microsoft.com/office/word/2010/wordml" xmlns:w15="http://schemas.microsoft.com/office/word/2012/wordml" xmlns:w16cex="http://schemas.microsoft.com/office/word/2018/wordml/cex" xmlns:w16cid="http://schemas.microsoft.com/office/word/2016/wordml/cid" xmlns:w16="http://schemas.microsoft.com/office/word/2018/wordml" xmlns:w16sdtdh="http://schemas.microsoft.com/office/word/2020/wordml/sdtdatahash" xmlns:w16se="http://schemas.microsoft.com/office/word/2015/wordml/symex" xmlns:wpg="http://schemas.microsoft.com/office/word/2010/wordprocessingGroup" xmlns:wpi="http://schemas.microsoft.com/office/word/2010/wordprocessingInk" xmlns:wne="http://schemas.microsoft.com/office/word/2006/wordml" xmlns:wps="http://schemas.microsoft.com/office/word/2010/wordprocessingShape" mc:Ignorable="w14 w15 w16se w16cid w16 w16cex w16sdtdh wp14">
   <w:body>
     <w:p>
       <w:pPr>
-        <w:pStyle w:val="Ttulo"/>
+        <w:pStyle w:val="Title"/>
         <w:spacing w:before="0" w:after="0"/>
         <w:rPr>
           <w:lang w:val="es-ES"/>
@@ -19,7 +19,7 @@
     </w:p>
     <w:p>
       <w:pPr>
-        <w:pStyle w:val="Ttulo"/>
+        <w:pStyle w:val="Title"/>
         <w:spacing w:before="0" w:after="0"/>
         <w:rPr>
           <w:lang w:val="es-ES"/>
@@ -1988,7 +1988,6 @@
                 <w:szCs w:val="20"/>
               </w:rPr>
             </w:pPr>
-            <w:proofErr w:type="spellStart"/>
             <w:r>
               <w:rPr>
                 <w:sz w:val="20"/>
@@ -1996,7 +1995,6 @@
               </w:rPr>
               <w:t>Tecnico</w:t>
             </w:r>
-            <w:proofErr w:type="spellEnd"/>
           </w:p>
         </w:tc>
         <w:tc>
@@ -2241,7 +2239,6 @@
                 <w:szCs w:val="20"/>
               </w:rPr>
             </w:pPr>
-            <w:proofErr w:type="spellStart"/>
             <w:r>
               <w:rPr>
                 <w:sz w:val="20"/>
@@ -2249,7 +2246,6 @@
               </w:rPr>
               <w:t>Admin</w:t>
             </w:r>
-            <w:proofErr w:type="spellEnd"/>
           </w:p>
         </w:tc>
         <w:tc>
@@ -3707,23 +3703,7 @@
                 <w:szCs w:val="20"/>
               </w:rPr>
               <w:lastRenderedPageBreak/>
-              <w:t xml:space="preserve">de atención y el caso queda a la espera de la firma del </w:t>
-            </w:r>
-            <w:proofErr w:type="gramStart"/>
-            <w:r>
-              <w:rPr>
-                <w:sz w:val="20"/>
-                <w:szCs w:val="20"/>
-              </w:rPr>
-              <w:t>Jefe</w:t>
-            </w:r>
-            <w:proofErr w:type="gramEnd"/>
-            <w:r>
-              <w:rPr>
-                <w:sz w:val="20"/>
-                <w:szCs w:val="20"/>
-              </w:rPr>
-              <w:t xml:space="preserve"> de Departamento.</w:t>
+              <w:t>de atención y el caso queda a la espera de la firma del Jefe de Departamento.</w:t>
             </w:r>
           </w:p>
         </w:tc>
@@ -3792,23 +3772,7 @@
                 <w:sz w:val="20"/>
                 <w:szCs w:val="20"/>
               </w:rPr>
-              <w:t xml:space="preserve">Se coloca cuando el </w:t>
-            </w:r>
-            <w:proofErr w:type="gramStart"/>
-            <w:r>
-              <w:rPr>
-                <w:sz w:val="20"/>
-                <w:szCs w:val="20"/>
-              </w:rPr>
-              <w:t>Jefe</w:t>
-            </w:r>
-            <w:proofErr w:type="gramEnd"/>
-            <w:r>
-              <w:rPr>
-                <w:sz w:val="20"/>
-                <w:szCs w:val="20"/>
-              </w:rPr>
-              <w:t xml:space="preserve"> de Departamento firma el oficio de resolución; el sistema notifica al ciudadano.</w:t>
+              <w:t>Se coloca cuando el Jefe de Departamento firma el oficio de resolución; el sistema notifica al ciudadano.</w:t>
             </w:r>
           </w:p>
         </w:tc>
@@ -10426,14 +10390,7 @@
                 <w:sz w:val="20"/>
                 <w:szCs w:val="20"/>
               </w:rPr>
-              <w:t>Botón para ver archivo</w:t>
-            </w:r>
-            <w:r>
-              <w:rPr>
-                <w:sz w:val="20"/>
-                <w:szCs w:val="20"/>
-              </w:rPr>
-              <w:t>.</w:t>
+              <w:t>Botón para ver archivo.</w:t>
             </w:r>
           </w:p>
           <w:p>
@@ -11004,7 +10961,7 @@
                 <w:sz w:val="20"/>
                 <w:szCs w:val="20"/>
               </w:rPr>
-              <w:t>Si/No</w:t>
+              <w:t>check</w:t>
             </w:r>
           </w:p>
         </w:tc>
@@ -11041,27 +10998,6 @@
                 <w:szCs w:val="20"/>
               </w:rPr>
             </w:pPr>
-            <w:r>
-              <w:rPr>
-                <w:sz w:val="20"/>
-                <w:szCs w:val="20"/>
-              </w:rPr>
-              <w:t>Botón</w:t>
-            </w:r>
-            <w:r>
-              <w:rPr>
-                <w:sz w:val="20"/>
-                <w:szCs w:val="20"/>
-              </w:rPr>
-              <w:t xml:space="preserve"> Si</w:t>
-            </w:r>
-            <w:r>
-              <w:rPr>
-                <w:sz w:val="20"/>
-                <w:szCs w:val="20"/>
-              </w:rPr>
-              <w:t>/No</w:t>
-            </w:r>
           </w:p>
         </w:tc>
       </w:tr>
@@ -11749,56 +11685,13 @@
                 <w:szCs w:val="20"/>
               </w:rPr>
             </w:pPr>
-            <w:proofErr w:type="spellStart"/>
-            <w:r>
-              <w:rPr>
-                <w:sz w:val="20"/>
-                <w:szCs w:val="20"/>
-              </w:rPr>
-              <w:t>dd</w:t>
-            </w:r>
-            <w:proofErr w:type="spellEnd"/>
-            <w:r>
-              <w:rPr>
-                <w:sz w:val="20"/>
-                <w:szCs w:val="20"/>
-              </w:rPr>
-              <w:t>/mm/</w:t>
-            </w:r>
-            <w:proofErr w:type="spellStart"/>
-            <w:r>
-              <w:rPr>
-                <w:sz w:val="20"/>
-                <w:szCs w:val="20"/>
-              </w:rPr>
-              <w:t>aaaa</w:t>
-            </w:r>
-            <w:proofErr w:type="spellEnd"/>
-            <w:r>
-              <w:rPr>
-                <w:sz w:val="20"/>
-                <w:szCs w:val="20"/>
-              </w:rPr>
-              <w:t xml:space="preserve"> </w:t>
-            </w:r>
-            <w:proofErr w:type="spellStart"/>
-            <w:r>
-              <w:rPr>
-                <w:sz w:val="20"/>
-                <w:szCs w:val="20"/>
-              </w:rPr>
-              <w:t>hh:</w:t>
-            </w:r>
-            <w:proofErr w:type="gramStart"/>
-            <w:r>
-              <w:rPr>
-                <w:sz w:val="20"/>
-                <w:szCs w:val="20"/>
-              </w:rPr>
-              <w:t>mm:ss</w:t>
-            </w:r>
-            <w:proofErr w:type="spellEnd"/>
-            <w:proofErr w:type="gramEnd"/>
+            <w:r>
+              <w:rPr>
+                <w:sz w:val="20"/>
+                <w:szCs w:val="20"/>
+              </w:rPr>
+              <w:t>dd/mm/aaaa hh:mm:ss</w:t>
+            </w:r>
           </w:p>
         </w:tc>
       </w:tr>
@@ -12138,33 +12031,8 @@
                 <w:sz w:val="20"/>
                 <w:szCs w:val="20"/>
               </w:rPr>
-              <w:t xml:space="preserve">Fecha del sistema </w:t>
-            </w:r>
-            <w:proofErr w:type="spellStart"/>
-            <w:r>
-              <w:rPr>
-                <w:sz w:val="20"/>
-                <w:szCs w:val="20"/>
-              </w:rPr>
-              <w:t>dd</w:t>
-            </w:r>
-            <w:proofErr w:type="spellEnd"/>
-            <w:r>
-              <w:rPr>
-                <w:sz w:val="20"/>
-                <w:szCs w:val="20"/>
-              </w:rPr>
-              <w:t>/mm/</w:t>
-            </w:r>
-            <w:proofErr w:type="spellStart"/>
-            <w:r>
-              <w:rPr>
-                <w:sz w:val="20"/>
-                <w:szCs w:val="20"/>
-              </w:rPr>
-              <w:t>aaaa</w:t>
-            </w:r>
-            <w:proofErr w:type="spellEnd"/>
+              <w:t>Fecha del sistema dd/mm/aaaa</w:t>
+            </w:r>
           </w:p>
         </w:tc>
       </w:tr>
@@ -12405,6 +12273,184 @@
         </w:tc>
       </w:tr>
     </w:tbl>
+    <w:p>
+      <w:pPr>
+        <w:pStyle w:val="NormalWeb"/>
+        <w:spacing w:line="360" w:lineRule="auto"/>
+        <w:ind w:right="300"/>
+        <w:jc w:val="both"/>
+        <w:rPr>
+          <w:sz w:val="20"/>
+          <w:szCs w:val="20"/>
+        </w:rPr>
+      </w:pPr>
+      <w:r>
+        <w:rPr>
+          <w:sz w:val="20"/>
+          <w:szCs w:val="20"/>
+        </w:rPr>
+        <w:t>C</w:t>
+      </w:r>
+      <w:r>
+        <w:rPr>
+          <w:sz w:val="20"/>
+          <w:szCs w:val="20"/>
+        </w:rPr>
+        <w:t>orreos electrónicos</w:t>
+      </w:r>
+    </w:p>
+    <w:tbl>
+      <w:tblPr>
+        <w:tblW w:w="0" w:type="auto"/>
+        <w:tblBorders>
+          <w:top w:val="single" w:sz="4" w:space="0" w:color="000000"/>
+          <w:left w:val="single" w:sz="4" w:space="0" w:color="000000"/>
+          <w:bottom w:val="single" w:sz="4" w:space="0" w:color="000000"/>
+          <w:right w:val="single" w:sz="4" w:space="0" w:color="000000"/>
+          <w:insideH w:val="single" w:sz="4" w:space="0" w:color="000000"/>
+          <w:insideV w:val="single" w:sz="4" w:space="0" w:color="000000"/>
+        </w:tblBorders>
+        <w:tblLook w:val="04A0" w:firstRow="1" w:lastRow="0" w:firstColumn="1" w:lastColumn="0" w:noHBand="0" w:noVBand="1"/>
+      </w:tblPr>
+      <w:tblGrid>
+        <w:gridCol w:w="4322"/>
+        <w:gridCol w:w="4322"/>
+      </w:tblGrid>
+      <w:tr>
+        <w:tc>
+          <w:tcPr>
+            <w:tcW w:w="4322" w:type="dxa"/>
+            <w:shd w:val="clear" w:color="auto" w:fill="BFBFBF"/>
+          </w:tcPr>
+          <w:p>
+            <w:pPr>
+              <w:pStyle w:val="NormalWeb"/>
+              <w:spacing w:line="360" w:lineRule="auto"/>
+              <w:ind w:right="300"/>
+              <w:jc w:val="both"/>
+              <w:rPr>
+                <w:b/>
+                <w:bCs/>
+                <w:sz w:val="20"/>
+                <w:szCs w:val="20"/>
+                <w:lang w:bidi="en-US"/>
+              </w:rPr>
+            </w:pPr>
+            <w:r>
+              <w:rPr>
+                <w:b/>
+                <w:bCs/>
+                <w:sz w:val="20"/>
+                <w:szCs w:val="20"/>
+                <w:lang w:bidi="en-US"/>
+              </w:rPr>
+              <w:t>Notificación</w:t>
+            </w:r>
+          </w:p>
+        </w:tc>
+        <w:tc>
+          <w:tcPr>
+            <w:tcW w:w="4322" w:type="dxa"/>
+            <w:shd w:val="clear" w:color="auto" w:fill="BFBFBF"/>
+          </w:tcPr>
+          <w:p>
+            <w:pPr>
+              <w:pStyle w:val="NormalWeb"/>
+              <w:spacing w:line="360" w:lineRule="auto"/>
+              <w:ind w:right="300"/>
+              <w:jc w:val="both"/>
+              <w:rPr>
+                <w:b/>
+                <w:bCs/>
+                <w:sz w:val="20"/>
+                <w:szCs w:val="20"/>
+                <w:lang w:bidi="en-US"/>
+              </w:rPr>
+            </w:pPr>
+            <w:r>
+              <w:rPr>
+                <w:b/>
+                <w:bCs/>
+                <w:sz w:val="20"/>
+                <w:szCs w:val="20"/>
+                <w:lang w:bidi="en-US"/>
+              </w:rPr>
+              <w:t>Mensaje</w:t>
+            </w:r>
+          </w:p>
+        </w:tc>
+      </w:tr>
+      <w:tr>
+        <w:tc>
+          <w:tcPr>
+            <w:tcW w:w="4322" w:type="dxa"/>
+            <w:shd w:val="clear" w:color="auto" w:fill="auto"/>
+          </w:tcPr>
+          <w:p>
+            <w:pPr>
+              <w:pStyle w:val="NormalWeb"/>
+              <w:spacing w:line="360" w:lineRule="auto"/>
+              <w:ind w:right="300"/>
+              <w:jc w:val="both"/>
+              <w:rPr>
+                <w:sz w:val="20"/>
+                <w:szCs w:val="20"/>
+                <w:lang w:bidi="en-US"/>
+              </w:rPr>
+            </w:pPr>
+            <w:bookmarkStart w:id="0" w:name="_Hlk241779363"/>
+            <w:r>
+              <w:rPr>
+                <w:sz w:val="20"/>
+                <w:szCs w:val="20"/>
+                <w:lang w:bidi="en-US"/>
+              </w:rPr>
+              <w:t>NOT01</w:t>
+            </w:r>
+            <w:bookmarkEnd w:id="0"/>
+          </w:p>
+        </w:tc>
+        <w:tc>
+          <w:tcPr>
+            <w:tcW w:w="4322" w:type="dxa"/>
+            <w:shd w:val="clear" w:color="auto" w:fill="auto"/>
+          </w:tcPr>
+          <w:p>
+            <w:pPr>
+              <w:pStyle w:val="NormalWeb"/>
+              <w:spacing w:line="360" w:lineRule="auto"/>
+              <w:ind w:right="300"/>
+              <w:jc w:val="both"/>
+              <w:rPr>
+                <w:sz w:val="20"/>
+                <w:szCs w:val="20"/>
+                <w:lang w:bidi="en-US"/>
+              </w:rPr>
+            </w:pPr>
+            <w:r>
+              <w:rPr>
+                <w:sz w:val="20"/>
+                <w:szCs w:val="20"/>
+                <w:lang w:bidi="en-US"/>
+              </w:rPr>
+              <w:t>Su caso CODIGO DE SEGUIMIENTO requiere ampliación de información. Comentario del Auxiliar: COMENTARIO DEFINIDO POR EL AUXILIAR.</w:t>
+            </w:r>
+          </w:p>
+        </w:tc>
+      </w:tr>
+    </w:tbl>
+    <w:p>
+      <w:pPr>
+        <w:pStyle w:val="NormalWeb"/>
+        <w:spacing w:line="360" w:lineRule="auto"/>
+        <w:ind w:right="300"/>
+        <w:jc w:val="both"/>
+        <w:rPr>
+          <w:sz w:val="20"/>
+          <w:szCs w:val="20"/>
+        </w:rPr>
+      </w:pPr>
+    </w:p>
     <w:p>
       <w:pPr>
         <w:pStyle w:val="NormalWeb"/>
@@ -13210,6 +13256,7 @@
                 <w:sz w:val="20"/>
                 <w:szCs w:val="20"/>
               </w:rPr>
+              <w:lastRenderedPageBreak/>
               <w:t>11</w:t>
             </w:r>
           </w:p>
@@ -13677,7 +13724,6 @@
                 <w:szCs w:val="20"/>
                 <w:highlight w:val="green"/>
               </w:rPr>
-              <w:lastRenderedPageBreak/>
               <w:t>3</w:t>
             </w:r>
           </w:p>
@@ -15543,6 +15589,7 @@
                 <w:sz w:val="20"/>
                 <w:szCs w:val="20"/>
               </w:rPr>
+              <w:lastRenderedPageBreak/>
               <w:t>36</w:t>
             </w:r>
           </w:p>
@@ -15996,7 +16043,6 @@
                 <w:sz w:val="20"/>
                 <w:szCs w:val="20"/>
               </w:rPr>
-              <w:lastRenderedPageBreak/>
               <w:t>Bienvenida</w:t>
             </w:r>
           </w:p>
@@ -16402,17 +16448,8 @@
                 <w:sz w:val="20"/>
                 <w:szCs w:val="20"/>
               </w:rPr>
-              <w:t xml:space="preserve">Código de seguimiento: </w:t>
-            </w:r>
-            <w:proofErr w:type="spellStart"/>
-            <w:r>
-              <w:rPr>
-                <w:sz w:val="20"/>
-                <w:szCs w:val="20"/>
-              </w:rPr>
-              <w:t>codigoSeguimiento</w:t>
-            </w:r>
-            <w:proofErr w:type="spellEnd"/>
+              <w:t>Código de seguimiento: codigoSeguimiento</w:t>
+            </w:r>
           </w:p>
           <w:p>
             <w:pPr>
@@ -16427,17 +16464,8 @@
                 <w:sz w:val="20"/>
                 <w:szCs w:val="20"/>
               </w:rPr>
-              <w:t xml:space="preserve">Fecha de registro: </w:t>
-            </w:r>
-            <w:proofErr w:type="spellStart"/>
-            <w:r>
-              <w:rPr>
-                <w:sz w:val="20"/>
-                <w:szCs w:val="20"/>
-              </w:rPr>
-              <w:t>fechaRegistro</w:t>
-            </w:r>
-            <w:proofErr w:type="spellEnd"/>
+              <w:t>Fecha de registro: fechaRegistro</w:t>
+            </w:r>
           </w:p>
           <w:p>
             <w:pPr>
@@ -16452,33 +16480,8 @@
                 <w:sz w:val="20"/>
                 <w:szCs w:val="20"/>
               </w:rPr>
-              <w:t xml:space="preserve">Tipo de caso: </w:t>
-            </w:r>
-            <w:proofErr w:type="spellStart"/>
-            <w:r>
-              <w:rPr>
-                <w:sz w:val="20"/>
-                <w:szCs w:val="20"/>
-              </w:rPr>
-              <w:t>tipoCaso</w:t>
-            </w:r>
-            <w:proofErr w:type="spellEnd"/>
-            <w:r>
-              <w:rPr>
-                <w:sz w:val="20"/>
-                <w:szCs w:val="20"/>
-              </w:rPr>
-              <w:t xml:space="preserve">     Categoría: </w:t>
-            </w:r>
-            <w:proofErr w:type="spellStart"/>
-            <w:r>
-              <w:rPr>
-                <w:sz w:val="20"/>
-                <w:szCs w:val="20"/>
-              </w:rPr>
-              <w:t>categoriaProblema</w:t>
-            </w:r>
-            <w:proofErr w:type="spellEnd"/>
+              <w:t>Tipo de caso: tipoCaso     Categoría: categoriaProblema</w:t>
+            </w:r>
           </w:p>
           <w:p>
             <w:pPr>
@@ -16493,17 +16496,8 @@
                 <w:sz w:val="20"/>
                 <w:szCs w:val="20"/>
               </w:rPr>
-              <w:t xml:space="preserve">Ciudadano: </w:t>
-            </w:r>
-            <w:proofErr w:type="spellStart"/>
-            <w:r>
-              <w:rPr>
-                <w:sz w:val="20"/>
-                <w:szCs w:val="20"/>
-              </w:rPr>
-              <w:t>nombreCiudadano</w:t>
-            </w:r>
-            <w:proofErr w:type="spellEnd"/>
+              <w:t>Ciudadano: nombreCiudadano</w:t>
+            </w:r>
           </w:p>
           <w:p>
             <w:pPr>
@@ -16518,17 +16512,8 @@
                 <w:sz w:val="20"/>
                 <w:szCs w:val="20"/>
               </w:rPr>
-              <w:t xml:space="preserve">Departamento responsable: </w:t>
-            </w:r>
-            <w:proofErr w:type="spellStart"/>
-            <w:r>
-              <w:rPr>
-                <w:sz w:val="20"/>
-                <w:szCs w:val="20"/>
-              </w:rPr>
-              <w:t>departamentoResponsable</w:t>
-            </w:r>
-            <w:proofErr w:type="spellEnd"/>
+              <w:t>Departamento responsable: departamentoResponsable</w:t>
+            </w:r>
           </w:p>
           <w:p>
             <w:pPr>
@@ -16552,55 +16537,7 @@
                 <w:sz w:val="20"/>
                 <w:szCs w:val="20"/>
               </w:rPr>
-              <w:t xml:space="preserve">El caso fue revisado por el Auxiliar </w:t>
-            </w:r>
-            <w:proofErr w:type="spellStart"/>
-            <w:r>
-              <w:rPr>
-                <w:sz w:val="20"/>
-                <w:szCs w:val="20"/>
-              </w:rPr>
-              <w:t>nombreAuxiliar</w:t>
-            </w:r>
-            <w:proofErr w:type="spellEnd"/>
-            <w:r>
-              <w:rPr>
-                <w:sz w:val="20"/>
-                <w:szCs w:val="20"/>
-              </w:rPr>
-              <w:t xml:space="preserve"> el </w:t>
-            </w:r>
-            <w:proofErr w:type="spellStart"/>
-            <w:r>
-              <w:rPr>
-                <w:sz w:val="20"/>
-                <w:szCs w:val="20"/>
-              </w:rPr>
-              <w:t>fechaRevision</w:t>
-            </w:r>
-            <w:proofErr w:type="spellEnd"/>
-            <w:r>
-              <w:rPr>
-                <w:sz w:val="20"/>
-                <w:szCs w:val="20"/>
-              </w:rPr>
-              <w:t xml:space="preserve">, con el siguiente resultado: </w:t>
-            </w:r>
-            <w:proofErr w:type="spellStart"/>
-            <w:r>
-              <w:rPr>
-                <w:sz w:val="20"/>
-                <w:szCs w:val="20"/>
-              </w:rPr>
-              <w:t>decisionAuxiliar</w:t>
-            </w:r>
-            <w:proofErr w:type="spellEnd"/>
-            <w:r>
-              <w:rPr>
-                <w:sz w:val="20"/>
-                <w:szCs w:val="20"/>
-              </w:rPr>
-              <w:t>.</w:t>
+              <w:t>El caso fue revisado por el Auxiliar nombreAuxiliar el fechaRevision, con el siguiente resultado: decisionAuxiliar.</w:t>
             </w:r>
           </w:p>
           <w:p>
@@ -16625,17 +16562,8 @@
                 <w:sz w:val="20"/>
                 <w:szCs w:val="20"/>
               </w:rPr>
-              <w:t xml:space="preserve">Motivo de rechazo: </w:t>
-            </w:r>
-            <w:proofErr w:type="spellStart"/>
-            <w:r>
-              <w:rPr>
-                <w:sz w:val="20"/>
-                <w:szCs w:val="20"/>
-              </w:rPr>
-              <w:t>motivoRechazo</w:t>
-            </w:r>
-            <w:proofErr w:type="spellEnd"/>
+              <w:t>Motivo de rechazo: motivoRechazo</w:t>
+            </w:r>
           </w:p>
           <w:p>
             <w:pPr>
@@ -16650,17 +16578,8 @@
                 <w:sz w:val="20"/>
                 <w:szCs w:val="20"/>
               </w:rPr>
-              <w:t xml:space="preserve">Instrucciones de ampliación: </w:t>
-            </w:r>
-            <w:proofErr w:type="spellStart"/>
-            <w:r>
-              <w:rPr>
-                <w:sz w:val="20"/>
-                <w:szCs w:val="20"/>
-              </w:rPr>
-              <w:t>instruccionesAmpliacion</w:t>
-            </w:r>
-            <w:proofErr w:type="spellEnd"/>
+              <w:t>Instrucciones de ampliación: instruccionesAmpliacion</w:t>
+            </w:r>
           </w:p>
           <w:p>
             <w:pPr>
@@ -16675,17 +16594,8 @@
                 <w:sz w:val="20"/>
                 <w:szCs w:val="20"/>
               </w:rPr>
-              <w:t xml:space="preserve">Observaciones: </w:t>
-            </w:r>
-            <w:proofErr w:type="spellStart"/>
-            <w:r>
-              <w:rPr>
-                <w:sz w:val="20"/>
-                <w:szCs w:val="20"/>
-              </w:rPr>
-              <w:t>observacionesAuxiliar</w:t>
-            </w:r>
-            <w:proofErr w:type="spellEnd"/>
+              <w:t>Observaciones: observacionesAuxiliar</w:t>
+            </w:r>
           </w:p>
         </w:tc>
       </w:tr>
@@ -16755,7 +16665,6 @@
                 <w:szCs w:val="20"/>
               </w:rPr>
             </w:pPr>
-            <w:proofErr w:type="spellStart"/>
             <w:r>
               <w:rPr>
                 <w:sz w:val="20"/>
@@ -16763,7 +16672,6 @@
               </w:rPr>
               <w:t>codigoSeguimiento</w:t>
             </w:r>
-            <w:proofErr w:type="spellEnd"/>
           </w:p>
         </w:tc>
         <w:tc>
@@ -16799,15 +16707,14 @@
                 <w:szCs w:val="20"/>
               </w:rPr>
             </w:pPr>
-            <w:proofErr w:type="spellStart"/>
-            <w:r>
-              <w:rPr>
-                <w:sz w:val="20"/>
-                <w:szCs w:val="20"/>
-              </w:rPr>
+            <w:r>
+              <w:rPr>
+                <w:sz w:val="20"/>
+                <w:szCs w:val="20"/>
+              </w:rPr>
+              <w:lastRenderedPageBreak/>
               <w:t>fechaRegistro</w:t>
             </w:r>
-            <w:proofErr w:type="spellEnd"/>
           </w:p>
         </w:tc>
         <w:tc>
@@ -16843,7 +16750,6 @@
                 <w:szCs w:val="20"/>
               </w:rPr>
             </w:pPr>
-            <w:proofErr w:type="spellStart"/>
             <w:r>
               <w:rPr>
                 <w:sz w:val="20"/>
@@ -16851,7 +16757,6 @@
               </w:rPr>
               <w:t>tipoCaso</w:t>
             </w:r>
-            <w:proofErr w:type="spellEnd"/>
           </w:p>
         </w:tc>
         <w:tc>
@@ -16901,7 +16806,6 @@
                 <w:szCs w:val="20"/>
               </w:rPr>
             </w:pPr>
-            <w:proofErr w:type="spellStart"/>
             <w:r>
               <w:rPr>
                 <w:sz w:val="20"/>
@@ -16909,7 +16813,6 @@
               </w:rPr>
               <w:t>categoriaProblema</w:t>
             </w:r>
-            <w:proofErr w:type="spellEnd"/>
           </w:p>
         </w:tc>
         <w:tc>
@@ -16952,7 +16855,6 @@
                 <w:szCs w:val="20"/>
               </w:rPr>
             </w:pPr>
-            <w:proofErr w:type="spellStart"/>
             <w:r>
               <w:rPr>
                 <w:sz w:val="20"/>
@@ -16960,7 +16862,6 @@
               </w:rPr>
               <w:t>nombreCiudadano</w:t>
             </w:r>
-            <w:proofErr w:type="spellEnd"/>
           </w:p>
         </w:tc>
         <w:tc>
@@ -17003,7 +16904,6 @@
                 <w:szCs w:val="20"/>
               </w:rPr>
             </w:pPr>
-            <w:proofErr w:type="spellStart"/>
             <w:r>
               <w:rPr>
                 <w:sz w:val="20"/>
@@ -17011,7 +16911,6 @@
               </w:rPr>
               <w:t>departamentoResponsable</w:t>
             </w:r>
-            <w:proofErr w:type="spellEnd"/>
           </w:p>
         </w:tc>
         <w:tc>
@@ -17054,7 +16953,6 @@
                 <w:szCs w:val="20"/>
               </w:rPr>
             </w:pPr>
-            <w:proofErr w:type="spellStart"/>
             <w:r>
               <w:rPr>
                 <w:sz w:val="20"/>
@@ -17062,7 +16960,6 @@
               </w:rPr>
               <w:t>nombreAuxiliar</w:t>
             </w:r>
-            <w:proofErr w:type="spellEnd"/>
           </w:p>
         </w:tc>
         <w:tc>
@@ -17098,7 +16995,6 @@
                 <w:szCs w:val="20"/>
               </w:rPr>
             </w:pPr>
-            <w:proofErr w:type="spellStart"/>
             <w:r>
               <w:rPr>
                 <w:sz w:val="20"/>
@@ -17106,7 +17002,6 @@
               </w:rPr>
               <w:t>fechaRevision</w:t>
             </w:r>
-            <w:proofErr w:type="spellEnd"/>
           </w:p>
         </w:tc>
         <w:tc>
@@ -17142,7 +17037,6 @@
                 <w:szCs w:val="20"/>
               </w:rPr>
             </w:pPr>
-            <w:proofErr w:type="spellStart"/>
             <w:r>
               <w:rPr>
                 <w:sz w:val="20"/>
@@ -17150,7 +17044,6 @@
               </w:rPr>
               <w:t>decisionAuxiliar</w:t>
             </w:r>
-            <w:proofErr w:type="spellEnd"/>
           </w:p>
         </w:tc>
         <w:tc>
@@ -17186,7 +17079,6 @@
                 <w:szCs w:val="20"/>
               </w:rPr>
             </w:pPr>
-            <w:proofErr w:type="spellStart"/>
             <w:r>
               <w:rPr>
                 <w:sz w:val="20"/>
@@ -17194,7 +17086,6 @@
               </w:rPr>
               <w:t>motivoRechazo</w:t>
             </w:r>
-            <w:proofErr w:type="spellEnd"/>
           </w:p>
         </w:tc>
         <w:tc>
@@ -17213,23 +17104,7 @@
                 <w:sz w:val="20"/>
                 <w:szCs w:val="20"/>
               </w:rPr>
-              <w:t xml:space="preserve">Catálogo de Motivos de Rechazo; solo si </w:t>
-            </w:r>
-            <w:proofErr w:type="spellStart"/>
-            <w:r>
-              <w:rPr>
-                <w:sz w:val="20"/>
-                <w:szCs w:val="20"/>
-              </w:rPr>
-              <w:t>decisionAuxiliar</w:t>
-            </w:r>
-            <w:proofErr w:type="spellEnd"/>
-            <w:r>
-              <w:rPr>
-                <w:sz w:val="20"/>
-                <w:szCs w:val="20"/>
-              </w:rPr>
-              <w:t xml:space="preserve"> = Rechazado</w:t>
+              <w:t>Catálogo de Motivos de Rechazo; solo si decisionAuxiliar = Rechazado</w:t>
             </w:r>
           </w:p>
         </w:tc>
@@ -17246,7 +17121,6 @@
                 <w:szCs w:val="20"/>
               </w:rPr>
             </w:pPr>
-            <w:proofErr w:type="spellStart"/>
             <w:r>
               <w:rPr>
                 <w:sz w:val="20"/>
@@ -17254,7 +17128,6 @@
               </w:rPr>
               <w:t>instruccionesAmpliacion</w:t>
             </w:r>
-            <w:proofErr w:type="spellEnd"/>
           </w:p>
         </w:tc>
         <w:tc>
@@ -17273,23 +17146,7 @@
                 <w:sz w:val="20"/>
                 <w:szCs w:val="20"/>
               </w:rPr>
-              <w:t xml:space="preserve">Solo si </w:t>
-            </w:r>
-            <w:proofErr w:type="spellStart"/>
-            <w:r>
-              <w:rPr>
-                <w:sz w:val="20"/>
-                <w:szCs w:val="20"/>
-              </w:rPr>
-              <w:t>motivoRechazo</w:t>
-            </w:r>
-            <w:proofErr w:type="spellEnd"/>
-            <w:r>
-              <w:rPr>
-                <w:sz w:val="20"/>
-                <w:szCs w:val="20"/>
-              </w:rPr>
-              <w:t xml:space="preserve"> </w:t>
+              <w:t xml:space="preserve">Solo si motivoRechazo </w:t>
             </w:r>
             <w:r>
               <w:rPr>
@@ -17313,7 +17170,6 @@
                 <w:szCs w:val="20"/>
               </w:rPr>
             </w:pPr>
-            <w:proofErr w:type="spellStart"/>
             <w:r>
               <w:rPr>
                 <w:sz w:val="20"/>
@@ -17321,7 +17177,6 @@
               </w:rPr>
               <w:t>observacionesAuxiliar</w:t>
             </w:r>
-            <w:proofErr w:type="spellEnd"/>
           </w:p>
         </w:tc>
         <w:tc>
@@ -17366,7 +17221,6 @@
           <w:sz w:val="20"/>
           <w:szCs w:val="20"/>
         </w:rPr>
-        <w:lastRenderedPageBreak/>
         <w:t># 2 Reporte de Atención del Caso</w:t>
       </w:r>
     </w:p>
@@ -17481,17 +17335,8 @@
                 <w:sz w:val="20"/>
                 <w:szCs w:val="20"/>
               </w:rPr>
-              <w:t xml:space="preserve">Código de seguimiento: </w:t>
-            </w:r>
-            <w:proofErr w:type="spellStart"/>
-            <w:r>
-              <w:rPr>
-                <w:sz w:val="20"/>
-                <w:szCs w:val="20"/>
-              </w:rPr>
-              <w:t>codigoSeguimiento</w:t>
-            </w:r>
-            <w:proofErr w:type="spellEnd"/>
+              <w:t>Código de seguimiento: codigoSeguimiento</w:t>
+            </w:r>
           </w:p>
           <w:p>
             <w:pPr>
@@ -17506,17 +17351,8 @@
                 <w:sz w:val="20"/>
                 <w:szCs w:val="20"/>
               </w:rPr>
-              <w:t xml:space="preserve">Departamento: </w:t>
-            </w:r>
-            <w:proofErr w:type="spellStart"/>
-            <w:r>
-              <w:rPr>
-                <w:sz w:val="20"/>
-                <w:szCs w:val="20"/>
-              </w:rPr>
-              <w:t>departamentoResponsable</w:t>
-            </w:r>
-            <w:proofErr w:type="spellEnd"/>
+              <w:t>Departamento: departamentoResponsable</w:t>
+            </w:r>
           </w:p>
           <w:p>
             <w:pPr>
@@ -17531,17 +17367,8 @@
                 <w:sz w:val="20"/>
                 <w:szCs w:val="20"/>
               </w:rPr>
-              <w:t xml:space="preserve">Técnico responsable: </w:t>
-            </w:r>
-            <w:proofErr w:type="spellStart"/>
-            <w:r>
-              <w:rPr>
-                <w:sz w:val="20"/>
-                <w:szCs w:val="20"/>
-              </w:rPr>
-              <w:t>nombreTecnico</w:t>
-            </w:r>
-            <w:proofErr w:type="spellEnd"/>
+              <w:t>Técnico responsable: nombreTecnico</w:t>
+            </w:r>
           </w:p>
           <w:p>
             <w:pPr>
@@ -17556,17 +17383,8 @@
                 <w:sz w:val="20"/>
                 <w:szCs w:val="20"/>
               </w:rPr>
-              <w:t xml:space="preserve">Fecha de atención: </w:t>
-            </w:r>
-            <w:proofErr w:type="spellStart"/>
-            <w:r>
-              <w:rPr>
-                <w:sz w:val="20"/>
-                <w:szCs w:val="20"/>
-              </w:rPr>
-              <w:t>fechaAtencion</w:t>
-            </w:r>
-            <w:proofErr w:type="spellEnd"/>
+              <w:t>Fecha de atención: fechaAtencion</w:t>
+            </w:r>
           </w:p>
           <w:p>
             <w:pPr>
@@ -17602,7 +17420,6 @@
                 <w:szCs w:val="20"/>
               </w:rPr>
             </w:pPr>
-            <w:proofErr w:type="spellStart"/>
             <w:r>
               <w:rPr>
                 <w:sz w:val="20"/>
@@ -17610,7 +17427,6 @@
               </w:rPr>
               <w:t>accionesRealizadas</w:t>
             </w:r>
-            <w:proofErr w:type="spellEnd"/>
           </w:p>
           <w:p>
             <w:pPr>
@@ -17634,17 +17450,8 @@
                 <w:sz w:val="20"/>
                 <w:szCs w:val="20"/>
               </w:rPr>
-              <w:t xml:space="preserve">Evidencia adjunta: </w:t>
-            </w:r>
-            <w:proofErr w:type="spellStart"/>
-            <w:r>
-              <w:rPr>
-                <w:sz w:val="20"/>
-                <w:szCs w:val="20"/>
-              </w:rPr>
-              <w:t>listaEvidencia</w:t>
-            </w:r>
-            <w:proofErr w:type="spellEnd"/>
+              <w:t>Evidencia adjunta: listaEvidencia</w:t>
+            </w:r>
           </w:p>
         </w:tc>
       </w:tr>
@@ -17706,31 +17513,13 @@
                 <w:szCs w:val="20"/>
               </w:rPr>
             </w:pPr>
-            <w:proofErr w:type="spellStart"/>
-            <w:r>
-              <w:rPr>
-                <w:sz w:val="20"/>
-                <w:szCs w:val="20"/>
-              </w:rPr>
-              <w:t>numeroCaso</w:t>
-            </w:r>
-            <w:proofErr w:type="spellEnd"/>
-            <w:r>
-              <w:rPr>
-                <w:sz w:val="20"/>
-                <w:szCs w:val="20"/>
-              </w:rPr>
-              <w:t xml:space="preserve"> / </w:t>
-            </w:r>
-            <w:proofErr w:type="spellStart"/>
-            <w:r>
-              <w:rPr>
-                <w:sz w:val="20"/>
-                <w:szCs w:val="20"/>
-              </w:rPr>
-              <w:t>codigoSeguimiento</w:t>
-            </w:r>
-            <w:proofErr w:type="spellEnd"/>
+            <w:r>
+              <w:rPr>
+                <w:sz w:val="20"/>
+                <w:szCs w:val="20"/>
+              </w:rPr>
+              <w:t>numeroCaso / codigoSeguimiento</w:t>
+            </w:r>
           </w:p>
         </w:tc>
         <w:tc>
@@ -17766,7 +17555,6 @@
                 <w:szCs w:val="20"/>
               </w:rPr>
             </w:pPr>
-            <w:proofErr w:type="spellStart"/>
             <w:r>
               <w:rPr>
                 <w:sz w:val="20"/>
@@ -17774,7 +17562,6 @@
               </w:rPr>
               <w:t>departamentoResponsable</w:t>
             </w:r>
-            <w:proofErr w:type="spellEnd"/>
           </w:p>
         </w:tc>
         <w:tc>
@@ -17810,7 +17597,6 @@
                 <w:szCs w:val="20"/>
               </w:rPr>
             </w:pPr>
-            <w:proofErr w:type="spellStart"/>
             <w:r>
               <w:rPr>
                 <w:sz w:val="20"/>
@@ -17818,7 +17604,6 @@
               </w:rPr>
               <w:t>nombreTecnico</w:t>
             </w:r>
-            <w:proofErr w:type="spellEnd"/>
           </w:p>
         </w:tc>
         <w:tc>
@@ -17854,7 +17639,6 @@
                 <w:szCs w:val="20"/>
               </w:rPr>
             </w:pPr>
-            <w:proofErr w:type="spellStart"/>
             <w:r>
               <w:rPr>
                 <w:sz w:val="20"/>
@@ -17862,7 +17646,6 @@
               </w:rPr>
               <w:t>fechaAtencion</w:t>
             </w:r>
-            <w:proofErr w:type="spellEnd"/>
           </w:p>
         </w:tc>
         <w:tc>
@@ -17898,7 +17681,6 @@
                 <w:szCs w:val="20"/>
               </w:rPr>
             </w:pPr>
-            <w:proofErr w:type="spellStart"/>
             <w:r>
               <w:rPr>
                 <w:sz w:val="20"/>
@@ -17906,7 +17688,6 @@
               </w:rPr>
               <w:t>accionesRealizadas</w:t>
             </w:r>
-            <w:proofErr w:type="spellEnd"/>
           </w:p>
         </w:tc>
         <w:tc>
@@ -17942,7 +17723,6 @@
                 <w:szCs w:val="20"/>
               </w:rPr>
             </w:pPr>
-            <w:proofErr w:type="spellStart"/>
             <w:r>
               <w:rPr>
                 <w:sz w:val="20"/>
@@ -17950,7 +17730,6 @@
               </w:rPr>
               <w:t>listaEvidencia</w:t>
             </w:r>
-            <w:proofErr w:type="spellEnd"/>
           </w:p>
         </w:tc>
         <w:tc>
@@ -18295,7 +18074,7 @@
 </file>
 
 <file path=word/endnotes.xml><?xml version="1.0" encoding="utf-8"?>
-<w:endnotes xmlns:wpc="http://schemas.microsoft.com/office/word/2010/wordprocessingCanvas" xmlns:cx="http://schemas.microsoft.com/office/drawing/2014/chartex" xmlns:cx1="http://schemas.microsoft.com/office/drawing/2015/9/8/chartex" xmlns:cx2="http://schemas.microsoft.com/office/drawing/2015/10/21/chartex" xmlns:cx3="http://schemas.microsoft.com/office/drawing/2016/5/9/chartex" xmlns:cx4="http://schemas.microsoft.com/office/drawing/2016/5/10/chartex" xmlns:cx5="http://schemas.microsoft.com/office/drawing/2016/5/11/chartex" xmlns:cx6="http://schemas.microsoft.com/office/drawing/2016/5/12/chartex" xmlns:cx7="http://schemas.microsoft.com/office/drawing/2016/5/13/chartex" xmlns:cx8="http://schemas.microsoft.com/office/drawing/2016/5/14/chartex" xmlns:mc="http://schemas.openxmlformats.org/markup-compatibility/2006" xmlns:aink="http://schemas.microsoft.com/office/drawing/2016/ink" xmlns:am3d="http://schemas.microsoft.com/office/drawing/2017/model3d" xmlns:o="urn:schemas-microsoft-com:office:office" xmlns:oel="http://schemas.microsoft.com/office/2019/extlst" xmlns:r="http://schemas.openxmlformats.org/officeDocument/2006/relationships" xmlns:m="http://schemas.openxmlformats.org/officeDocument/2006/math" xmlns:v="urn:schemas-microsoft-com:vml" xmlns:wp14="http://schemas.microsoft.com/office/word/2010/wordprocessingDrawing" xmlns:wp="http://schemas.openxmlformats.org/drawingml/2006/wordprocessingDrawing" xmlns:w10="urn:schemas-microsoft-com:office:word" xmlns:w="http://schemas.openxmlformats.org/wordprocessingml/2006/main" xmlns:w14="http://schemas.microsoft.com/office/word/2010/wordml" xmlns:w15="http://schemas.microsoft.com/office/word/2012/wordml" xmlns:w16cex="http://schemas.microsoft.com/office/word/2018/wordml/cex" xmlns:w16cid="http://schemas.microsoft.com/office/word/2016/wordml/cid" xmlns:w16="http://schemas.microsoft.com/office/word/2018/wordml" xmlns:w16du="http://schemas.microsoft.com/office/word/2023/wordml/word16du" xmlns:w16sdtdh="http://schemas.microsoft.com/office/word/2020/wordml/sdtdatahash" xmlns:w16sdtfl="http://schemas.microsoft.com/office/word/2024/wordml/sdtformatlock" xmlns:w16se="http://schemas.microsoft.com/office/word/2015/wordml/symex" xmlns:wpg="http://schemas.microsoft.com/office/word/2010/wordprocessingGroup" xmlns:wpi="http://schemas.microsoft.com/office/word/2010/wordprocessingInk" xmlns:wne="http://schemas.microsoft.com/office/word/2006/wordml" xmlns:wps="http://schemas.microsoft.com/office/word/2010/wordprocessingShape" mc:Ignorable="w14 w15 w16se w16cid w16 w16cex w16sdtdh w16sdtfl w16du wp14">
+<w:endnotes xmlns:wpc="http://schemas.microsoft.com/office/word/2010/wordprocessingCanvas" xmlns:cx="http://schemas.microsoft.com/office/drawing/2014/chartex" xmlns:cx1="http://schemas.microsoft.com/office/drawing/2015/9/8/chartex" xmlns:cx2="http://schemas.microsoft.com/office/drawing/2015/10/21/chartex" xmlns:cx3="http://schemas.microsoft.com/office/drawing/2016/5/9/chartex" xmlns:cx4="http://schemas.microsoft.com/office/drawing/2016/5/10/chartex" xmlns:cx5="http://schemas.microsoft.com/office/drawing/2016/5/11/chartex" xmlns:cx6="http://schemas.microsoft.com/office/drawing/2016/5/12/chartex" xmlns:cx7="http://schemas.microsoft.com/office/drawing/2016/5/13/chartex" xmlns:cx8="http://schemas.microsoft.com/office/drawing/2016/5/14/chartex" xmlns:mc="http://schemas.openxmlformats.org/markup-compatibility/2006" xmlns:aink="http://schemas.microsoft.com/office/drawing/2016/ink" xmlns:am3d="http://schemas.microsoft.com/office/drawing/2017/model3d" xmlns:o="urn:schemas-microsoft-com:office:office" xmlns:r="http://schemas.openxmlformats.org/officeDocument/2006/relationships" xmlns:m="http://schemas.openxmlformats.org/officeDocument/2006/math" xmlns:v="urn:schemas-microsoft-com:vml" xmlns:wp14="http://schemas.microsoft.com/office/word/2010/wordprocessingDrawing" xmlns:wp="http://schemas.openxmlformats.org/drawingml/2006/wordprocessingDrawing" xmlns:w10="urn:schemas-microsoft-com:office:word" xmlns:w="http://schemas.openxmlformats.org/wordprocessingml/2006/main" xmlns:w14="http://schemas.microsoft.com/office/word/2010/wordml" xmlns:w15="http://schemas.microsoft.com/office/word/2012/wordml" xmlns:w16cex="http://schemas.microsoft.com/office/word/2018/wordml/cex" xmlns:w16cid="http://schemas.microsoft.com/office/word/2016/wordml/cid" xmlns:w16="http://schemas.microsoft.com/office/word/2018/wordml" xmlns:w16sdtdh="http://schemas.microsoft.com/office/word/2020/wordml/sdtdatahash" xmlns:w16se="http://schemas.microsoft.com/office/word/2015/wordml/symex" xmlns:wpg="http://schemas.microsoft.com/office/word/2010/wordprocessingGroup" xmlns:wpi="http://schemas.microsoft.com/office/word/2010/wordprocessingInk" xmlns:wne="http://schemas.microsoft.com/office/word/2006/wordml" xmlns:wps="http://schemas.microsoft.com/office/word/2010/wordprocessingShape" mc:Ignorable="w14 w15 w16se w16cid w16 w16cex w16sdtdh wp14">
   <w:endnote w:type="separator" w:id="-1">
     <w:p>
       <w:r>
@@ -18314,7 +18093,7 @@
 </file>
 
 <file path=word/footnotes.xml><?xml version="1.0" encoding="utf-8"?>
-<w:footnotes xmlns:wpc="http://schemas.microsoft.com/office/word/2010/wordprocessingCanvas" xmlns:cx="http://schemas.microsoft.com/office/drawing/2014/chartex" xmlns:cx1="http://schemas.microsoft.com/office/drawing/2015/9/8/chartex" xmlns:cx2="http://schemas.microsoft.com/office/drawing/2015/10/21/chartex" xmlns:cx3="http://schemas.microsoft.com/office/drawing/2016/5/9/chartex" xmlns:cx4="http://schemas.microsoft.com/office/drawing/2016/5/10/chartex" xmlns:cx5="http://schemas.microsoft.com/office/drawing/2016/5/11/chartex" xmlns:cx6="http://schemas.microsoft.com/office/drawing/2016/5/12/chartex" xmlns:cx7="http://schemas.microsoft.com/office/drawing/2016/5/13/chartex" xmlns:cx8="http://schemas.microsoft.com/office/drawing/2016/5/14/chartex" xmlns:mc="http://schemas.openxmlformats.org/markup-compatibility/2006" xmlns:aink="http://schemas.microsoft.com/office/drawing/2016/ink" xmlns:am3d="http://schemas.microsoft.com/office/drawing/2017/model3d" xmlns:o="urn:schemas-microsoft-com:office:office" xmlns:oel="http://schemas.microsoft.com/office/2019/extlst" xmlns:r="http://schemas.openxmlformats.org/officeDocument/2006/relationships" xmlns:m="http://schemas.openxmlformats.org/officeDocument/2006/math" xmlns:v="urn:schemas-microsoft-com:vml" xmlns:wp14="http://schemas.microsoft.com/office/word/2010/wordprocessingDrawing" xmlns:wp="http://schemas.openxmlformats.org/drawingml/2006/wordprocessingDrawing" xmlns:w10="urn:schemas-microsoft-com:office:word" xmlns:w="http://schemas.openxmlformats.org/wordprocessingml/2006/main" xmlns:w14="http://schemas.microsoft.com/office/word/2010/wordml" xmlns:w15="http://schemas.microsoft.com/office/word/2012/wordml" xmlns:w16cex="http://schemas.microsoft.com/office/word/2018/wordml/cex" xmlns:w16cid="http://schemas.microsoft.com/office/word/2016/wordml/cid" xmlns:w16="http://schemas.microsoft.com/office/word/2018/wordml" xmlns:w16du="http://schemas.microsoft.com/office/word/2023/wordml/word16du" xmlns:w16sdtdh="http://schemas.microsoft.com/office/word/2020/wordml/sdtdatahash" xmlns:w16sdtfl="http://schemas.microsoft.com/office/word/2024/wordml/sdtformatlock" xmlns:w16se="http://schemas.microsoft.com/office/word/2015/wordml/symex" xmlns:wpg="http://schemas.microsoft.com/office/word/2010/wordprocessingGroup" xmlns:wpi="http://schemas.microsoft.com/office/word/2010/wordprocessingInk" xmlns:wne="http://schemas.microsoft.com/office/word/2006/wordml" xmlns:wps="http://schemas.microsoft.com/office/word/2010/wordprocessingShape" mc:Ignorable="w14 w15 w16se w16cid w16 w16cex w16sdtdh w16sdtfl w16du wp14">
+<w:footnotes xmlns:wpc="http://schemas.microsoft.com/office/word/2010/wordprocessingCanvas" xmlns:cx="http://schemas.microsoft.com/office/drawing/2014/chartex" xmlns:cx1="http://schemas.microsoft.com/office/drawing/2015/9/8/chartex" xmlns:cx2="http://schemas.microsoft.com/office/drawing/2015/10/21/chartex" xmlns:cx3="http://schemas.microsoft.com/office/drawing/2016/5/9/chartex" xmlns:cx4="http://schemas.microsoft.com/office/drawing/2016/5/10/chartex" xmlns:cx5="http://schemas.microsoft.com/office/drawing/2016/5/11/chartex" xmlns:cx6="http://schemas.microsoft.com/office/drawing/2016/5/12/chartex" xmlns:cx7="http://schemas.microsoft.com/office/drawing/2016/5/13/chartex" xmlns:cx8="http://schemas.microsoft.com/office/drawing/2016/5/14/chartex" xmlns:mc="http://schemas.openxmlformats.org/markup-compatibility/2006" xmlns:aink="http://schemas.microsoft.com/office/drawing/2016/ink" xmlns:am3d="http://schemas.microsoft.com/office/drawing/2017/model3d" xmlns:o="urn:schemas-microsoft-com:office:office" xmlns:r="http://schemas.openxmlformats.org/officeDocument/2006/relationships" xmlns:m="http://schemas.openxmlformats.org/officeDocument/2006/math" xmlns:v="urn:schemas-microsoft-com:vml" xmlns:wp14="http://schemas.microsoft.com/office/word/2010/wordprocessingDrawing" xmlns:wp="http://schemas.openxmlformats.org/drawingml/2006/wordprocessingDrawing" xmlns:w10="urn:schemas-microsoft-com:office:word" xmlns:w="http://schemas.openxmlformats.org/wordprocessingml/2006/main" xmlns:w14="http://schemas.microsoft.com/office/word/2010/wordml" xmlns:w15="http://schemas.microsoft.com/office/word/2012/wordml" xmlns:w16cex="http://schemas.microsoft.com/office/word/2018/wordml/cex" xmlns:w16cid="http://schemas.microsoft.com/office/word/2016/wordml/cid" xmlns:w16="http://schemas.microsoft.com/office/word/2018/wordml" xmlns:w16sdtdh="http://schemas.microsoft.com/office/word/2020/wordml/sdtdatahash" xmlns:w16se="http://schemas.microsoft.com/office/word/2015/wordml/symex" xmlns:wpg="http://schemas.microsoft.com/office/word/2010/wordprocessingGroup" xmlns:wpi="http://schemas.microsoft.com/office/word/2010/wordprocessingInk" xmlns:wne="http://schemas.microsoft.com/office/word/2006/wordml" xmlns:wps="http://schemas.microsoft.com/office/word/2010/wordprocessingShape" mc:Ignorable="w14 w15 w16se w16cid w16 w16cex w16sdtdh wp14">
   <w:footnote w:type="separator" w:id="-1">
     <w:p>
       <w:r>
@@ -18333,7 +18112,7 @@
 </file>
 
 <file path=word/numbering.xml><?xml version="1.0" encoding="utf-8"?>
-<w:numbering xmlns:wpc="http://schemas.microsoft.com/office/word/2010/wordprocessingCanvas" xmlns:cx="http://schemas.microsoft.com/office/drawing/2014/chartex" xmlns:cx1="http://schemas.microsoft.com/office/drawing/2015/9/8/chartex" xmlns:cx2="http://schemas.microsoft.com/office/drawing/2015/10/21/chartex" xmlns:cx3="http://schemas.microsoft.com/office/drawing/2016/5/9/chartex" xmlns:cx4="http://schemas.microsoft.com/office/drawing/2016/5/10/chartex" xmlns:cx5="http://schemas.microsoft.com/office/drawing/2016/5/11/chartex" xmlns:cx6="http://schemas.microsoft.com/office/drawing/2016/5/12/chartex" xmlns:cx7="http://schemas.microsoft.com/office/drawing/2016/5/13/chartex" xmlns:cx8="http://schemas.microsoft.com/office/drawing/2016/5/14/chartex" xmlns:mc="http://schemas.openxmlformats.org/markup-compatibility/2006" xmlns:aink="http://schemas.microsoft.com/office/drawing/2016/ink" xmlns:am3d="http://schemas.microsoft.com/office/drawing/2017/model3d" xmlns:o="urn:schemas-microsoft-com:office:office" xmlns:oel="http://schemas.microsoft.com/office/2019/extlst" xmlns:r="http://schemas.openxmlformats.org/officeDocument/2006/relationships" xmlns:m="http://schemas.openxmlformats.org/officeDocument/2006/math" xmlns:v="urn:schemas-microsoft-com:vml" xmlns:wp14="http://schemas.microsoft.com/office/word/2010/wordprocessingDrawing" xmlns:wp="http://schemas.openxmlformats.org/drawingml/2006/wordprocessingDrawing" xmlns:w10="urn:schemas-microsoft-com:office:word" xmlns:w="http://schemas.openxmlformats.org/wordprocessingml/2006/main" xmlns:w14="http://schemas.microsoft.com/office/word/2010/wordml" xmlns:w15="http://schemas.microsoft.com/office/word/2012/wordml" xmlns:w16cex="http://schemas.microsoft.com/office/word/2018/wordml/cex" xmlns:w16cid="http://schemas.microsoft.com/office/word/2016/wordml/cid" xmlns:w16="http://schemas.microsoft.com/office/word/2018/wordml" xmlns:w16du="http://schemas.microsoft.com/office/word/2023/wordml/word16du" xmlns:w16sdtdh="http://schemas.microsoft.com/office/word/2020/wordml/sdtdatahash" xmlns:w16sdtfl="http://schemas.microsoft.com/office/word/2024/wordml/sdtformatlock" xmlns:w16se="http://schemas.microsoft.com/office/word/2015/wordml/symex" xmlns:wpg="http://schemas.microsoft.com/office/word/2010/wordprocessingGroup" xmlns:wpi="http://schemas.microsoft.com/office/word/2010/wordprocessingInk" xmlns:wne="http://schemas.microsoft.com/office/word/2006/wordml" xmlns:wps="http://schemas.microsoft.com/office/word/2010/wordprocessingShape" mc:Ignorable="w14 w15 w16se w16cid w16 w16cex w16sdtdh w16sdtfl w16du wp14">
+<w:numbering xmlns:wpc="http://schemas.microsoft.com/office/word/2010/wordprocessingCanvas" xmlns:cx="http://schemas.microsoft.com/office/drawing/2014/chartex" xmlns:cx1="http://schemas.microsoft.com/office/drawing/2015/9/8/chartex" xmlns:cx2="http://schemas.microsoft.com/office/drawing/2015/10/21/chartex" xmlns:cx3="http://schemas.microsoft.com/office/drawing/2016/5/9/chartex" xmlns:cx4="http://schemas.microsoft.com/office/drawing/2016/5/10/chartex" xmlns:cx5="http://schemas.microsoft.com/office/drawing/2016/5/11/chartex" xmlns:cx6="http://schemas.microsoft.com/office/drawing/2016/5/12/chartex" xmlns:cx7="http://schemas.microsoft.com/office/drawing/2016/5/13/chartex" xmlns:cx8="http://schemas.microsoft.com/office/drawing/2016/5/14/chartex" xmlns:mc="http://schemas.openxmlformats.org/markup-compatibility/2006" xmlns:aink="http://schemas.microsoft.com/office/drawing/2016/ink" xmlns:am3d="http://schemas.microsoft.com/office/drawing/2017/model3d" xmlns:o="urn:schemas-microsoft-com:office:office" xmlns:r="http://schemas.openxmlformats.org/officeDocument/2006/relationships" xmlns:m="http://schemas.openxmlformats.org/officeDocument/2006/math" xmlns:v="urn:schemas-microsoft-com:vml" xmlns:wp14="http://schemas.microsoft.com/office/word/2010/wordprocessingDrawing" xmlns:wp="http://schemas.openxmlformats.org/drawingml/2006/wordprocessingDrawing" xmlns:w10="urn:schemas-microsoft-com:office:word" xmlns:w="http://schemas.openxmlformats.org/wordprocessingml/2006/main" xmlns:w14="http://schemas.microsoft.com/office/word/2010/wordml" xmlns:w15="http://schemas.microsoft.com/office/word/2012/wordml" xmlns:w16cex="http://schemas.microsoft.com/office/word/2018/wordml/cex" xmlns:w16cid="http://schemas.microsoft.com/office/word/2016/wordml/cid" xmlns:w16="http://schemas.microsoft.com/office/word/2018/wordml" xmlns:w16sdtdh="http://schemas.microsoft.com/office/word/2020/wordml/sdtdatahash" xmlns:w16se="http://schemas.microsoft.com/office/word/2015/wordml/symex" xmlns:wpg="http://schemas.microsoft.com/office/word/2010/wordprocessingGroup" xmlns:wpi="http://schemas.microsoft.com/office/word/2010/wordprocessingInk" xmlns:wne="http://schemas.microsoft.com/office/word/2006/wordml" xmlns:wps="http://schemas.microsoft.com/office/word/2010/wordprocessingShape" mc:Ignorable="w14 w15 w16se w16cid w16 w16cex w16sdtdh wp14">
   <w:abstractNum w:abstractNumId="0" w15:restartNumberingAfterBreak="0">
     <w:nsid w:val="02F81A67"/>
     <w:multiLevelType w:val="multilevel"/>
@@ -18950,37 +18729,37 @@
       </w:rPr>
     </w:lvl>
   </w:abstractNum>
-  <w:num w:numId="1" w16cid:durableId="384918460">
+  <w:num w:numId="1">
     <w:abstractNumId w:val="6"/>
   </w:num>
-  <w:num w:numId="2" w16cid:durableId="1333800662">
+  <w:num w:numId="2">
     <w:abstractNumId w:val="1"/>
   </w:num>
-  <w:num w:numId="3" w16cid:durableId="1665624761">
+  <w:num w:numId="3">
     <w:abstractNumId w:val="0"/>
   </w:num>
-  <w:num w:numId="4" w16cid:durableId="1179809786">
+  <w:num w:numId="4">
     <w:abstractNumId w:val="5"/>
   </w:num>
-  <w:num w:numId="5" w16cid:durableId="2046248907">
+  <w:num w:numId="5">
     <w:abstractNumId w:val="4"/>
   </w:num>
-  <w:num w:numId="6" w16cid:durableId="1851681700">
+  <w:num w:numId="6">
     <w:abstractNumId w:val="3"/>
   </w:num>
-  <w:num w:numId="7" w16cid:durableId="1327127833">
+  <w:num w:numId="7">
     <w:abstractNumId w:val="2"/>
   </w:num>
 </w:numbering>
 </file>
 
 <file path=word/styles.xml><?xml version="1.0" encoding="utf-8"?>
-<w:styles xmlns:mc="http://schemas.openxmlformats.org/markup-compatibility/2006" xmlns:r="http://schemas.openxmlformats.org/officeDocument/2006/relationships" xmlns:w="http://schemas.openxmlformats.org/wordprocessingml/2006/main" xmlns:w14="http://schemas.microsoft.com/office/word/2010/wordml" xmlns:w15="http://schemas.microsoft.com/office/word/2012/wordml" xmlns:w16cex="http://schemas.microsoft.com/office/word/2018/wordml/cex" xmlns:w16cid="http://schemas.microsoft.com/office/word/2016/wordml/cid" xmlns:w16="http://schemas.microsoft.com/office/word/2018/wordml" xmlns:w16du="http://schemas.microsoft.com/office/word/2023/wordml/word16du" xmlns:w16sdtdh="http://schemas.microsoft.com/office/word/2020/wordml/sdtdatahash" xmlns:w16sdtfl="http://schemas.microsoft.com/office/word/2024/wordml/sdtformatlock" xmlns:w16se="http://schemas.microsoft.com/office/word/2015/wordml/symex" mc:Ignorable="w14 w15 w16se w16cid w16 w16cex w16sdtdh w16sdtfl w16du">
+<w:styles xmlns:mc="http://schemas.openxmlformats.org/markup-compatibility/2006" xmlns:r="http://schemas.openxmlformats.org/officeDocument/2006/relationships" xmlns:w="http://schemas.openxmlformats.org/wordprocessingml/2006/main" xmlns:w14="http://schemas.microsoft.com/office/word/2010/wordml" xmlns:w15="http://schemas.microsoft.com/office/word/2012/wordml" xmlns:w16cex="http://schemas.microsoft.com/office/word/2018/wordml/cex" xmlns:w16cid="http://schemas.microsoft.com/office/word/2016/wordml/cid" xmlns:w16="http://schemas.microsoft.com/office/word/2018/wordml" xmlns:w16sdtdh="http://schemas.microsoft.com/office/word/2020/wordml/sdtdatahash" xmlns:w16se="http://schemas.microsoft.com/office/word/2015/wordml/symex" mc:Ignorable="w14 w15 w16se w16cid w16 w16cex w16sdtdh">
   <w:docDefaults>
     <w:rPrDefault>
       <w:rPr>
         <w:rFonts w:ascii="Times New Roman" w:eastAsia="Times New Roman" w:hAnsi="Times New Roman" w:cs="Times New Roman"/>
-        <w:lang w:val="es-GT" w:eastAsia="es-GT" w:bidi="ar-SA"/>
+        <w:lang w:val="es-419" w:eastAsia="es-419" w:bidi="ar-SA"/>
       </w:rPr>
     </w:rPrDefault>
     <w:pPrDefault/>
@@ -19279,7 +19058,7 @@
       <w:lang w:val="es-ES" w:eastAsia="es-ES"/>
     </w:rPr>
   </w:style>
-  <w:style w:type="paragraph" w:styleId="Ttulo1">
+  <w:style w:type="paragraph" w:styleId="Heading1">
     <w:name w:val="heading 1"/>
     <w:basedOn w:val="Normal"/>
     <w:qFormat/>
@@ -19296,7 +19075,7 @@
       <w:szCs w:val="48"/>
     </w:rPr>
   </w:style>
-  <w:style w:type="paragraph" w:styleId="Ttulo2">
+  <w:style w:type="paragraph" w:styleId="Heading2">
     <w:name w:val="heading 2"/>
     <w:basedOn w:val="Normal"/>
     <w:qFormat/>
@@ -19312,12 +19091,13 @@
       <w:szCs w:val="36"/>
     </w:rPr>
   </w:style>
-  <w:style w:type="character" w:default="1" w:styleId="Fuentedeprrafopredeter">
+  <w:style w:type="character" w:default="1" w:styleId="DefaultParagraphFont">
     <w:name w:val="Default Paragraph Font"/>
     <w:uiPriority w:val="1"/>
+    <w:semiHidden/>
     <w:unhideWhenUsed/>
   </w:style>
-  <w:style w:type="table" w:default="1" w:styleId="Tablanormal">
+  <w:style w:type="table" w:default="1" w:styleId="TableNormal">
     <w:name w:val="Normal Table"/>
     <w:uiPriority w:val="99"/>
     <w:semiHidden/>
@@ -19332,7 +19112,7 @@
       </w:tblCellMar>
     </w:tblPr>
   </w:style>
-  <w:style w:type="numbering" w:default="1" w:styleId="Sinlista">
+  <w:style w:type="numbering" w:default="1" w:styleId="NoList">
     <w:name w:val="No List"/>
     <w:uiPriority w:val="99"/>
     <w:semiHidden/>
@@ -19346,7 +19126,7 @@
       <w:spacing w:before="100" w:beforeAutospacing="1" w:after="100" w:afterAutospacing="1"/>
     </w:pPr>
   </w:style>
-  <w:style w:type="paragraph" w:styleId="TDC1">
+  <w:style w:type="paragraph" w:styleId="TOC1">
     <w:name w:val="toc 1"/>
     <w:basedOn w:val="Normal"/>
     <w:rsid w:val="000D097C"/>
@@ -19354,7 +19134,7 @@
       <w:spacing w:before="100" w:beforeAutospacing="1" w:after="100" w:afterAutospacing="1"/>
     </w:pPr>
   </w:style>
-  <w:style w:type="character" w:styleId="Hipervnculo">
+  <w:style w:type="character" w:styleId="Hyperlink">
     <w:name w:val="Hyperlink"/>
     <w:rsid w:val="000D097C"/>
     <w:rPr>
@@ -19362,7 +19142,7 @@
       <w:u w:val="single"/>
     </w:rPr>
   </w:style>
-  <w:style w:type="paragraph" w:styleId="TDC2">
+  <w:style w:type="paragraph" w:styleId="TOC2">
     <w:name w:val="toc 2"/>
     <w:basedOn w:val="Normal"/>
     <w:rsid w:val="000D097C"/>
@@ -19370,7 +19150,7 @@
       <w:spacing w:before="100" w:beforeAutospacing="1" w:after="100" w:afterAutospacing="1"/>
     </w:pPr>
   </w:style>
-  <w:style w:type="paragraph" w:styleId="Sangra3detindependiente">
+  <w:style w:type="paragraph" w:styleId="BodyTextIndent3">
     <w:name w:val="Body Text Indent 3"/>
     <w:basedOn w:val="Normal"/>
     <w:rsid w:val="000D097C"/>
@@ -19378,10 +19158,10 @@
       <w:spacing w:before="100" w:beforeAutospacing="1" w:after="100" w:afterAutospacing="1"/>
     </w:pPr>
   </w:style>
-  <w:style w:type="paragraph" w:styleId="Encabezado">
+  <w:style w:type="paragraph" w:styleId="Header">
     <w:name w:val="header"/>
     <w:basedOn w:val="Normal"/>
-    <w:link w:val="EncabezadoCar"/>
+    <w:link w:val="HeaderChar"/>
     <w:uiPriority w:val="99"/>
     <w:rsid w:val="000D097C"/>
     <w:pPr>
@@ -19398,16 +19178,16 @@
   </w:style>
   <w:style w:type="paragraph" w:customStyle="1" w:styleId="ByLine">
     <w:name w:val="ByLine"/>
-    <w:basedOn w:val="Ttulo"/>
+    <w:basedOn w:val="Title"/>
     <w:rsid w:val="00F6349F"/>
     <w:rPr>
       <w:sz w:val="28"/>
     </w:rPr>
   </w:style>
-  <w:style w:type="paragraph" w:styleId="Ttulo">
+  <w:style w:type="paragraph" w:styleId="Title">
     <w:name w:val="Title"/>
     <w:basedOn w:val="Normal"/>
-    <w:link w:val="TtuloCar"/>
+    <w:link w:val="TitleChar"/>
     <w:qFormat/>
     <w:rsid w:val="00F6349F"/>
     <w:pPr>
@@ -19423,9 +19203,9 @@
       <w:lang w:val="en-US" w:eastAsia="en-US"/>
     </w:rPr>
   </w:style>
-  <w:style w:type="character" w:customStyle="1" w:styleId="TtuloCar">
-    <w:name w:val="Título Car"/>
-    <w:link w:val="Ttulo"/>
+  <w:style w:type="character" w:customStyle="1" w:styleId="TitleChar">
+    <w:name w:val="Title Char"/>
+    <w:link w:val="Title"/>
     <w:rsid w:val="00F6349F"/>
     <w:rPr>
       <w:rFonts w:ascii="Arial" w:hAnsi="Arial"/>
@@ -19452,12 +19232,12 @@
       <w:lang w:val="en-US" w:eastAsia="en-US"/>
     </w:rPr>
   </w:style>
-  <w:style w:type="character" w:styleId="Nmerodelnea">
+  <w:style w:type="character" w:styleId="LineNumber">
     <w:name w:val="line number"/>
-    <w:basedOn w:val="Fuentedeprrafopredeter"/>
+    <w:basedOn w:val="DefaultParagraphFont"/>
     <w:rsid w:val="008F2F81"/>
   </w:style>
-  <w:style w:type="paragraph" w:styleId="Prrafodelista">
+  <w:style w:type="paragraph" w:styleId="ListParagraph">
     <w:name w:val="List Paragraph"/>
     <w:basedOn w:val="Normal"/>
     <w:uiPriority w:val="34"/>
@@ -19467,10 +19247,10 @@
       <w:ind w:left="708"/>
     </w:pPr>
   </w:style>
-  <w:style w:type="paragraph" w:styleId="Piedepgina">
+  <w:style w:type="paragraph" w:styleId="Footer">
     <w:name w:val="footer"/>
     <w:basedOn w:val="Normal"/>
-    <w:link w:val="PiedepginaCar"/>
+    <w:link w:val="FooterChar"/>
     <w:uiPriority w:val="99"/>
     <w:rsid w:val="00344F2B"/>
     <w:pPr>
@@ -19480,9 +19260,9 @@
       </w:tabs>
     </w:pPr>
   </w:style>
-  <w:style w:type="character" w:customStyle="1" w:styleId="PiedepginaCar">
-    <w:name w:val="Pie de página Car"/>
-    <w:link w:val="Piedepgina"/>
+  <w:style w:type="character" w:customStyle="1" w:styleId="FooterChar">
+    <w:name w:val="Footer Char"/>
+    <w:link w:val="Footer"/>
     <w:uiPriority w:val="99"/>
     <w:rsid w:val="00344F2B"/>
     <w:rPr>
@@ -19491,9 +19271,9 @@
       <w:lang w:val="es-ES" w:eastAsia="es-ES"/>
     </w:rPr>
   </w:style>
-  <w:style w:type="character" w:customStyle="1" w:styleId="EncabezadoCar">
-    <w:name w:val="Encabezado Car"/>
-    <w:link w:val="Encabezado"/>
+  <w:style w:type="character" w:customStyle="1" w:styleId="HeaderChar">
+    <w:name w:val="Header Char"/>
+    <w:link w:val="Header"/>
     <w:uiPriority w:val="99"/>
     <w:rsid w:val="00344F2B"/>
     <w:rPr>
@@ -19502,10 +19282,10 @@
       <w:lang w:val="es-ES" w:eastAsia="es-ES"/>
     </w:rPr>
   </w:style>
-  <w:style w:type="paragraph" w:styleId="Textodeglobo">
+  <w:style w:type="paragraph" w:styleId="BalloonText">
     <w:name w:val="Balloon Text"/>
     <w:basedOn w:val="Normal"/>
-    <w:link w:val="TextodegloboCar"/>
+    <w:link w:val="BalloonTextChar"/>
     <w:rsid w:val="00344F2B"/>
     <w:rPr>
       <w:rFonts w:ascii="Tahoma" w:hAnsi="Tahoma" w:cs="Tahoma"/>
@@ -19513,9 +19293,9 @@
       <w:szCs w:val="16"/>
     </w:rPr>
   </w:style>
-  <w:style w:type="character" w:customStyle="1" w:styleId="TextodegloboCar">
-    <w:name w:val="Texto de globo Car"/>
-    <w:link w:val="Textodeglobo"/>
+  <w:style w:type="character" w:customStyle="1" w:styleId="BalloonTextChar">
+    <w:name w:val="Balloon Text Char"/>
+    <w:link w:val="BalloonText"/>
     <w:rsid w:val="00344F2B"/>
     <w:rPr>
       <w:rFonts w:ascii="Tahoma" w:hAnsi="Tahoma" w:cs="Tahoma"/>
@@ -19524,18 +19304,18 @@
       <w:lang w:val="es-ES" w:eastAsia="es-ES"/>
     </w:rPr>
   </w:style>
-  <w:style w:type="paragraph" w:styleId="Textoindependiente">
+  <w:style w:type="paragraph" w:styleId="BodyText">
     <w:name w:val="Body Text"/>
     <w:basedOn w:val="Normal"/>
-    <w:link w:val="TextoindependienteCar"/>
+    <w:link w:val="BodyTextChar"/>
     <w:rsid w:val="00FF438A"/>
     <w:pPr>
       <w:spacing w:after="120"/>
     </w:pPr>
   </w:style>
-  <w:style w:type="character" w:customStyle="1" w:styleId="TextoindependienteCar">
-    <w:name w:val="Texto independiente Car"/>
-    <w:link w:val="Textoindependiente"/>
+  <w:style w:type="character" w:customStyle="1" w:styleId="BodyTextChar">
+    <w:name w:val="Body Text Char"/>
+    <w:link w:val="BodyText"/>
     <w:rsid w:val="00FF438A"/>
     <w:rPr>
       <w:sz w:val="24"/>
@@ -19543,32 +19323,32 @@
       <w:lang w:val="es-ES" w:eastAsia="es-ES"/>
     </w:rPr>
   </w:style>
-  <w:style w:type="paragraph" w:styleId="Textonotaalfinal">
+  <w:style w:type="paragraph" w:styleId="EndnoteText">
     <w:name w:val="endnote text"/>
     <w:basedOn w:val="Normal"/>
-    <w:link w:val="TextonotaalfinalCar"/>
+    <w:link w:val="EndnoteTextChar"/>
     <w:rsid w:val="00A83ADC"/>
     <w:rPr>
       <w:sz w:val="20"/>
       <w:szCs w:val="20"/>
     </w:rPr>
   </w:style>
-  <w:style w:type="character" w:customStyle="1" w:styleId="TextonotaalfinalCar">
-    <w:name w:val="Texto nota al final Car"/>
-    <w:link w:val="Textonotaalfinal"/>
+  <w:style w:type="character" w:customStyle="1" w:styleId="EndnoteTextChar">
+    <w:name w:val="Endnote Text Char"/>
+    <w:link w:val="EndnoteText"/>
     <w:rsid w:val="00A83ADC"/>
     <w:rPr>
       <w:lang w:val="es-ES" w:eastAsia="es-ES"/>
     </w:rPr>
   </w:style>
-  <w:style w:type="character" w:styleId="Refdenotaalfinal">
+  <w:style w:type="character" w:styleId="EndnoteReference">
     <w:name w:val="endnote reference"/>
     <w:rsid w:val="00A83ADC"/>
     <w:rPr>
       <w:vertAlign w:val="superscript"/>
     </w:rPr>
   </w:style>
-  <w:style w:type="paragraph" w:styleId="Revisin">
+  <w:style w:type="paragraph" w:styleId="Revision">
     <w:name w:val="Revision"/>
     <w:hidden/>
     <w:uiPriority w:val="99"/>
@@ -19580,9 +19360,9 @@
       <w:lang w:val="es-ES" w:eastAsia="es-ES"/>
     </w:rPr>
   </w:style>
-  <w:style w:type="table" w:styleId="Tablaconcuadrcula">
+  <w:style w:type="table" w:styleId="TableGrid">
     <w:name w:val="Table Grid"/>
-    <w:basedOn w:val="Tablanormal"/>
+    <w:basedOn w:val="TableNormal"/>
     <w:uiPriority w:val="1"/>
     <w:rsid w:val="00557FB4"/>
     <w:rPr>

</xml_diff>